<commit_message>
EHIS-809 Added SubmittedforDWPA on Requisition
</commit_message>
<xml_diff>
--- a/PHOCS-Docgentemplates/PHOCS Water Bacteriology Requisition Template_V0.2.docx
+++ b/PHOCS-Docgentemplates/PHOCS Water Bacteriology Requisition Template_V0.2.docx
@@ -1,6 +1,6 @@
 
 <file path=word/document.xml><?xml version="1.0" encoding="utf-8"?>
-<w:document xmlns:wpc="http://schemas.microsoft.com/office/word/2010/wordprocessingCanvas" xmlns:cx="http://schemas.microsoft.com/office/drawing/2014/chartex" xmlns:cx1="http://schemas.microsoft.com/office/drawing/2015/9/8/chartex" xmlns:cx2="http://schemas.microsoft.com/office/drawing/2015/10/21/chartex" xmlns:cx3="http://schemas.microsoft.com/office/drawing/2016/5/9/chartex" xmlns:cx4="http://schemas.microsoft.com/office/drawing/2016/5/10/chartex" xmlns:cx5="http://schemas.microsoft.com/office/drawing/2016/5/11/chartex" xmlns:cx6="http://schemas.microsoft.com/office/drawing/2016/5/12/chartex" xmlns:cx7="http://schemas.microsoft.com/office/drawing/2016/5/13/chartex" xmlns:cx8="http://schemas.microsoft.com/office/drawing/2016/5/14/chartex" xmlns:mc="http://schemas.openxmlformats.org/markup-compatibility/2006" xmlns:aink="http://schemas.microsoft.com/office/drawing/2016/ink" xmlns:am3d="http://schemas.microsoft.com/office/drawing/2017/model3d" xmlns:o="urn:schemas-microsoft-com:office:office" xmlns:oel="http://schemas.microsoft.com/office/2019/extlst" xmlns:r="http://schemas.openxmlformats.org/officeDocument/2006/relationships" xmlns:m="http://schemas.openxmlformats.org/officeDocument/2006/math" xmlns:v="urn:schemas-microsoft-com:vml" xmlns:wp14="http://schemas.microsoft.com/office/word/2010/wordprocessingDrawing" xmlns:wp="http://schemas.openxmlformats.org/drawingml/2006/wordprocessingDrawing" xmlns:w10="urn:schemas-microsoft-com:office:word" xmlns:w="http://schemas.openxmlformats.org/wordprocessingml/2006/main" xmlns:w14="http://schemas.microsoft.com/office/word/2010/wordml" xmlns:w15="http://schemas.microsoft.com/office/word/2012/wordml" xmlns:w16cei="http://schemas.microsoft.com/office/word/2026/wordml/cei" xmlns:w16cex="http://schemas.microsoft.com/office/word/2018/wordml/cex" xmlns:w16cid="http://schemas.microsoft.com/office/word/2016/wordml/cid" xmlns:w16="http://schemas.microsoft.com/office/word/2018/wordml" xmlns:w16du="http://schemas.microsoft.com/office/word/2023/wordml/word16du" xmlns:w16sdtdh="http://schemas.microsoft.com/office/word/2020/wordml/sdtdatahash" xmlns:w16sdtfl="http://schemas.microsoft.com/office/word/2024/wordml/sdtformatlock" xmlns:w16se="http://schemas.microsoft.com/office/word/2015/wordml/symex" xmlns:wpg="http://schemas.microsoft.com/office/word/2010/wordprocessingGroup" xmlns:wpi="http://schemas.microsoft.com/office/word/2010/wordprocessingInk" xmlns:wne="http://schemas.microsoft.com/office/word/2006/wordml" xmlns:wps="http://schemas.microsoft.com/office/word/2010/wordprocessingShape" mc:Ignorable="w14 w15 w16se w16cid w16 w16cex w16sdtdh w16sdtfl w16du wp14">
+<w:document xmlns:wpc="http://schemas.microsoft.com/office/word/2010/wordprocessingCanvas" xmlns:cx="http://schemas.microsoft.com/office/drawing/2014/chartex" xmlns:cx1="http://schemas.microsoft.com/office/drawing/2015/9/8/chartex" xmlns:cx2="http://schemas.microsoft.com/office/drawing/2015/10/21/chartex" xmlns:cx3="http://schemas.microsoft.com/office/drawing/2016/5/9/chartex" xmlns:cx4="http://schemas.microsoft.com/office/drawing/2016/5/10/chartex" xmlns:cx5="http://schemas.microsoft.com/office/drawing/2016/5/11/chartex" xmlns:cx6="http://schemas.microsoft.com/office/drawing/2016/5/12/chartex" xmlns:cx7="http://schemas.microsoft.com/office/drawing/2016/5/13/chartex" xmlns:cx8="http://schemas.microsoft.com/office/drawing/2016/5/14/chartex" xmlns:mc="http://schemas.openxmlformats.org/markup-compatibility/2006" xmlns:aink="http://schemas.microsoft.com/office/drawing/2016/ink" xmlns:am3d="http://schemas.microsoft.com/office/drawing/2017/model3d" xmlns:o="urn:schemas-microsoft-com:office:office" xmlns:oel="http://schemas.microsoft.com/office/2019/extlst" xmlns:r="http://schemas.openxmlformats.org/officeDocument/2006/relationships" xmlns:m="http://schemas.openxmlformats.org/officeDocument/2006/math" xmlns:v="urn:schemas-microsoft-com:vml" xmlns:wp14="http://schemas.microsoft.com/office/word/2010/wordprocessingDrawing" xmlns:wp="http://schemas.openxmlformats.org/drawingml/2006/wordprocessingDrawing" xmlns:w10="urn:schemas-microsoft-com:office:word" xmlns:w="http://schemas.openxmlformats.org/wordprocessingml/2006/main" xmlns:w14="http://schemas.microsoft.com/office/word/2010/wordml" xmlns:w15="http://schemas.microsoft.com/office/word/2012/wordml" xmlns:w16cex="http://schemas.microsoft.com/office/word/2018/wordml/cex" xmlns:w16cid="http://schemas.microsoft.com/office/word/2016/wordml/cid" xmlns:w16="http://schemas.microsoft.com/office/word/2018/wordml" xmlns:w16du="http://schemas.microsoft.com/office/word/2023/wordml/word16du" xmlns:w16sdtdh="http://schemas.microsoft.com/office/word/2020/wordml/sdtdatahash" xmlns:w16sdtfl="http://schemas.microsoft.com/office/word/2024/wordml/sdtformatlock" xmlns:w16se="http://schemas.microsoft.com/office/word/2015/wordml/symex" xmlns:wpg="http://schemas.microsoft.com/office/word/2010/wordprocessingGroup" xmlns:wpi="http://schemas.microsoft.com/office/word/2010/wordprocessingInk" xmlns:wne="http://schemas.microsoft.com/office/word/2006/wordml" xmlns:wps="http://schemas.microsoft.com/office/word/2010/wordprocessingShape" mc:Ignorable="w14 w15 w16se w16cid w16 w16cex w16sdtdh w16sdtfl w16du wp14">
   <w:body>
     <w:tbl>
       <w:tblPr>
@@ -139,31 +139,7 @@
                 <w:lang w:val="en-CA"/>
                 <w14:ligatures w14:val="standardContextual"/>
               </w:rPr>
-              <w:t>{{</w:t>
-            </w:r>
-            <w:proofErr w:type="spellStart"/>
-            <w:r>
-              <w:rPr>
-                <w:rFonts w:asciiTheme="minorHAnsi" w:eastAsiaTheme="minorHAnsi" w:hAnsiTheme="minorHAnsi"/>
-                <w:kern w:val="2"/>
-                <w:sz w:val="20"/>
-                <w:szCs w:val="20"/>
-                <w:lang w:val="en-CA"/>
-                <w14:ligatures w14:val="standardContextual"/>
-              </w:rPr>
-              <w:t>LabTestRequisitionNumber</w:t>
-            </w:r>
-            <w:proofErr w:type="spellEnd"/>
-            <w:r>
-              <w:rPr>
-                <w:rFonts w:asciiTheme="minorHAnsi" w:eastAsiaTheme="minorHAnsi" w:hAnsiTheme="minorHAnsi"/>
-                <w:kern w:val="2"/>
-                <w:sz w:val="20"/>
-                <w:szCs w:val="20"/>
-                <w:lang w:val="en-CA"/>
-                <w14:ligatures w14:val="standardContextual"/>
-              </w:rPr>
-              <w:t>}}</w:t>
+              <w:t>{{LabTestRequisitionNumber}}</w:t>
             </w:r>
           </w:p>
         </w:tc>
@@ -204,7 +180,7 @@
       </w:tblGrid>
       <w:tr>
         <w:trPr>
-          <w:trHeight w:val="618"/>
+          <w:trHeight w:val="438"/>
           <w:jc w:val="center"/>
         </w:trPr>
         <w:tc>
@@ -404,16 +380,7 @@
                 <w:sz w:val="22"/>
                 <w:szCs w:val="20"/>
               </w:rPr>
-              <w:t>Name</w:t>
-            </w:r>
-            <w:proofErr w:type="gramStart"/>
-            <w:r>
-              <w:rPr>
-                <w:b/>
-                <w:sz w:val="22"/>
-                <w:szCs w:val="20"/>
-              </w:rPr>
-              <w:t xml:space="preserve">: </w:t>
+              <w:t xml:space="preserve">Name: </w:t>
             </w:r>
             <w:r>
               <w:rPr>
@@ -432,19 +399,7 @@
                 <w:lang w:val="en-CA"/>
                 <w14:ligatures w14:val="standardContextual"/>
               </w:rPr>
-              <w:t>{</w:t>
-            </w:r>
-            <w:proofErr w:type="gramEnd"/>
-            <w:r>
-              <w:rPr>
-                <w:rFonts w:asciiTheme="minorHAnsi" w:eastAsiaTheme="minorHAnsi" w:hAnsiTheme="minorHAnsi"/>
-                <w:kern w:val="2"/>
-                <w:sz w:val="20"/>
-                <w:szCs w:val="20"/>
-                <w:lang w:val="en-CA"/>
-                <w14:ligatures w14:val="standardContextual"/>
-              </w:rPr>
-              <w:t>{DWOEHOName}}</w:t>
+              <w:t>{{DWOEHOName}}</w:t>
             </w:r>
           </w:p>
         </w:tc>
@@ -499,31 +454,7 @@
                 <w:lang w:val="en-CA"/>
                 <w14:ligatures w14:val="standardContextual"/>
               </w:rPr>
-              <w:t>{{</w:t>
-            </w:r>
-            <w:proofErr w:type="spellStart"/>
-            <w:r>
-              <w:rPr>
-                <w:rFonts w:asciiTheme="minorHAnsi" w:eastAsiaTheme="minorHAnsi" w:hAnsiTheme="minorHAnsi"/>
-                <w:kern w:val="2"/>
-                <w:sz w:val="20"/>
-                <w:szCs w:val="20"/>
-                <w:lang w:val="en-CA"/>
-                <w14:ligatures w14:val="standardContextual"/>
-              </w:rPr>
-              <w:t>MHOName</w:t>
-            </w:r>
-            <w:proofErr w:type="spellEnd"/>
-            <w:r>
-              <w:rPr>
-                <w:rFonts w:asciiTheme="minorHAnsi" w:eastAsiaTheme="minorHAnsi" w:hAnsiTheme="minorHAnsi"/>
-                <w:kern w:val="2"/>
-                <w:sz w:val="20"/>
-                <w:szCs w:val="20"/>
-                <w:lang w:val="en-CA"/>
-                <w14:ligatures w14:val="standardContextual"/>
-              </w:rPr>
-              <w:t>}}</w:t>
+              <w:t>{{MHOName}}</w:t>
             </w:r>
           </w:p>
         </w:tc>
@@ -558,16 +489,7 @@
                 <w:sz w:val="22"/>
                 <w:szCs w:val="20"/>
               </w:rPr>
-              <w:t>Name</w:t>
-            </w:r>
-            <w:proofErr w:type="gramStart"/>
-            <w:r>
-              <w:rPr>
-                <w:b/>
-                <w:sz w:val="22"/>
-                <w:szCs w:val="20"/>
-              </w:rPr>
-              <w:t xml:space="preserve">: </w:t>
+              <w:t xml:space="preserve">Name: </w:t>
             </w:r>
             <w:r>
               <w:rPr>
@@ -586,43 +508,7 @@
                 <w:lang w:val="en-CA"/>
                 <w14:ligatures w14:val="standardContextual"/>
               </w:rPr>
-              <w:t>{</w:t>
-            </w:r>
-            <w:proofErr w:type="gramEnd"/>
-            <w:r>
-              <w:rPr>
-                <w:rFonts w:asciiTheme="minorHAnsi" w:eastAsiaTheme="minorHAnsi" w:hAnsiTheme="minorHAnsi"/>
-                <w:kern w:val="2"/>
-                <w:sz w:val="20"/>
-                <w:szCs w:val="20"/>
-                <w:lang w:val="en-CA"/>
-                <w14:ligatures w14:val="standardContextual"/>
-              </w:rPr>
-              <w:t>{</w:t>
-            </w:r>
-            <w:proofErr w:type="spellStart"/>
-            <w:r>
-              <w:rPr>
-                <w:rFonts w:asciiTheme="minorHAnsi" w:eastAsiaTheme="minorHAnsi" w:hAnsiTheme="minorHAnsi"/>
-                <w:kern w:val="2"/>
-                <w:sz w:val="20"/>
-                <w:szCs w:val="20"/>
-                <w:lang w:val="en-CA"/>
-                <w14:ligatures w14:val="standardContextual"/>
-              </w:rPr>
-              <w:t>WaterSupplierName</w:t>
-            </w:r>
-            <w:proofErr w:type="spellEnd"/>
-            <w:r>
-              <w:rPr>
-                <w:rFonts w:asciiTheme="minorHAnsi" w:eastAsiaTheme="minorHAnsi" w:hAnsiTheme="minorHAnsi"/>
-                <w:kern w:val="2"/>
-                <w:sz w:val="20"/>
-                <w:szCs w:val="20"/>
-                <w:lang w:val="en-CA"/>
-                <w14:ligatures w14:val="standardContextual"/>
-              </w:rPr>
-              <w:t>}}</w:t>
+              <w:t>{{WaterSupplierName}}</w:t>
             </w:r>
           </w:p>
         </w:tc>
@@ -656,7 +542,6 @@
                 <w:szCs w:val="20"/>
               </w:rPr>
             </w:pPr>
-            <w:proofErr w:type="gramStart"/>
             <w:r>
               <w:rPr>
                 <w:b/>
@@ -674,32 +559,7 @@
                 <w:lang w:val="en-CA"/>
                 <w14:ligatures w14:val="standardContextual"/>
               </w:rPr>
-              <w:t>{{</w:t>
-            </w:r>
-            <w:proofErr w:type="spellStart"/>
-            <w:proofErr w:type="gramEnd"/>
-            <w:r>
-              <w:rPr>
-                <w:rFonts w:asciiTheme="minorHAnsi" w:eastAsiaTheme="minorHAnsi" w:hAnsiTheme="minorHAnsi"/>
-                <w:kern w:val="2"/>
-                <w:sz w:val="20"/>
-                <w:szCs w:val="20"/>
-                <w:lang w:val="en-CA"/>
-                <w14:ligatures w14:val="standardContextual"/>
-              </w:rPr>
-              <w:t>DWOEHOPhoneNumber</w:t>
-            </w:r>
-            <w:proofErr w:type="spellEnd"/>
-            <w:r>
-              <w:rPr>
-                <w:rFonts w:asciiTheme="minorHAnsi" w:eastAsiaTheme="minorHAnsi" w:hAnsiTheme="minorHAnsi"/>
-                <w:kern w:val="2"/>
-                <w:sz w:val="20"/>
-                <w:szCs w:val="20"/>
-                <w:lang w:val="en-CA"/>
-                <w14:ligatures w14:val="standardContextual"/>
-              </w:rPr>
-              <w:t>}}</w:t>
+              <w:t>{{DWOEHOPhoneNumber}}</w:t>
             </w:r>
           </w:p>
         </w:tc>
@@ -734,16 +594,7 @@
                 <w:sz w:val="22"/>
                 <w:szCs w:val="20"/>
               </w:rPr>
-              <w:t>Phone</w:t>
-            </w:r>
-            <w:proofErr w:type="gramStart"/>
-            <w:r>
-              <w:rPr>
-                <w:b/>
-                <w:sz w:val="22"/>
-                <w:szCs w:val="20"/>
-              </w:rPr>
-              <w:t xml:space="preserve">: </w:t>
+              <w:t xml:space="preserve">Phone: </w:t>
             </w:r>
             <w:r>
               <w:rPr>
@@ -762,43 +613,7 @@
                 <w:lang w:val="en-CA"/>
                 <w14:ligatures w14:val="standardContextual"/>
               </w:rPr>
-              <w:t>{</w:t>
-            </w:r>
-            <w:proofErr w:type="gramEnd"/>
-            <w:r>
-              <w:rPr>
-                <w:rFonts w:asciiTheme="minorHAnsi" w:eastAsiaTheme="minorHAnsi" w:hAnsiTheme="minorHAnsi"/>
-                <w:kern w:val="2"/>
-                <w:sz w:val="20"/>
-                <w:szCs w:val="20"/>
-                <w:lang w:val="en-CA"/>
-                <w14:ligatures w14:val="standardContextual"/>
-              </w:rPr>
-              <w:t>{</w:t>
-            </w:r>
-            <w:proofErr w:type="spellStart"/>
-            <w:r>
-              <w:rPr>
-                <w:rFonts w:asciiTheme="minorHAnsi" w:eastAsiaTheme="minorHAnsi" w:hAnsiTheme="minorHAnsi"/>
-                <w:kern w:val="2"/>
-                <w:sz w:val="20"/>
-                <w:szCs w:val="20"/>
-                <w:lang w:val="en-CA"/>
-                <w14:ligatures w14:val="standardContextual"/>
-              </w:rPr>
-              <w:t>MHOPhoneNumber</w:t>
-            </w:r>
-            <w:proofErr w:type="spellEnd"/>
-            <w:r>
-              <w:rPr>
-                <w:rFonts w:asciiTheme="minorHAnsi" w:eastAsiaTheme="minorHAnsi" w:hAnsiTheme="minorHAnsi"/>
-                <w:kern w:val="2"/>
-                <w:sz w:val="20"/>
-                <w:szCs w:val="20"/>
-                <w:lang w:val="en-CA"/>
-                <w14:ligatures w14:val="standardContextual"/>
-              </w:rPr>
-              <w:t>}}</w:t>
+              <w:t>{{MHOPhoneNumber}}</w:t>
             </w:r>
           </w:p>
         </w:tc>
@@ -827,7 +642,6 @@
                 <w:szCs w:val="20"/>
               </w:rPr>
             </w:pPr>
-            <w:proofErr w:type="gramStart"/>
             <w:r>
               <w:rPr>
                 <w:b/>
@@ -845,32 +659,7 @@
                 <w:lang w:val="en-CA"/>
                 <w14:ligatures w14:val="standardContextual"/>
               </w:rPr>
-              <w:t>{{</w:t>
-            </w:r>
-            <w:proofErr w:type="spellStart"/>
-            <w:proofErr w:type="gramEnd"/>
-            <w:r>
-              <w:rPr>
-                <w:rFonts w:asciiTheme="minorHAnsi" w:eastAsiaTheme="minorHAnsi" w:hAnsiTheme="minorHAnsi"/>
-                <w:kern w:val="2"/>
-                <w:sz w:val="20"/>
-                <w:szCs w:val="20"/>
-                <w:lang w:val="en-CA"/>
-                <w14:ligatures w14:val="standardContextual"/>
-              </w:rPr>
-              <w:t>WaterSupplierPhone</w:t>
-            </w:r>
-            <w:proofErr w:type="spellEnd"/>
-            <w:r>
-              <w:rPr>
-                <w:rFonts w:asciiTheme="minorHAnsi" w:eastAsiaTheme="minorHAnsi" w:hAnsiTheme="minorHAnsi"/>
-                <w:kern w:val="2"/>
-                <w:sz w:val="20"/>
-                <w:szCs w:val="20"/>
-                <w:lang w:val="en-CA"/>
-                <w14:ligatures w14:val="standardContextual"/>
-              </w:rPr>
-              <w:t>}}</w:t>
+              <w:t>{{WaterSupplierPhone}}</w:t>
             </w:r>
           </w:p>
         </w:tc>
@@ -904,7 +693,6 @@
                 <w14:ligatures w14:val="standardContextual"/>
               </w:rPr>
             </w:pPr>
-            <w:proofErr w:type="gramStart"/>
             <w:r>
               <w:rPr>
                 <w:b/>
@@ -922,32 +710,7 @@
                 <w:lang w:val="en-CA"/>
                 <w14:ligatures w14:val="standardContextual"/>
               </w:rPr>
-              <w:t>{{</w:t>
-            </w:r>
-            <w:proofErr w:type="spellStart"/>
-            <w:proofErr w:type="gramEnd"/>
-            <w:r>
-              <w:rPr>
-                <w:rFonts w:asciiTheme="minorHAnsi" w:eastAsiaTheme="minorHAnsi" w:hAnsiTheme="minorHAnsi"/>
-                <w:kern w:val="2"/>
-                <w:sz w:val="20"/>
-                <w:szCs w:val="20"/>
-                <w:lang w:val="en-CA"/>
-                <w14:ligatures w14:val="standardContextual"/>
-              </w:rPr>
-              <w:t>DWOEHOEmail</w:t>
-            </w:r>
-            <w:proofErr w:type="spellEnd"/>
-            <w:r>
-              <w:rPr>
-                <w:rFonts w:asciiTheme="minorHAnsi" w:eastAsiaTheme="minorHAnsi" w:hAnsiTheme="minorHAnsi"/>
-                <w:kern w:val="2"/>
-                <w:sz w:val="20"/>
-                <w:szCs w:val="20"/>
-                <w:lang w:val="en-CA"/>
-                <w14:ligatures w14:val="standardContextual"/>
-              </w:rPr>
-              <w:t>}}</w:t>
+              <w:t>{{DWOEHOEmail}}</w:t>
             </w:r>
           </w:p>
         </w:tc>
@@ -977,7 +740,6 @@
                 <w:szCs w:val="20"/>
               </w:rPr>
             </w:pPr>
-            <w:proofErr w:type="gramStart"/>
             <w:r>
               <w:rPr>
                 <w:b/>
@@ -995,32 +757,7 @@
                 <w:lang w:val="en-CA"/>
                 <w14:ligatures w14:val="standardContextual"/>
               </w:rPr>
-              <w:t>{{</w:t>
-            </w:r>
-            <w:proofErr w:type="spellStart"/>
-            <w:proofErr w:type="gramEnd"/>
-            <w:r>
-              <w:rPr>
-                <w:rFonts w:asciiTheme="minorHAnsi" w:eastAsiaTheme="minorHAnsi" w:hAnsiTheme="minorHAnsi"/>
-                <w:kern w:val="2"/>
-                <w:sz w:val="20"/>
-                <w:szCs w:val="20"/>
-                <w:lang w:val="en-CA"/>
-                <w14:ligatures w14:val="standardContextual"/>
-              </w:rPr>
-              <w:t>MHOEmail</w:t>
-            </w:r>
-            <w:proofErr w:type="spellEnd"/>
-            <w:r>
-              <w:rPr>
-                <w:rFonts w:asciiTheme="minorHAnsi" w:eastAsiaTheme="minorHAnsi" w:hAnsiTheme="minorHAnsi"/>
-                <w:kern w:val="2"/>
-                <w:sz w:val="20"/>
-                <w:szCs w:val="20"/>
-                <w:lang w:val="en-CA"/>
-                <w14:ligatures w14:val="standardContextual"/>
-              </w:rPr>
-              <w:t>}}</w:t>
+              <w:t>{{MHOEmail}}</w:t>
             </w:r>
           </w:p>
         </w:tc>
@@ -1050,7 +787,6 @@
                 <w:szCs w:val="20"/>
               </w:rPr>
             </w:pPr>
-            <w:proofErr w:type="gramStart"/>
             <w:r>
               <w:rPr>
                 <w:b/>
@@ -1068,39 +804,14 @@
                 <w:lang w:val="en-CA"/>
                 <w14:ligatures w14:val="standardContextual"/>
               </w:rPr>
-              <w:t>{{</w:t>
-            </w:r>
-            <w:proofErr w:type="spellStart"/>
-            <w:proofErr w:type="gramEnd"/>
-            <w:r>
-              <w:rPr>
-                <w:rFonts w:asciiTheme="minorHAnsi" w:eastAsiaTheme="minorHAnsi" w:hAnsiTheme="minorHAnsi"/>
-                <w:kern w:val="2"/>
-                <w:sz w:val="20"/>
-                <w:szCs w:val="20"/>
-                <w:lang w:val="en-CA"/>
-                <w14:ligatures w14:val="standardContextual"/>
-              </w:rPr>
-              <w:t>WaterSupplierEmail</w:t>
-            </w:r>
-            <w:proofErr w:type="spellEnd"/>
-            <w:r>
-              <w:rPr>
-                <w:rFonts w:asciiTheme="minorHAnsi" w:eastAsiaTheme="minorHAnsi" w:hAnsiTheme="minorHAnsi"/>
-                <w:kern w:val="2"/>
-                <w:sz w:val="20"/>
-                <w:szCs w:val="20"/>
-                <w:lang w:val="en-CA"/>
-                <w14:ligatures w14:val="standardContextual"/>
-              </w:rPr>
-              <w:t>}}</w:t>
+              <w:t>{{WaterSupplierEmail}}</w:t>
             </w:r>
           </w:p>
         </w:tc>
       </w:tr>
       <w:tr>
         <w:trPr>
-          <w:trHeight w:val="573"/>
+          <w:trHeight w:val="420"/>
           <w:jc w:val="center"/>
         </w:trPr>
         <w:tc>
@@ -1179,16 +890,7 @@
                 <w:bCs/>
                 <w:sz w:val="22"/>
               </w:rPr>
-              <w:t>Sampler Name</w:t>
-            </w:r>
-            <w:proofErr w:type="gramStart"/>
-            <w:r>
-              <w:rPr>
-                <w:b/>
-                <w:bCs/>
-                <w:sz w:val="22"/>
-              </w:rPr>
-              <w:t xml:space="preserve">: </w:t>
+              <w:t xml:space="preserve">Sampler Name: </w:t>
             </w:r>
             <w:r>
               <w:rPr>
@@ -1207,59 +909,14 @@
                 <w:lang w:val="en-CA"/>
                 <w14:ligatures w14:val="standardContextual"/>
               </w:rPr>
-              <w:t>{</w:t>
-            </w:r>
-            <w:proofErr w:type="gramEnd"/>
-            <w:r>
-              <w:rPr>
-                <w:rFonts w:asciiTheme="minorHAnsi" w:eastAsiaTheme="minorHAnsi" w:hAnsiTheme="minorHAnsi"/>
-                <w:kern w:val="2"/>
-                <w:sz w:val="20"/>
-                <w:szCs w:val="20"/>
-                <w:lang w:val="en-CA"/>
-                <w14:ligatures w14:val="standardContextual"/>
-              </w:rPr>
-              <w:t>{</w:t>
-            </w:r>
-            <w:proofErr w:type="spellStart"/>
-            <w:r>
-              <w:rPr>
-                <w:rFonts w:asciiTheme="minorHAnsi" w:eastAsiaTheme="minorHAnsi" w:hAnsiTheme="minorHAnsi"/>
-                <w:kern w:val="2"/>
-                <w:sz w:val="20"/>
-                <w:szCs w:val="20"/>
-                <w:lang w:val="en-CA"/>
-                <w14:ligatures w14:val="standardContextual"/>
-              </w:rPr>
-              <w:t>SamplerName</w:t>
-            </w:r>
-            <w:proofErr w:type="spellEnd"/>
-            <w:proofErr w:type="gramStart"/>
-            <w:r>
-              <w:rPr>
-                <w:rFonts w:asciiTheme="minorHAnsi" w:eastAsiaTheme="minorHAnsi" w:hAnsiTheme="minorHAnsi"/>
-                <w:kern w:val="2"/>
-                <w:sz w:val="20"/>
-                <w:szCs w:val="20"/>
-                <w:lang w:val="en-CA"/>
-                <w14:ligatures w14:val="standardContextual"/>
-              </w:rPr>
-              <w:t>}}</w:t>
+              <w:t>{{SamplerName}}</w:t>
             </w:r>
             <w:r>
               <w:rPr>
                 <w:color w:val="FF0000"/>
                 <w:sz w:val="22"/>
               </w:rPr>
-              <w:t xml:space="preserve">   </w:t>
-            </w:r>
-            <w:proofErr w:type="gramEnd"/>
-            <w:r>
-              <w:rPr>
-                <w:color w:val="FF0000"/>
-                <w:sz w:val="22"/>
-              </w:rPr>
-              <w:t xml:space="preserve">            </w:t>
+              <w:t xml:space="preserve">               </w:t>
             </w:r>
             <w:r>
               <w:rPr>
@@ -1316,31 +973,7 @@
                 <w:lang w:val="en-CA"/>
                 <w14:ligatures w14:val="standardContextual"/>
               </w:rPr>
-              <w:t>{{</w:t>
-            </w:r>
-            <w:proofErr w:type="spellStart"/>
-            <w:r>
-              <w:rPr>
-                <w:rFonts w:asciiTheme="minorHAnsi" w:eastAsiaTheme="minorHAnsi" w:hAnsiTheme="minorHAnsi"/>
-                <w:kern w:val="2"/>
-                <w:sz w:val="20"/>
-                <w:szCs w:val="20"/>
-                <w:lang w:val="en-CA"/>
-                <w14:ligatures w14:val="standardContextual"/>
-              </w:rPr>
-              <w:t>CollectionDateTime</w:t>
-            </w:r>
-            <w:proofErr w:type="spellEnd"/>
-            <w:r>
-              <w:rPr>
-                <w:rFonts w:asciiTheme="minorHAnsi" w:eastAsiaTheme="minorHAnsi" w:hAnsiTheme="minorHAnsi"/>
-                <w:kern w:val="2"/>
-                <w:sz w:val="20"/>
-                <w:szCs w:val="20"/>
-                <w:lang w:val="en-CA"/>
-                <w14:ligatures w14:val="standardContextual"/>
-              </w:rPr>
-              <w:t>}}</w:t>
+              <w:t>{{CollectionDateTime}}</w:t>
             </w:r>
           </w:p>
         </w:tc>
@@ -1383,17 +1016,7 @@
                 <w:sz w:val="22"/>
                 <w:szCs w:val="20"/>
               </w:rPr>
-              <w:t xml:space="preserve">System </w:t>
-            </w:r>
-            <w:proofErr w:type="gramStart"/>
-            <w:r>
-              <w:rPr>
-                <w:b/>
-                <w:bCs/>
-                <w:sz w:val="22"/>
-                <w:szCs w:val="20"/>
-              </w:rPr>
-              <w:t>Nam</w:t>
+              <w:t>System Nam</w:t>
             </w:r>
             <w:r>
               <w:rPr>
@@ -1413,32 +1036,7 @@
                 <w:lang w:val="en-CA"/>
                 <w14:ligatures w14:val="standardContextual"/>
               </w:rPr>
-              <w:t>{{</w:t>
-            </w:r>
-            <w:proofErr w:type="spellStart"/>
-            <w:proofErr w:type="gramEnd"/>
-            <w:r>
-              <w:rPr>
-                <w:rFonts w:asciiTheme="minorHAnsi" w:eastAsiaTheme="minorHAnsi" w:hAnsiTheme="minorHAnsi"/>
-                <w:kern w:val="2"/>
-                <w:sz w:val="20"/>
-                <w:szCs w:val="20"/>
-                <w:lang w:val="en-CA"/>
-                <w14:ligatures w14:val="standardContextual"/>
-              </w:rPr>
-              <w:t>FacilityName</w:t>
-            </w:r>
-            <w:proofErr w:type="spellEnd"/>
-            <w:r>
-              <w:rPr>
-                <w:rFonts w:asciiTheme="minorHAnsi" w:eastAsiaTheme="minorHAnsi" w:hAnsiTheme="minorHAnsi"/>
-                <w:kern w:val="2"/>
-                <w:sz w:val="20"/>
-                <w:szCs w:val="20"/>
-                <w:lang w:val="en-CA"/>
-                <w14:ligatures w14:val="standardContextual"/>
-              </w:rPr>
-              <w:t>}}</w:t>
+              <w:t>{{FacilityName}}</w:t>
             </w:r>
           </w:p>
         </w:tc>
@@ -1476,16 +1074,7 @@
                 <w:sz w:val="22"/>
                 <w:szCs w:val="20"/>
               </w:rPr>
-              <w:t xml:space="preserve">ystem </w:t>
-            </w:r>
-            <w:proofErr w:type="gramStart"/>
-            <w:r>
-              <w:rPr>
-                <w:b/>
-                <w:sz w:val="22"/>
-                <w:szCs w:val="20"/>
-              </w:rPr>
-              <w:t>Type:</w:t>
+              <w:t>ystem Type:</w:t>
             </w:r>
             <w:r>
               <w:rPr>
@@ -1496,32 +1085,7 @@
                 <w:lang w:val="en-CA"/>
                 <w14:ligatures w14:val="standardContextual"/>
               </w:rPr>
-              <w:t xml:space="preserve"> {{</w:t>
-            </w:r>
-            <w:proofErr w:type="spellStart"/>
-            <w:proofErr w:type="gramEnd"/>
-            <w:r>
-              <w:rPr>
-                <w:rFonts w:asciiTheme="minorHAnsi" w:eastAsiaTheme="minorHAnsi" w:hAnsiTheme="minorHAnsi"/>
-                <w:kern w:val="2"/>
-                <w:sz w:val="20"/>
-                <w:szCs w:val="20"/>
-                <w:lang w:val="en-CA"/>
-                <w14:ligatures w14:val="standardContextual"/>
-              </w:rPr>
-              <w:t>SystemType</w:t>
-            </w:r>
-            <w:proofErr w:type="spellEnd"/>
-            <w:r>
-              <w:rPr>
-                <w:rFonts w:asciiTheme="minorHAnsi" w:eastAsiaTheme="minorHAnsi" w:hAnsiTheme="minorHAnsi"/>
-                <w:kern w:val="2"/>
-                <w:sz w:val="20"/>
-                <w:szCs w:val="20"/>
-                <w:lang w:val="en-CA"/>
-                <w14:ligatures w14:val="standardContextual"/>
-              </w:rPr>
-              <w:t>}}</w:t>
+              <w:t xml:space="preserve"> {{SystemType}}</w:t>
             </w:r>
           </w:p>
         </w:tc>
@@ -1544,7 +1108,6 @@
                 <w:sz w:val="22"/>
               </w:rPr>
             </w:pPr>
-            <w:proofErr w:type="gramStart"/>
             <w:r>
               <w:rPr>
                 <w:b/>
@@ -1562,9 +1125,8 @@
                 <w:lang w:val="en-CA"/>
                 <w14:ligatures w14:val="standardContextual"/>
               </w:rPr>
-              <w:t>{</w:t>
+              <w:t>{{</w:t>
             </w:r>
-            <w:proofErr w:type="gramEnd"/>
             <w:r>
               <w:rPr>
                 <w:rFonts w:asciiTheme="minorHAnsi" w:eastAsiaTheme="minorHAnsi" w:hAnsiTheme="minorHAnsi"/>
@@ -1574,7 +1136,7 @@
                 <w:lang w:val="en-CA"/>
                 <w14:ligatures w14:val="standardContextual"/>
               </w:rPr>
-              <w:t>{</w:t>
+              <w:t>#IF_IsDrinkingWaterSystem</w:t>
             </w:r>
             <w:r>
               <w:rPr>
@@ -1585,9 +1147,8 @@
                 <w:lang w:val="en-CA"/>
                 <w14:ligatures w14:val="standardContextual"/>
               </w:rPr>
-              <w:t>#IF_IsDrinkingWaterSystem</w:t>
+              <w:t>}}{{</w:t>
             </w:r>
-            <w:proofErr w:type="gramStart"/>
             <w:r>
               <w:rPr>
                 <w:rFonts w:asciiTheme="minorHAnsi" w:eastAsiaTheme="minorHAnsi" w:hAnsiTheme="minorHAnsi"/>
@@ -1597,9 +1158,8 @@
                 <w:lang w:val="en-CA"/>
                 <w14:ligatures w14:val="standardContextual"/>
               </w:rPr>
-              <w:t>}}{</w:t>
+              <w:t>FacilityPopulationServedper24hrs</w:t>
             </w:r>
-            <w:proofErr w:type="gramEnd"/>
             <w:r>
               <w:rPr>
                 <w:rFonts w:asciiTheme="minorHAnsi" w:eastAsiaTheme="minorHAnsi" w:hAnsiTheme="minorHAnsi"/>
@@ -1609,42 +1169,7 @@
                 <w:lang w:val="en-CA"/>
                 <w14:ligatures w14:val="standardContextual"/>
               </w:rPr>
-              <w:t>{</w:t>
-            </w:r>
-            <w:r>
-              <w:rPr>
-                <w:rFonts w:asciiTheme="minorHAnsi" w:eastAsiaTheme="minorHAnsi" w:hAnsiTheme="minorHAnsi"/>
-                <w:kern w:val="2"/>
-                <w:sz w:val="20"/>
-                <w:szCs w:val="20"/>
-                <w:lang w:val="en-CA"/>
-                <w14:ligatures w14:val="standardContextual"/>
-              </w:rPr>
-              <w:t>FacilityPopulationServedper24hrs</w:t>
-            </w:r>
-            <w:proofErr w:type="gramStart"/>
-            <w:r>
-              <w:rPr>
-                <w:rFonts w:asciiTheme="minorHAnsi" w:eastAsiaTheme="minorHAnsi" w:hAnsiTheme="minorHAnsi"/>
-                <w:kern w:val="2"/>
-                <w:sz w:val="20"/>
-                <w:szCs w:val="20"/>
-                <w:lang w:val="en-CA"/>
-                <w14:ligatures w14:val="standardContextual"/>
-              </w:rPr>
-              <w:t>}}{</w:t>
-            </w:r>
-            <w:proofErr w:type="gramEnd"/>
-            <w:r>
-              <w:rPr>
-                <w:rFonts w:asciiTheme="minorHAnsi" w:eastAsiaTheme="minorHAnsi" w:hAnsiTheme="minorHAnsi"/>
-                <w:kern w:val="2"/>
-                <w:sz w:val="20"/>
-                <w:szCs w:val="20"/>
-                <w:lang w:val="en-CA"/>
-                <w14:ligatures w14:val="standardContextual"/>
-              </w:rPr>
-              <w:t>{</w:t>
+              <w:t>}}{{</w:t>
             </w:r>
             <w:r>
               <w:rPr>
@@ -1719,16 +1244,7 @@
                 <w:sz w:val="22"/>
                 <w:szCs w:val="20"/>
               </w:rPr>
-              <w:t>Site Name</w:t>
-            </w:r>
-            <w:proofErr w:type="gramStart"/>
-            <w:r>
-              <w:rPr>
-                <w:b/>
-                <w:sz w:val="22"/>
-                <w:szCs w:val="20"/>
-              </w:rPr>
-              <w:t xml:space="preserve">: </w:t>
+              <w:t xml:space="preserve">Site Name: </w:t>
             </w:r>
             <w:r>
               <w:rPr>
@@ -1747,43 +1263,7 @@
                 <w:lang w:val="en-CA"/>
                 <w14:ligatures w14:val="standardContextual"/>
               </w:rPr>
-              <w:t>{</w:t>
-            </w:r>
-            <w:proofErr w:type="gramEnd"/>
-            <w:r>
-              <w:rPr>
-                <w:rFonts w:asciiTheme="minorHAnsi" w:eastAsiaTheme="minorHAnsi" w:hAnsiTheme="minorHAnsi"/>
-                <w:kern w:val="2"/>
-                <w:sz w:val="20"/>
-                <w:szCs w:val="20"/>
-                <w:lang w:val="en-CA"/>
-                <w14:ligatures w14:val="standardContextual"/>
-              </w:rPr>
-              <w:t>{</w:t>
-            </w:r>
-            <w:proofErr w:type="spellStart"/>
-            <w:r>
-              <w:rPr>
-                <w:rFonts w:asciiTheme="minorHAnsi" w:eastAsiaTheme="minorHAnsi" w:hAnsiTheme="minorHAnsi"/>
-                <w:kern w:val="2"/>
-                <w:sz w:val="20"/>
-                <w:szCs w:val="20"/>
-                <w:lang w:val="en-CA"/>
-                <w14:ligatures w14:val="standardContextual"/>
-              </w:rPr>
-              <w:t>SiteName</w:t>
-            </w:r>
-            <w:proofErr w:type="spellEnd"/>
-            <w:r>
-              <w:rPr>
-                <w:rFonts w:asciiTheme="minorHAnsi" w:eastAsiaTheme="minorHAnsi" w:hAnsiTheme="minorHAnsi"/>
-                <w:kern w:val="2"/>
-                <w:sz w:val="20"/>
-                <w:szCs w:val="20"/>
-                <w:lang w:val="en-CA"/>
-                <w14:ligatures w14:val="standardContextual"/>
-              </w:rPr>
-              <w:t>}}</w:t>
+              <w:t>{{SiteName}}</w:t>
             </w:r>
           </w:p>
         </w:tc>
@@ -1813,16 +1293,7 @@
                 <w:sz w:val="22"/>
                 <w:szCs w:val="20"/>
               </w:rPr>
-              <w:t xml:space="preserve">Site </w:t>
-            </w:r>
-            <w:proofErr w:type="gramStart"/>
-            <w:r>
-              <w:rPr>
-                <w:b/>
-                <w:sz w:val="22"/>
-                <w:szCs w:val="20"/>
-              </w:rPr>
-              <w:t>Address:</w:t>
+              <w:t>Site Address:</w:t>
             </w:r>
             <w:r>
               <w:rPr>
@@ -1833,32 +1304,7 @@
                 <w:lang w:val="en-CA"/>
                 <w14:ligatures w14:val="standardContextual"/>
               </w:rPr>
-              <w:t xml:space="preserve"> {{</w:t>
-            </w:r>
-            <w:proofErr w:type="spellStart"/>
-            <w:proofErr w:type="gramEnd"/>
-            <w:r>
-              <w:rPr>
-                <w:rFonts w:asciiTheme="minorHAnsi" w:eastAsiaTheme="minorHAnsi" w:hAnsiTheme="minorHAnsi"/>
-                <w:kern w:val="2"/>
-                <w:sz w:val="20"/>
-                <w:szCs w:val="20"/>
-                <w:lang w:val="en-CA"/>
-                <w14:ligatures w14:val="standardContextual"/>
-              </w:rPr>
-              <w:t>SiteAddress</w:t>
-            </w:r>
-            <w:proofErr w:type="spellEnd"/>
-            <w:r>
-              <w:rPr>
-                <w:rFonts w:asciiTheme="minorHAnsi" w:eastAsiaTheme="minorHAnsi" w:hAnsiTheme="minorHAnsi"/>
-                <w:kern w:val="2"/>
-                <w:sz w:val="20"/>
-                <w:szCs w:val="20"/>
-                <w:lang w:val="en-CA"/>
-                <w14:ligatures w14:val="standardContextual"/>
-              </w:rPr>
-              <w:t>}}</w:t>
+              <w:t xml:space="preserve"> {{SiteAddress}}</w:t>
             </w:r>
           </w:p>
         </w:tc>
@@ -1887,16 +1333,7 @@
                 <w:sz w:val="22"/>
                 <w:szCs w:val="20"/>
               </w:rPr>
-              <w:t xml:space="preserve">Site </w:t>
-            </w:r>
-            <w:proofErr w:type="gramStart"/>
-            <w:r>
-              <w:rPr>
-                <w:b/>
-                <w:sz w:val="22"/>
-                <w:szCs w:val="20"/>
-              </w:rPr>
-              <w:t>Type:</w:t>
+              <w:t>Site Type:</w:t>
             </w:r>
             <w:r>
               <w:rPr>
@@ -1915,32 +1352,7 @@
                 <w:lang w:val="en-CA"/>
                 <w14:ligatures w14:val="standardContextual"/>
               </w:rPr>
-              <w:t>{{</w:t>
-            </w:r>
-            <w:proofErr w:type="spellStart"/>
-            <w:proofErr w:type="gramEnd"/>
-            <w:r>
-              <w:rPr>
-                <w:rFonts w:asciiTheme="minorHAnsi" w:eastAsiaTheme="minorHAnsi" w:hAnsiTheme="minorHAnsi"/>
-                <w:kern w:val="2"/>
-                <w:sz w:val="20"/>
-                <w:szCs w:val="20"/>
-                <w:lang w:val="en-CA"/>
-                <w14:ligatures w14:val="standardContextual"/>
-              </w:rPr>
-              <w:t>SiteType</w:t>
-            </w:r>
-            <w:proofErr w:type="spellEnd"/>
-            <w:r>
-              <w:rPr>
-                <w:rFonts w:asciiTheme="minorHAnsi" w:eastAsiaTheme="minorHAnsi" w:hAnsiTheme="minorHAnsi"/>
-                <w:kern w:val="2"/>
-                <w:sz w:val="20"/>
-                <w:szCs w:val="20"/>
-                <w:lang w:val="en-CA"/>
-                <w14:ligatures w14:val="standardContextual"/>
-              </w:rPr>
-              <w:t>}}</w:t>
+              <w:t>{{SiteType}}</w:t>
             </w:r>
           </w:p>
         </w:tc>
@@ -2049,7 +1461,7 @@
       </w:tr>
       <w:tr>
         <w:trPr>
-          <w:trHeight w:val="816"/>
+          <w:trHeight w:val="582"/>
           <w:jc w:val="center"/>
         </w:trPr>
         <w:tc>
@@ -2087,25 +1499,7 @@
                 <w:sz w:val="36"/>
                 <w:szCs w:val="36"/>
               </w:rPr>
-              <w:t>{{</w:t>
-            </w:r>
-            <w:proofErr w:type="spellStart"/>
-            <w:r>
-              <w:rPr>
-                <w:color w:val="000000"/>
-                <w:sz w:val="36"/>
-                <w:szCs w:val="36"/>
-              </w:rPr>
-              <w:t>IMG_BarcodeImage</w:t>
-            </w:r>
-            <w:proofErr w:type="spellEnd"/>
-            <w:r>
-              <w:rPr>
-                <w:color w:val="000000"/>
-                <w:sz w:val="36"/>
-                <w:szCs w:val="36"/>
-              </w:rPr>
-              <w:t>}}</w:t>
+              <w:t>{{IMG_BarcodeImage}}</w:t>
             </w:r>
           </w:p>
         </w:tc>
@@ -2147,16 +1541,7 @@
                 <w:bCs/>
                 <w:sz w:val="22"/>
               </w:rPr>
-              <w:t xml:space="preserve">Sample Submitted for </w:t>
-            </w:r>
-            <w:proofErr w:type="gramStart"/>
-            <w:r>
-              <w:rPr>
-                <w:b/>
-                <w:bCs/>
-                <w:sz w:val="22"/>
-              </w:rPr>
-              <w:t>Purpose:</w:t>
+              <w:t>Sample Submitted for Purpose:</w:t>
             </w:r>
             <w:r>
               <w:rPr>
@@ -2175,32 +1560,7 @@
                 <w:lang w:val="en-CA"/>
                 <w14:ligatures w14:val="standardContextual"/>
               </w:rPr>
-              <w:t>{{</w:t>
-            </w:r>
-            <w:proofErr w:type="spellStart"/>
-            <w:proofErr w:type="gramEnd"/>
-            <w:r>
-              <w:rPr>
-                <w:rFonts w:asciiTheme="minorHAnsi" w:eastAsiaTheme="minorHAnsi" w:hAnsiTheme="minorHAnsi"/>
-                <w:kern w:val="2"/>
-                <w:sz w:val="20"/>
-                <w:szCs w:val="20"/>
-                <w:lang w:val="en-CA"/>
-                <w14:ligatures w14:val="standardContextual"/>
-              </w:rPr>
-              <w:t>SampleReason</w:t>
-            </w:r>
-            <w:proofErr w:type="spellEnd"/>
-            <w:r>
-              <w:rPr>
-                <w:rFonts w:asciiTheme="minorHAnsi" w:eastAsiaTheme="minorHAnsi" w:hAnsiTheme="minorHAnsi"/>
-                <w:kern w:val="2"/>
-                <w:sz w:val="20"/>
-                <w:szCs w:val="20"/>
-                <w:lang w:val="en-CA"/>
-                <w14:ligatures w14:val="standardContextual"/>
-              </w:rPr>
-              <w:t>}}</w:t>
+              <w:t>{{SampleReason}}</w:t>
             </w:r>
             <w:r>
               <w:rPr>
@@ -2288,10 +1648,53 @@
                 <w:lang w:val="en-CA"/>
                 <w14:ligatures w14:val="standardContextual"/>
               </w:rPr>
-              <w:t>IF_IsDrinkingWaterSystem</w:t>
+              <w:t>IF_IsDrinkingWaterSystem}}{{BoilAdvisory}}{{/IF_IsDrinkingWaterSystem}}</w:t>
             </w:r>
-            <w:proofErr w:type="gramStart"/>
             <w:r>
+              <w:rPr>
+                <w:color w:val="C00000"/>
+                <w:sz w:val="22"/>
+                <w:szCs w:val="20"/>
+              </w:rPr>
+              <w:t xml:space="preserve">               </w:t>
+            </w:r>
+            <w:r>
+              <w:rPr>
+                <w:b/>
+                <w:sz w:val="22"/>
+                <w:szCs w:val="20"/>
+              </w:rPr>
+              <w:t xml:space="preserve">       </w:t>
+            </w:r>
+          </w:p>
+        </w:tc>
+      </w:tr>
+      <w:tr>
+        <w:trPr>
+          <w:trHeight w:val="402"/>
+          <w:jc w:val="center"/>
+        </w:trPr>
+        <w:tc>
+          <w:tcPr>
+            <w:tcW w:w="11880" w:type="dxa"/>
+            <w:gridSpan w:val="7"/>
+            <w:tcBorders>
+              <w:top w:val="single" w:sz="8" w:space="0" w:color="000000" w:themeColor="text1"/>
+              <w:left w:val="single" w:sz="8" w:space="0" w:color="000000" w:themeColor="text1"/>
+              <w:bottom w:val="single" w:sz="8" w:space="0" w:color="000000" w:themeColor="text1"/>
+              <w:right w:val="single" w:sz="8" w:space="0" w:color="000000" w:themeColor="text1"/>
+            </w:tcBorders>
+            <w:tcMar>
+              <w:top w:w="55" w:type="dxa"/>
+              <w:left w:w="70" w:type="dxa"/>
+              <w:bottom w:w="55" w:type="dxa"/>
+              <w:right w:w="70" w:type="dxa"/>
+            </w:tcMar>
+            <w:vAlign w:val="center"/>
+          </w:tcPr>
+          <w:p>
+            <w:pPr>
+              <w:spacing w:after="0" w:line="240" w:lineRule="auto"/>
               <w:rPr>
                 <w:rFonts w:asciiTheme="minorHAnsi" w:eastAsiaTheme="minorHAnsi" w:hAnsiTheme="minorHAnsi"/>
                 <w:kern w:val="2"/>
@@ -2300,9 +1703,15 @@
                 <w:lang w:val="en-CA"/>
                 <w14:ligatures w14:val="standardContextual"/>
               </w:rPr>
-              <w:t>}}{</w:t>
+            </w:pPr>
+            <w:r>
+              <w:rPr>
+                <w:b/>
+                <w:sz w:val="22"/>
+                <w:szCs w:val="20"/>
+              </w:rPr>
+              <w:t>Is Sample Submitted for the purpose of Drinking Water Protection Act?</w:t>
             </w:r>
-            <w:proofErr w:type="gramEnd"/>
             <w:r>
               <w:rPr>
                 <w:rFonts w:asciiTheme="minorHAnsi" w:eastAsiaTheme="minorHAnsi" w:hAnsiTheme="minorHAnsi"/>
@@ -2312,9 +1721,8 @@
                 <w:lang w:val="en-CA"/>
                 <w14:ligatures w14:val="standardContextual"/>
               </w:rPr>
-              <w:t>{BoilAdvisory</w:t>
+              <w:t xml:space="preserve"> </w:t>
             </w:r>
-            <w:proofErr w:type="gramStart"/>
             <w:r>
               <w:rPr>
                 <w:rFonts w:asciiTheme="minorHAnsi" w:eastAsiaTheme="minorHAnsi" w:hAnsiTheme="minorHAnsi"/>
@@ -2324,9 +1732,8 @@
                 <w:lang w:val="en-CA"/>
                 <w14:ligatures w14:val="standardContextual"/>
               </w:rPr>
-              <w:t>}}{</w:t>
+              <w:t>{{SubmittedforDWPA}}</w:t>
             </w:r>
-            <w:proofErr w:type="gramEnd"/>
             <w:r>
               <w:rPr>
                 <w:rFonts w:asciiTheme="minorHAnsi" w:eastAsiaTheme="minorHAnsi" w:hAnsiTheme="minorHAnsi"/>
@@ -2336,44 +1743,7 @@
                 <w:lang w:val="en-CA"/>
                 <w14:ligatures w14:val="standardContextual"/>
               </w:rPr>
-              <w:t>{/IF_IsDrinkingWaterSystem</w:t>
-            </w:r>
-            <w:proofErr w:type="gramStart"/>
-            <w:r>
-              <w:rPr>
-                <w:rFonts w:asciiTheme="minorHAnsi" w:eastAsiaTheme="minorHAnsi" w:hAnsiTheme="minorHAnsi"/>
-                <w:kern w:val="2"/>
-                <w:sz w:val="20"/>
-                <w:szCs w:val="20"/>
-                <w:lang w:val="en-CA"/>
-                <w14:ligatures w14:val="standardContextual"/>
-              </w:rPr>
-              <w:t>}}</w:t>
-            </w:r>
-            <w:r>
-              <w:rPr>
-                <w:color w:val="C00000"/>
-                <w:sz w:val="22"/>
-                <w:szCs w:val="20"/>
-              </w:rPr>
-              <w:t xml:space="preserve">   </w:t>
-            </w:r>
-            <w:proofErr w:type="gramEnd"/>
-            <w:r>
-              <w:rPr>
-                <w:color w:val="C00000"/>
-                <w:sz w:val="22"/>
-                <w:szCs w:val="20"/>
-              </w:rPr>
-              <w:t xml:space="preserve">            </w:t>
-            </w:r>
-            <w:r>
-              <w:rPr>
-                <w:b/>
-                <w:sz w:val="22"/>
-                <w:szCs w:val="20"/>
-              </w:rPr>
-              <w:t xml:space="preserve">       </w:t>
+              <w:t> </w:t>
             </w:r>
           </w:p>
         </w:tc>
@@ -2427,31 +1797,7 @@
                 <w:lang w:val="en-CA"/>
                 <w14:ligatures w14:val="standardContextual"/>
               </w:rPr>
-              <w:t>{{</w:t>
-            </w:r>
-            <w:proofErr w:type="spellStart"/>
-            <w:r>
-              <w:rPr>
-                <w:rFonts w:asciiTheme="minorHAnsi" w:eastAsiaTheme="minorHAnsi" w:hAnsiTheme="minorHAnsi"/>
-                <w:kern w:val="2"/>
-                <w:sz w:val="20"/>
-                <w:szCs w:val="20"/>
-                <w:lang w:val="en-CA"/>
-                <w14:ligatures w14:val="standardContextual"/>
-              </w:rPr>
-              <w:t>HealthAuthority</w:t>
-            </w:r>
-            <w:proofErr w:type="spellEnd"/>
-            <w:r>
-              <w:rPr>
-                <w:rFonts w:asciiTheme="minorHAnsi" w:eastAsiaTheme="minorHAnsi" w:hAnsiTheme="minorHAnsi"/>
-                <w:kern w:val="2"/>
-                <w:sz w:val="20"/>
-                <w:szCs w:val="20"/>
-                <w:lang w:val="en-CA"/>
-                <w14:ligatures w14:val="standardContextual"/>
-              </w:rPr>
-              <w:t>}}</w:t>
+              <w:t>{{HealthAuthority}}</w:t>
             </w:r>
           </w:p>
         </w:tc>
@@ -2482,16 +1828,7 @@
                 <w:sz w:val="22"/>
                 <w:szCs w:val="20"/>
               </w:rPr>
-              <w:t>Send Additional Copy To</w:t>
-            </w:r>
-            <w:proofErr w:type="gramStart"/>
-            <w:r>
-              <w:rPr>
-                <w:b/>
-                <w:sz w:val="22"/>
-                <w:szCs w:val="20"/>
-              </w:rPr>
-              <w:t xml:space="preserve">: </w:t>
+              <w:t xml:space="preserve">Send Additional Copy To: </w:t>
             </w:r>
             <w:r>
               <w:rPr>
@@ -2510,50 +1847,14 @@
                 <w:lang w:val="en-CA"/>
                 <w14:ligatures w14:val="standardContextual"/>
               </w:rPr>
-              <w:t>{</w:t>
-            </w:r>
-            <w:proofErr w:type="gramEnd"/>
-            <w:r>
-              <w:rPr>
-                <w:rFonts w:asciiTheme="minorHAnsi" w:eastAsiaTheme="minorHAnsi" w:hAnsiTheme="minorHAnsi"/>
-                <w:kern w:val="2"/>
-                <w:sz w:val="20"/>
-                <w:szCs w:val="20"/>
-                <w:lang w:val="en-CA"/>
-                <w14:ligatures w14:val="standardContextual"/>
-              </w:rPr>
-              <w:t>{</w:t>
-            </w:r>
-            <w:proofErr w:type="spellStart"/>
-            <w:r>
-              <w:rPr>
-                <w:rFonts w:asciiTheme="minorHAnsi" w:eastAsiaTheme="minorHAnsi" w:hAnsiTheme="minorHAnsi"/>
-                <w:kern w:val="2"/>
-                <w:sz w:val="20"/>
-                <w:szCs w:val="20"/>
-                <w:lang w:val="en-CA"/>
-                <w14:ligatures w14:val="standardContextual"/>
-              </w:rPr>
-              <w:t>AdditionalReportRecipients</w:t>
-            </w:r>
-            <w:proofErr w:type="spellEnd"/>
-            <w:r>
-              <w:rPr>
-                <w:rFonts w:asciiTheme="minorHAnsi" w:eastAsiaTheme="minorHAnsi" w:hAnsiTheme="minorHAnsi"/>
-                <w:kern w:val="2"/>
-                <w:sz w:val="20"/>
-                <w:szCs w:val="20"/>
-                <w:lang w:val="en-CA"/>
-                <w14:ligatures w14:val="standardContextual"/>
-              </w:rPr>
-              <w:t>}}</w:t>
+              <w:t>{{AdditionalReportRecipients}}</w:t>
             </w:r>
           </w:p>
         </w:tc>
       </w:tr>
       <w:tr>
         <w:trPr>
-          <w:trHeight w:val="627"/>
+          <w:trHeight w:val="321"/>
           <w:jc w:val="center"/>
         </w:trPr>
         <w:tc>
@@ -2622,7 +1923,7 @@
       </w:tr>
       <w:tr>
         <w:trPr>
-          <w:trHeight w:val="555"/>
+          <w:trHeight w:val="438"/>
           <w:jc w:val="center"/>
         </w:trPr>
         <w:tc>
@@ -2829,39 +2130,28 @@
               <w:rPr>
                 <w:sz w:val="22"/>
               </w:rPr>
-              <w:t xml:space="preserve">Total Chlorine </w:t>
-            </w:r>
-            <w:proofErr w:type="gramStart"/>
-            <w:r>
-              <w:rPr>
-                <w:sz w:val="22"/>
-              </w:rPr>
-              <w:t xml:space="preserve">   </w:t>
+              <w:t xml:space="preserve">Total Chlorine    </w:t>
             </w:r>
             <w:r>
               <w:rPr>
                 <w:rFonts w:ascii="Segoe UI Symbol" w:hAnsi="Segoe UI Symbol"/>
                 <w:sz w:val="22"/>
               </w:rPr>
-              <w:t>{</w:t>
+              <w:t xml:space="preserve">{{#IF_PreviousSampleOvergrown}}☑ </w:t>
             </w:r>
-            <w:proofErr w:type="gramEnd"/>
+            <w:r>
+              <w:rPr>
+                <w:sz w:val="22"/>
+              </w:rPr>
+              <w:t>Previous Sample Overgrown</w:t>
+            </w:r>
             <w:r>
               <w:rPr>
                 <w:rFonts w:ascii="Segoe UI Symbol" w:hAnsi="Segoe UI Symbol"/>
                 <w:sz w:val="22"/>
               </w:rPr>
-              <w:t>{#IF_PreviousSampleOvergrown</w:t>
+              <w:t>{{/IF_PreviousSampleOvergrown}}{{^IF_PreviousSampleOvergrown}}</w:t>
             </w:r>
-            <w:proofErr w:type="gramStart"/>
-            <w:r>
-              <w:rPr>
-                <w:rFonts w:ascii="Segoe UI Symbol" w:hAnsi="Segoe UI Symbol"/>
-                <w:sz w:val="22"/>
-              </w:rPr>
-              <w:t>}}☑</w:t>
-            </w:r>
-            <w:proofErr w:type="gramEnd"/>
             <w:r>
               <w:rPr>
                 <w:rFonts w:ascii="Segoe UI Symbol" w:hAnsi="Segoe UI Symbol"/>
@@ -2871,6 +2161,13 @@
             </w:r>
             <w:r>
               <w:rPr>
+                <w:rFonts w:ascii="Segoe UI Symbol" w:hAnsi="Segoe UI Symbol"/>
+                <w:sz w:val="22"/>
+              </w:rPr>
+              <w:t xml:space="preserve">☐ </w:t>
+            </w:r>
+            <w:r>
+              <w:rPr>
                 <w:sz w:val="22"/>
               </w:rPr>
               <w:t>Previous Sample Overgrown</w:t>
@@ -2880,66 +2177,7 @@
                 <w:rFonts w:ascii="Segoe UI Symbol" w:hAnsi="Segoe UI Symbol"/>
                 <w:sz w:val="22"/>
               </w:rPr>
-              <w:t>{{/IF_PreviousSampleOvergrown</w:t>
-            </w:r>
-            <w:proofErr w:type="gramStart"/>
-            <w:r>
-              <w:rPr>
-                <w:rFonts w:ascii="Segoe UI Symbol" w:hAnsi="Segoe UI Symbol"/>
-                <w:sz w:val="22"/>
-              </w:rPr>
-              <w:t>}}{</w:t>
-            </w:r>
-            <w:proofErr w:type="gramEnd"/>
-            <w:r>
-              <w:rPr>
-                <w:rFonts w:ascii="Segoe UI Symbol" w:hAnsi="Segoe UI Symbol"/>
-                <w:sz w:val="22"/>
-              </w:rPr>
-              <w:t>{^IF_PreviousSampleOvergrown}}</w:t>
-            </w:r>
-            <w:r>
-              <w:rPr>
-                <w:rFonts w:ascii="Segoe UI Symbol" w:hAnsi="Segoe UI Symbol"/>
-                <w:sz w:val="22"/>
-              </w:rPr>
-              <w:t xml:space="preserve"> </w:t>
-            </w:r>
-            <w:r>
-              <w:rPr>
-                <w:rFonts w:ascii="Segoe UI Symbol" w:hAnsi="Segoe UI Symbol"/>
-                <w:sz w:val="22"/>
-              </w:rPr>
-              <w:t xml:space="preserve">☐ </w:t>
-            </w:r>
-            <w:r>
-              <w:rPr>
-                <w:sz w:val="22"/>
-              </w:rPr>
-              <w:t>Previous Sample Overgrown</w:t>
-            </w:r>
-            <w:r>
-              <w:rPr>
-                <w:rFonts w:ascii="Segoe UI Symbol" w:hAnsi="Segoe UI Symbol"/>
-                <w:sz w:val="22"/>
-              </w:rPr>
-              <w:t>{{/</w:t>
-            </w:r>
-            <w:proofErr w:type="spellStart"/>
-            <w:r>
-              <w:rPr>
-                <w:rFonts w:ascii="Segoe UI Symbol" w:hAnsi="Segoe UI Symbol"/>
-                <w:sz w:val="22"/>
-              </w:rPr>
-              <w:t>IF_PreviousSampleOvergrown</w:t>
-            </w:r>
-            <w:proofErr w:type="spellEnd"/>
-            <w:r>
-              <w:rPr>
-                <w:rFonts w:ascii="Segoe UI Symbol" w:hAnsi="Segoe UI Symbol"/>
-                <w:sz w:val="22"/>
-              </w:rPr>
-              <w:t>}}</w:t>
+              <w:t>{{/IF_PreviousSampleOvergrown}}</w:t>
             </w:r>
           </w:p>
         </w:tc>
@@ -3006,7 +2244,7 @@
 </file>
 
 <file path=word/endnotes.xml><?xml version="1.0" encoding="utf-8"?>
-<w:endnotes xmlns:wpc="http://schemas.microsoft.com/office/word/2010/wordprocessingCanvas" xmlns:cx="http://schemas.microsoft.com/office/drawing/2014/chartex" xmlns:cx1="http://schemas.microsoft.com/office/drawing/2015/9/8/chartex" xmlns:cx2="http://schemas.microsoft.com/office/drawing/2015/10/21/chartex" xmlns:cx3="http://schemas.microsoft.com/office/drawing/2016/5/9/chartex" xmlns:cx4="http://schemas.microsoft.com/office/drawing/2016/5/10/chartex" xmlns:cx5="http://schemas.microsoft.com/office/drawing/2016/5/11/chartex" xmlns:cx6="http://schemas.microsoft.com/office/drawing/2016/5/12/chartex" xmlns:cx7="http://schemas.microsoft.com/office/drawing/2016/5/13/chartex" xmlns:cx8="http://schemas.microsoft.com/office/drawing/2016/5/14/chartex" xmlns:mc="http://schemas.openxmlformats.org/markup-compatibility/2006" xmlns:aink="http://schemas.microsoft.com/office/drawing/2016/ink" xmlns:am3d="http://schemas.microsoft.com/office/drawing/2017/model3d" xmlns:o="urn:schemas-microsoft-com:office:office" xmlns:oel="http://schemas.microsoft.com/office/2019/extlst" xmlns:r="http://schemas.openxmlformats.org/officeDocument/2006/relationships" xmlns:m="http://schemas.openxmlformats.org/officeDocument/2006/math" xmlns:v="urn:schemas-microsoft-com:vml" xmlns:wp14="http://schemas.microsoft.com/office/word/2010/wordprocessingDrawing" xmlns:wp="http://schemas.openxmlformats.org/drawingml/2006/wordprocessingDrawing" xmlns:w10="urn:schemas-microsoft-com:office:word" xmlns:w="http://schemas.openxmlformats.org/wordprocessingml/2006/main" xmlns:w14="http://schemas.microsoft.com/office/word/2010/wordml" xmlns:w15="http://schemas.microsoft.com/office/word/2012/wordml" xmlns:w16cei="http://schemas.microsoft.com/office/word/2026/wordml/cei" xmlns:w16cex="http://schemas.microsoft.com/office/word/2018/wordml/cex" xmlns:w16cid="http://schemas.microsoft.com/office/word/2016/wordml/cid" xmlns:w16="http://schemas.microsoft.com/office/word/2018/wordml" xmlns:w16du="http://schemas.microsoft.com/office/word/2023/wordml/word16du" xmlns:w16sdtdh="http://schemas.microsoft.com/office/word/2020/wordml/sdtdatahash" xmlns:w16sdtfl="http://schemas.microsoft.com/office/word/2024/wordml/sdtformatlock" xmlns:w16se="http://schemas.microsoft.com/office/word/2015/wordml/symex" xmlns:wpg="http://schemas.microsoft.com/office/word/2010/wordprocessingGroup" xmlns:wpi="http://schemas.microsoft.com/office/word/2010/wordprocessingInk" xmlns:wne="http://schemas.microsoft.com/office/word/2006/wordml" xmlns:wps="http://schemas.microsoft.com/office/word/2010/wordprocessingShape" mc:Ignorable="w14 w15 w16se w16cid w16 w16cex w16sdtdh w16sdtfl w16du wp14">
+<w:endnotes xmlns:wpc="http://schemas.microsoft.com/office/word/2010/wordprocessingCanvas" xmlns:cx="http://schemas.microsoft.com/office/drawing/2014/chartex" xmlns:cx1="http://schemas.microsoft.com/office/drawing/2015/9/8/chartex" xmlns:cx2="http://schemas.microsoft.com/office/drawing/2015/10/21/chartex" xmlns:cx3="http://schemas.microsoft.com/office/drawing/2016/5/9/chartex" xmlns:cx4="http://schemas.microsoft.com/office/drawing/2016/5/10/chartex" xmlns:cx5="http://schemas.microsoft.com/office/drawing/2016/5/11/chartex" xmlns:cx6="http://schemas.microsoft.com/office/drawing/2016/5/12/chartex" xmlns:cx7="http://schemas.microsoft.com/office/drawing/2016/5/13/chartex" xmlns:cx8="http://schemas.microsoft.com/office/drawing/2016/5/14/chartex" xmlns:mc="http://schemas.openxmlformats.org/markup-compatibility/2006" xmlns:aink="http://schemas.microsoft.com/office/drawing/2016/ink" xmlns:am3d="http://schemas.microsoft.com/office/drawing/2017/model3d" xmlns:o="urn:schemas-microsoft-com:office:office" xmlns:oel="http://schemas.microsoft.com/office/2019/extlst" xmlns:r="http://schemas.openxmlformats.org/officeDocument/2006/relationships" xmlns:m="http://schemas.openxmlformats.org/officeDocument/2006/math" xmlns:v="urn:schemas-microsoft-com:vml" xmlns:wp14="http://schemas.microsoft.com/office/word/2010/wordprocessingDrawing" xmlns:wp="http://schemas.openxmlformats.org/drawingml/2006/wordprocessingDrawing" xmlns:w10="urn:schemas-microsoft-com:office:word" xmlns:w="http://schemas.openxmlformats.org/wordprocessingml/2006/main" xmlns:w14="http://schemas.microsoft.com/office/word/2010/wordml" xmlns:w15="http://schemas.microsoft.com/office/word/2012/wordml" xmlns:w16cex="http://schemas.microsoft.com/office/word/2018/wordml/cex" xmlns:w16cid="http://schemas.microsoft.com/office/word/2016/wordml/cid" xmlns:w16="http://schemas.microsoft.com/office/word/2018/wordml" xmlns:w16du="http://schemas.microsoft.com/office/word/2023/wordml/word16du" xmlns:w16sdtdh="http://schemas.microsoft.com/office/word/2020/wordml/sdtdatahash" xmlns:w16sdtfl="http://schemas.microsoft.com/office/word/2024/wordml/sdtformatlock" xmlns:w16se="http://schemas.microsoft.com/office/word/2015/wordml/symex" xmlns:wpg="http://schemas.microsoft.com/office/word/2010/wordprocessingGroup" xmlns:wpi="http://schemas.microsoft.com/office/word/2010/wordprocessingInk" xmlns:wne="http://schemas.microsoft.com/office/word/2006/wordml" xmlns:wps="http://schemas.microsoft.com/office/word/2010/wordprocessingShape" mc:Ignorable="w14 w15 w16se w16cid w16 w16cex w16sdtdh w16sdtfl w16du wp14">
   <w:endnote w:type="separator" w:id="-1">
     <w:p>
       <w:pPr>
@@ -3031,7 +2269,7 @@
 </file>
 
 <file path=word/footer1.xml><?xml version="1.0" encoding="utf-8"?>
-<w:ftr xmlns:wpc="http://schemas.microsoft.com/office/word/2010/wordprocessingCanvas" xmlns:cx="http://schemas.microsoft.com/office/drawing/2014/chartex" xmlns:cx1="http://schemas.microsoft.com/office/drawing/2015/9/8/chartex" xmlns:cx2="http://schemas.microsoft.com/office/drawing/2015/10/21/chartex" xmlns:cx3="http://schemas.microsoft.com/office/drawing/2016/5/9/chartex" xmlns:cx4="http://schemas.microsoft.com/office/drawing/2016/5/10/chartex" xmlns:cx5="http://schemas.microsoft.com/office/drawing/2016/5/11/chartex" xmlns:cx6="http://schemas.microsoft.com/office/drawing/2016/5/12/chartex" xmlns:cx7="http://schemas.microsoft.com/office/drawing/2016/5/13/chartex" xmlns:cx8="http://schemas.microsoft.com/office/drawing/2016/5/14/chartex" xmlns:mc="http://schemas.openxmlformats.org/markup-compatibility/2006" xmlns:aink="http://schemas.microsoft.com/office/drawing/2016/ink" xmlns:am3d="http://schemas.microsoft.com/office/drawing/2017/model3d" xmlns:o="urn:schemas-microsoft-com:office:office" xmlns:oel="http://schemas.microsoft.com/office/2019/extlst" xmlns:r="http://schemas.openxmlformats.org/officeDocument/2006/relationships" xmlns:m="http://schemas.openxmlformats.org/officeDocument/2006/math" xmlns:v="urn:schemas-microsoft-com:vml" xmlns:wp14="http://schemas.microsoft.com/office/word/2010/wordprocessingDrawing" xmlns:wp="http://schemas.openxmlformats.org/drawingml/2006/wordprocessingDrawing" xmlns:w10="urn:schemas-microsoft-com:office:word" xmlns:w="http://schemas.openxmlformats.org/wordprocessingml/2006/main" xmlns:w14="http://schemas.microsoft.com/office/word/2010/wordml" xmlns:w15="http://schemas.microsoft.com/office/word/2012/wordml" xmlns:w16cei="http://schemas.microsoft.com/office/word/2026/wordml/cei" xmlns:w16cex="http://schemas.microsoft.com/office/word/2018/wordml/cex" xmlns:w16cid="http://schemas.microsoft.com/office/word/2016/wordml/cid" xmlns:w16="http://schemas.microsoft.com/office/word/2018/wordml" xmlns:w16du="http://schemas.microsoft.com/office/word/2023/wordml/word16du" xmlns:w16sdtdh="http://schemas.microsoft.com/office/word/2020/wordml/sdtdatahash" xmlns:w16sdtfl="http://schemas.microsoft.com/office/word/2024/wordml/sdtformatlock" xmlns:w16se="http://schemas.microsoft.com/office/word/2015/wordml/symex" xmlns:wpg="http://schemas.microsoft.com/office/word/2010/wordprocessingGroup" xmlns:wpi="http://schemas.microsoft.com/office/word/2010/wordprocessingInk" xmlns:wne="http://schemas.microsoft.com/office/word/2006/wordml" xmlns:wps="http://schemas.microsoft.com/office/word/2010/wordprocessingShape" mc:Ignorable="w14 w15 w16se w16cid w16 w16cex w16sdtdh w16sdtfl w16du wp14">
+<w:ftr xmlns:wpc="http://schemas.microsoft.com/office/word/2010/wordprocessingCanvas" xmlns:cx="http://schemas.microsoft.com/office/drawing/2014/chartex" xmlns:cx1="http://schemas.microsoft.com/office/drawing/2015/9/8/chartex" xmlns:cx2="http://schemas.microsoft.com/office/drawing/2015/10/21/chartex" xmlns:cx3="http://schemas.microsoft.com/office/drawing/2016/5/9/chartex" xmlns:cx4="http://schemas.microsoft.com/office/drawing/2016/5/10/chartex" xmlns:cx5="http://schemas.microsoft.com/office/drawing/2016/5/11/chartex" xmlns:cx6="http://schemas.microsoft.com/office/drawing/2016/5/12/chartex" xmlns:cx7="http://schemas.microsoft.com/office/drawing/2016/5/13/chartex" xmlns:cx8="http://schemas.microsoft.com/office/drawing/2016/5/14/chartex" xmlns:mc="http://schemas.openxmlformats.org/markup-compatibility/2006" xmlns:aink="http://schemas.microsoft.com/office/drawing/2016/ink" xmlns:am3d="http://schemas.microsoft.com/office/drawing/2017/model3d" xmlns:o="urn:schemas-microsoft-com:office:office" xmlns:oel="http://schemas.microsoft.com/office/2019/extlst" xmlns:r="http://schemas.openxmlformats.org/officeDocument/2006/relationships" xmlns:m="http://schemas.openxmlformats.org/officeDocument/2006/math" xmlns:v="urn:schemas-microsoft-com:vml" xmlns:wp14="http://schemas.microsoft.com/office/word/2010/wordprocessingDrawing" xmlns:wp="http://schemas.openxmlformats.org/drawingml/2006/wordprocessingDrawing" xmlns:w10="urn:schemas-microsoft-com:office:word" xmlns:w="http://schemas.openxmlformats.org/wordprocessingml/2006/main" xmlns:w14="http://schemas.microsoft.com/office/word/2010/wordml" xmlns:w15="http://schemas.microsoft.com/office/word/2012/wordml" xmlns:w16cex="http://schemas.microsoft.com/office/word/2018/wordml/cex" xmlns:w16cid="http://schemas.microsoft.com/office/word/2016/wordml/cid" xmlns:w16="http://schemas.microsoft.com/office/word/2018/wordml" xmlns:w16du="http://schemas.microsoft.com/office/word/2023/wordml/word16du" xmlns:w16sdtdh="http://schemas.microsoft.com/office/word/2020/wordml/sdtdatahash" xmlns:w16sdtfl="http://schemas.microsoft.com/office/word/2024/wordml/sdtformatlock" xmlns:w16se="http://schemas.microsoft.com/office/word/2015/wordml/symex" xmlns:wpg="http://schemas.microsoft.com/office/word/2010/wordprocessingGroup" xmlns:wpi="http://schemas.microsoft.com/office/word/2010/wordprocessingInk" xmlns:wne="http://schemas.microsoft.com/office/word/2006/wordml" xmlns:wps="http://schemas.microsoft.com/office/word/2010/wordprocessingShape" mc:Ignorable="w14 w15 w16se w16cid w16 w16cex w16sdtdh w16sdtfl w16du wp14">
   <w:p>
     <w:pPr>
       <w:pStyle w:val="Footer"/>
@@ -3144,7 +2382,7 @@
 </file>
 
 <file path=word/footnotes.xml><?xml version="1.0" encoding="utf-8"?>
-<w:footnotes xmlns:wpc="http://schemas.microsoft.com/office/word/2010/wordprocessingCanvas" xmlns:cx="http://schemas.microsoft.com/office/drawing/2014/chartex" xmlns:cx1="http://schemas.microsoft.com/office/drawing/2015/9/8/chartex" xmlns:cx2="http://schemas.microsoft.com/office/drawing/2015/10/21/chartex" xmlns:cx3="http://schemas.microsoft.com/office/drawing/2016/5/9/chartex" xmlns:cx4="http://schemas.microsoft.com/office/drawing/2016/5/10/chartex" xmlns:cx5="http://schemas.microsoft.com/office/drawing/2016/5/11/chartex" xmlns:cx6="http://schemas.microsoft.com/office/drawing/2016/5/12/chartex" xmlns:cx7="http://schemas.microsoft.com/office/drawing/2016/5/13/chartex" xmlns:cx8="http://schemas.microsoft.com/office/drawing/2016/5/14/chartex" xmlns:mc="http://schemas.openxmlformats.org/markup-compatibility/2006" xmlns:aink="http://schemas.microsoft.com/office/drawing/2016/ink" xmlns:am3d="http://schemas.microsoft.com/office/drawing/2017/model3d" xmlns:o="urn:schemas-microsoft-com:office:office" xmlns:oel="http://schemas.microsoft.com/office/2019/extlst" xmlns:r="http://schemas.openxmlformats.org/officeDocument/2006/relationships" xmlns:m="http://schemas.openxmlformats.org/officeDocument/2006/math" xmlns:v="urn:schemas-microsoft-com:vml" xmlns:wp14="http://schemas.microsoft.com/office/word/2010/wordprocessingDrawing" xmlns:wp="http://schemas.openxmlformats.org/drawingml/2006/wordprocessingDrawing" xmlns:w10="urn:schemas-microsoft-com:office:word" xmlns:w="http://schemas.openxmlformats.org/wordprocessingml/2006/main" xmlns:w14="http://schemas.microsoft.com/office/word/2010/wordml" xmlns:w15="http://schemas.microsoft.com/office/word/2012/wordml" xmlns:w16cei="http://schemas.microsoft.com/office/word/2026/wordml/cei" xmlns:w16cex="http://schemas.microsoft.com/office/word/2018/wordml/cex" xmlns:w16cid="http://schemas.microsoft.com/office/word/2016/wordml/cid" xmlns:w16="http://schemas.microsoft.com/office/word/2018/wordml" xmlns:w16du="http://schemas.microsoft.com/office/word/2023/wordml/word16du" xmlns:w16sdtdh="http://schemas.microsoft.com/office/word/2020/wordml/sdtdatahash" xmlns:w16sdtfl="http://schemas.microsoft.com/office/word/2024/wordml/sdtformatlock" xmlns:w16se="http://schemas.microsoft.com/office/word/2015/wordml/symex" xmlns:wpg="http://schemas.microsoft.com/office/word/2010/wordprocessingGroup" xmlns:wpi="http://schemas.microsoft.com/office/word/2010/wordprocessingInk" xmlns:wne="http://schemas.microsoft.com/office/word/2006/wordml" xmlns:wps="http://schemas.microsoft.com/office/word/2010/wordprocessingShape" mc:Ignorable="w14 w15 w16se w16cid w16 w16cex w16sdtdh w16sdtfl w16du wp14">
+<w:footnotes xmlns:wpc="http://schemas.microsoft.com/office/word/2010/wordprocessingCanvas" xmlns:cx="http://schemas.microsoft.com/office/drawing/2014/chartex" xmlns:cx1="http://schemas.microsoft.com/office/drawing/2015/9/8/chartex" xmlns:cx2="http://schemas.microsoft.com/office/drawing/2015/10/21/chartex" xmlns:cx3="http://schemas.microsoft.com/office/drawing/2016/5/9/chartex" xmlns:cx4="http://schemas.microsoft.com/office/drawing/2016/5/10/chartex" xmlns:cx5="http://schemas.microsoft.com/office/drawing/2016/5/11/chartex" xmlns:cx6="http://schemas.microsoft.com/office/drawing/2016/5/12/chartex" xmlns:cx7="http://schemas.microsoft.com/office/drawing/2016/5/13/chartex" xmlns:cx8="http://schemas.microsoft.com/office/drawing/2016/5/14/chartex" xmlns:mc="http://schemas.openxmlformats.org/markup-compatibility/2006" xmlns:aink="http://schemas.microsoft.com/office/drawing/2016/ink" xmlns:am3d="http://schemas.microsoft.com/office/drawing/2017/model3d" xmlns:o="urn:schemas-microsoft-com:office:office" xmlns:oel="http://schemas.microsoft.com/office/2019/extlst" xmlns:r="http://schemas.openxmlformats.org/officeDocument/2006/relationships" xmlns:m="http://schemas.openxmlformats.org/officeDocument/2006/math" xmlns:v="urn:schemas-microsoft-com:vml" xmlns:wp14="http://schemas.microsoft.com/office/word/2010/wordprocessingDrawing" xmlns:wp="http://schemas.openxmlformats.org/drawingml/2006/wordprocessingDrawing" xmlns:w10="urn:schemas-microsoft-com:office:word" xmlns:w="http://schemas.openxmlformats.org/wordprocessingml/2006/main" xmlns:w14="http://schemas.microsoft.com/office/word/2010/wordml" xmlns:w15="http://schemas.microsoft.com/office/word/2012/wordml" xmlns:w16cex="http://schemas.microsoft.com/office/word/2018/wordml/cex" xmlns:w16cid="http://schemas.microsoft.com/office/word/2016/wordml/cid" xmlns:w16="http://schemas.microsoft.com/office/word/2018/wordml" xmlns:w16du="http://schemas.microsoft.com/office/word/2023/wordml/word16du" xmlns:w16sdtdh="http://schemas.microsoft.com/office/word/2020/wordml/sdtdatahash" xmlns:w16sdtfl="http://schemas.microsoft.com/office/word/2024/wordml/sdtformatlock" xmlns:w16se="http://schemas.microsoft.com/office/word/2015/wordml/symex" xmlns:wpg="http://schemas.microsoft.com/office/word/2010/wordprocessingGroup" xmlns:wpi="http://schemas.microsoft.com/office/word/2010/wordprocessingInk" xmlns:wne="http://schemas.microsoft.com/office/word/2006/wordml" xmlns:wps="http://schemas.microsoft.com/office/word/2010/wordprocessingShape" mc:Ignorable="w14 w15 w16se w16cid w16 w16cex w16sdtdh w16sdtfl w16du wp14">
   <w:footnote w:type="separator" w:id="-1">
     <w:p>
       <w:pPr>
@@ -3169,7 +2407,7 @@
 </file>
 
 <file path=word/numbering.xml><?xml version="1.0" encoding="utf-8"?>
-<w:numbering xmlns:wpc="http://schemas.microsoft.com/office/word/2010/wordprocessingCanvas" xmlns:cx="http://schemas.microsoft.com/office/drawing/2014/chartex" xmlns:cx1="http://schemas.microsoft.com/office/drawing/2015/9/8/chartex" xmlns:cx2="http://schemas.microsoft.com/office/drawing/2015/10/21/chartex" xmlns:cx3="http://schemas.microsoft.com/office/drawing/2016/5/9/chartex" xmlns:cx4="http://schemas.microsoft.com/office/drawing/2016/5/10/chartex" xmlns:cx5="http://schemas.microsoft.com/office/drawing/2016/5/11/chartex" xmlns:cx6="http://schemas.microsoft.com/office/drawing/2016/5/12/chartex" xmlns:cx7="http://schemas.microsoft.com/office/drawing/2016/5/13/chartex" xmlns:cx8="http://schemas.microsoft.com/office/drawing/2016/5/14/chartex" xmlns:mc="http://schemas.openxmlformats.org/markup-compatibility/2006" xmlns:aink="http://schemas.microsoft.com/office/drawing/2016/ink" xmlns:am3d="http://schemas.microsoft.com/office/drawing/2017/model3d" xmlns:o="urn:schemas-microsoft-com:office:office" xmlns:oel="http://schemas.microsoft.com/office/2019/extlst" xmlns:r="http://schemas.openxmlformats.org/officeDocument/2006/relationships" xmlns:m="http://schemas.openxmlformats.org/officeDocument/2006/math" xmlns:v="urn:schemas-microsoft-com:vml" xmlns:wp14="http://schemas.microsoft.com/office/word/2010/wordprocessingDrawing" xmlns:wp="http://schemas.openxmlformats.org/drawingml/2006/wordprocessingDrawing" xmlns:w10="urn:schemas-microsoft-com:office:word" xmlns:w="http://schemas.openxmlformats.org/wordprocessingml/2006/main" xmlns:w14="http://schemas.microsoft.com/office/word/2010/wordml" xmlns:w15="http://schemas.microsoft.com/office/word/2012/wordml" xmlns:w16cei="http://schemas.microsoft.com/office/word/2026/wordml/cei" xmlns:w16cex="http://schemas.microsoft.com/office/word/2018/wordml/cex" xmlns:w16cid="http://schemas.microsoft.com/office/word/2016/wordml/cid" xmlns:w16="http://schemas.microsoft.com/office/word/2018/wordml" xmlns:w16du="http://schemas.microsoft.com/office/word/2023/wordml/word16du" xmlns:w16sdtdh="http://schemas.microsoft.com/office/word/2020/wordml/sdtdatahash" xmlns:w16sdtfl="http://schemas.microsoft.com/office/word/2024/wordml/sdtformatlock" xmlns:w16se="http://schemas.microsoft.com/office/word/2015/wordml/symex" xmlns:wpg="http://schemas.microsoft.com/office/word/2010/wordprocessingGroup" xmlns:wpi="http://schemas.microsoft.com/office/word/2010/wordprocessingInk" xmlns:wne="http://schemas.microsoft.com/office/word/2006/wordml" xmlns:wps="http://schemas.microsoft.com/office/word/2010/wordprocessingShape" mc:Ignorable="w14 w15 w16se w16cid w16 w16cex w16sdtdh w16sdtfl w16du wp14">
+<w:numbering xmlns:wpc="http://schemas.microsoft.com/office/word/2010/wordprocessingCanvas" xmlns:cx="http://schemas.microsoft.com/office/drawing/2014/chartex" xmlns:cx1="http://schemas.microsoft.com/office/drawing/2015/9/8/chartex" xmlns:cx2="http://schemas.microsoft.com/office/drawing/2015/10/21/chartex" xmlns:cx3="http://schemas.microsoft.com/office/drawing/2016/5/9/chartex" xmlns:cx4="http://schemas.microsoft.com/office/drawing/2016/5/10/chartex" xmlns:cx5="http://schemas.microsoft.com/office/drawing/2016/5/11/chartex" xmlns:cx6="http://schemas.microsoft.com/office/drawing/2016/5/12/chartex" xmlns:cx7="http://schemas.microsoft.com/office/drawing/2016/5/13/chartex" xmlns:cx8="http://schemas.microsoft.com/office/drawing/2016/5/14/chartex" xmlns:mc="http://schemas.openxmlformats.org/markup-compatibility/2006" xmlns:aink="http://schemas.microsoft.com/office/drawing/2016/ink" xmlns:am3d="http://schemas.microsoft.com/office/drawing/2017/model3d" xmlns:o="urn:schemas-microsoft-com:office:office" xmlns:oel="http://schemas.microsoft.com/office/2019/extlst" xmlns:r="http://schemas.openxmlformats.org/officeDocument/2006/relationships" xmlns:m="http://schemas.openxmlformats.org/officeDocument/2006/math" xmlns:v="urn:schemas-microsoft-com:vml" xmlns:wp14="http://schemas.microsoft.com/office/word/2010/wordprocessingDrawing" xmlns:wp="http://schemas.openxmlformats.org/drawingml/2006/wordprocessingDrawing" xmlns:w10="urn:schemas-microsoft-com:office:word" xmlns:w="http://schemas.openxmlformats.org/wordprocessingml/2006/main" xmlns:w14="http://schemas.microsoft.com/office/word/2010/wordml" xmlns:w15="http://schemas.microsoft.com/office/word/2012/wordml" xmlns:w16cex="http://schemas.microsoft.com/office/word/2018/wordml/cex" xmlns:w16cid="http://schemas.microsoft.com/office/word/2016/wordml/cid" xmlns:w16="http://schemas.microsoft.com/office/word/2018/wordml" xmlns:w16du="http://schemas.microsoft.com/office/word/2023/wordml/word16du" xmlns:w16sdtdh="http://schemas.microsoft.com/office/word/2020/wordml/sdtdatahash" xmlns:w16sdtfl="http://schemas.microsoft.com/office/word/2024/wordml/sdtformatlock" xmlns:w16se="http://schemas.microsoft.com/office/word/2015/wordml/symex" xmlns:wpg="http://schemas.microsoft.com/office/word/2010/wordprocessingGroup" xmlns:wpi="http://schemas.microsoft.com/office/word/2010/wordprocessingInk" xmlns:wne="http://schemas.microsoft.com/office/word/2006/wordml" xmlns:wps="http://schemas.microsoft.com/office/word/2010/wordprocessingShape" mc:Ignorable="w14 w15 w16se w16cid w16 w16cex w16sdtdh w16sdtfl w16du wp14">
   <w:abstractNum w:abstractNumId="0" w15:restartNumberingAfterBreak="0">
     <w:nsid w:val="FFFFFF7C"/>
     <w:multiLevelType w:val="singleLevel"/>

</xml_diff>

<commit_message>
Sprint#27_EHIS-809: Font and Font size is incorrect
</commit_message>
<xml_diff>
--- a/PHOCS-Docgentemplates/PHOCS Water Bacteriology Requisition Template_V0.2.docx
+++ b/PHOCS-Docgentemplates/PHOCS Water Bacteriology Requisition Template_V0.2.docx
@@ -118,7 +118,7 @@
                 <w:sz w:val="26"/>
                 <w:szCs w:val="26"/>
               </w:rPr>
-              <w:t>Requisition #:</w:t>
+              <w:t>Requisition</w:t>
             </w:r>
             <w:r>
               <w:rPr>
@@ -128,18 +128,52 @@
                 <w:sz w:val="26"/>
                 <w:szCs w:val="26"/>
               </w:rPr>
+              <w:t xml:space="preserve"> #:</w:t>
+            </w:r>
+            <w:r>
+              <w:rPr>
+                <w:b/>
+                <w:bCs/>
+                <w:color w:val="000000" w:themeColor="text1"/>
+                <w:sz w:val="26"/>
+                <w:szCs w:val="26"/>
+              </w:rPr>
               <w:t xml:space="preserve"> </w:t>
             </w:r>
             <w:r>
               <w:rPr>
-                <w:rFonts w:asciiTheme="minorHAnsi" w:eastAsiaTheme="minorHAnsi" w:hAnsiTheme="minorHAnsi"/>
+                <w:rFonts w:eastAsiaTheme="minorHAnsi"/>
                 <w:kern w:val="2"/>
-                <w:sz w:val="20"/>
-                <w:szCs w:val="20"/>
+                <w:sz w:val="26"/>
+                <w:szCs w:val="26"/>
                 <w:lang w:val="en-CA"/>
                 <w14:ligatures w14:val="standardContextual"/>
               </w:rPr>
-              <w:t>{{LabTestRequisitionNumber}}</w:t>
+              <w:t>{{</w:t>
+            </w:r>
+            <w:proofErr w:type="spellStart"/>
+            <w:r>
+              <w:rPr>
+                <w:rFonts w:eastAsiaTheme="minorHAnsi"/>
+                <w:kern w:val="2"/>
+                <w:sz w:val="26"/>
+                <w:szCs w:val="26"/>
+                <w:lang w:val="en-CA"/>
+                <w14:ligatures w14:val="standardContextual"/>
+              </w:rPr>
+              <w:t>LabTestRequisitionNumber</w:t>
+            </w:r>
+            <w:proofErr w:type="spellEnd"/>
+            <w:r>
+              <w:rPr>
+                <w:rFonts w:eastAsiaTheme="minorHAnsi"/>
+                <w:kern w:val="2"/>
+                <w:sz w:val="26"/>
+                <w:szCs w:val="26"/>
+                <w:lang w:val="en-CA"/>
+                <w14:ligatures w14:val="standardContextual"/>
+              </w:rPr>
+              <w:t>}}</w:t>
             </w:r>
           </w:p>
         </w:tc>
@@ -216,8 +250,8 @@
               <w:rPr>
                 <w:b/>
                 <w:color w:val="000000"/>
-                <w:sz w:val="28"/>
-                <w:szCs w:val="28"/>
+                <w:sz w:val="26"/>
+                <w:szCs w:val="26"/>
               </w:rPr>
               <w:t xml:space="preserve">Section 1 - Sample </w:t>
             </w:r>
@@ -225,8 +259,8 @@
               <w:rPr>
                 <w:b/>
                 <w:color w:val="000000"/>
-                <w:sz w:val="28"/>
-                <w:szCs w:val="28"/>
+                <w:sz w:val="26"/>
+                <w:szCs w:val="26"/>
               </w:rPr>
               <w:t xml:space="preserve">Contact </w:t>
             </w:r>
@@ -234,8 +268,8 @@
               <w:rPr>
                 <w:b/>
                 <w:color w:val="000000"/>
-                <w:sz w:val="28"/>
-                <w:szCs w:val="28"/>
+                <w:sz w:val="26"/>
+                <w:szCs w:val="26"/>
               </w:rPr>
               <w:t>Information</w:t>
             </w:r>
@@ -380,26 +414,59 @@
                 <w:sz w:val="22"/>
                 <w:szCs w:val="20"/>
               </w:rPr>
-              <w:t xml:space="preserve">Name: </w:t>
-            </w:r>
+              <w:t>Name</w:t>
+            </w:r>
+            <w:proofErr w:type="gramStart"/>
             <w:r>
               <w:rPr>
                 <w:b/>
                 <w:sz w:val="22"/>
                 <w:szCs w:val="20"/>
               </w:rPr>
+              <w:t xml:space="preserve">: </w:t>
+            </w:r>
+            <w:r>
+              <w:rPr>
+                <w:b/>
+                <w:sz w:val="22"/>
+                <w:szCs w:val="20"/>
+              </w:rPr>
               <w:t xml:space="preserve"> </w:t>
             </w:r>
             <w:r>
               <w:rPr>
-                <w:rFonts w:asciiTheme="minorHAnsi" w:eastAsiaTheme="minorHAnsi" w:hAnsiTheme="minorHAnsi"/>
-                <w:kern w:val="2"/>
-                <w:sz w:val="20"/>
-                <w:szCs w:val="20"/>
-                <w:lang w:val="en-CA"/>
-                <w14:ligatures w14:val="standardContextual"/>
-              </w:rPr>
-              <w:t>{{DWOEHOName}}</w:t>
+                <w:bCs/>
+                <w:color w:val="000000"/>
+                <w:sz w:val="22"/>
+              </w:rPr>
+              <w:t>{</w:t>
+            </w:r>
+            <w:proofErr w:type="gramEnd"/>
+            <w:r>
+              <w:rPr>
+                <w:bCs/>
+                <w:color w:val="000000"/>
+                <w:sz w:val="22"/>
+              </w:rPr>
+              <w:t>{</w:t>
+            </w:r>
+            <w:proofErr w:type="spellStart"/>
+            <w:r>
+              <w:rPr>
+                <w:bCs/>
+                <w:color w:val="000000"/>
+                <w:sz w:val="22"/>
+              </w:rPr>
+              <w:t>DWOEHOName</w:t>
+            </w:r>
+            <w:proofErr w:type="spellEnd"/>
+            <w:r>
+              <w:rPr>
+                <w:bCs/>
+                <w:color w:val="000000"/>
+                <w:sz w:val="22"/>
+              </w:rPr>
+              <w:t>}}</w:t>
             </w:r>
           </w:p>
         </w:tc>
@@ -447,14 +514,29 @@
             </w:r>
             <w:r>
               <w:rPr>
-                <w:rFonts w:asciiTheme="minorHAnsi" w:eastAsiaTheme="minorHAnsi" w:hAnsiTheme="minorHAnsi"/>
-                <w:kern w:val="2"/>
-                <w:sz w:val="20"/>
-                <w:szCs w:val="20"/>
-                <w:lang w:val="en-CA"/>
-                <w14:ligatures w14:val="standardContextual"/>
-              </w:rPr>
-              <w:t>{{MHOName}}</w:t>
+                <w:bCs/>
+                <w:color w:val="000000"/>
+                <w:sz w:val="22"/>
+              </w:rPr>
+              <w:t>{{</w:t>
+            </w:r>
+            <w:proofErr w:type="spellStart"/>
+            <w:r>
+              <w:rPr>
+                <w:bCs/>
+                <w:color w:val="000000"/>
+                <w:sz w:val="22"/>
+              </w:rPr>
+              <w:t>MHOName</w:t>
+            </w:r>
+            <w:proofErr w:type="spellEnd"/>
+            <w:r>
+              <w:rPr>
+                <w:bCs/>
+                <w:color w:val="000000"/>
+                <w:sz w:val="22"/>
+              </w:rPr>
+              <w:t>}}</w:t>
             </w:r>
           </w:p>
         </w:tc>
@@ -489,26 +571,41 @@
                 <w:sz w:val="22"/>
                 <w:szCs w:val="20"/>
               </w:rPr>
-              <w:t xml:space="preserve">Name: </w:t>
-            </w:r>
+              <w:t>Name</w:t>
+            </w:r>
+            <w:proofErr w:type="gramStart"/>
             <w:r>
               <w:rPr>
                 <w:b/>
                 <w:sz w:val="22"/>
                 <w:szCs w:val="20"/>
               </w:rPr>
+              <w:t xml:space="preserve">: </w:t>
+            </w:r>
+            <w:r>
+              <w:rPr>
+                <w:b/>
+                <w:sz w:val="22"/>
+                <w:szCs w:val="20"/>
+              </w:rPr>
               <w:t xml:space="preserve"> </w:t>
             </w:r>
             <w:r>
               <w:rPr>
-                <w:rFonts w:asciiTheme="minorHAnsi" w:eastAsiaTheme="minorHAnsi" w:hAnsiTheme="minorHAnsi"/>
-                <w:kern w:val="2"/>
-                <w:sz w:val="20"/>
-                <w:szCs w:val="20"/>
-                <w:lang w:val="en-CA"/>
-                <w14:ligatures w14:val="standardContextual"/>
-              </w:rPr>
-              <w:t>{{WaterSupplierName}}</w:t>
+                <w:bCs/>
+                <w:color w:val="000000"/>
+                <w:sz w:val="22"/>
+              </w:rPr>
+              <w:t>{</w:t>
+            </w:r>
+            <w:proofErr w:type="gramEnd"/>
+            <w:r>
+              <w:rPr>
+                <w:bCs/>
+                <w:color w:val="000000"/>
+                <w:sz w:val="22"/>
+              </w:rPr>
+              <w:t>{WaterSupplierName}}</w:t>
             </w:r>
           </w:p>
         </w:tc>
@@ -542,6 +639,7 @@
                 <w:szCs w:val="20"/>
               </w:rPr>
             </w:pPr>
+            <w:proofErr w:type="gramStart"/>
             <w:r>
               <w:rPr>
                 <w:b/>
@@ -552,14 +650,30 @@
             </w:r>
             <w:r>
               <w:rPr>
-                <w:rFonts w:asciiTheme="minorHAnsi" w:eastAsiaTheme="minorHAnsi" w:hAnsiTheme="minorHAnsi"/>
-                <w:kern w:val="2"/>
-                <w:sz w:val="20"/>
-                <w:szCs w:val="20"/>
-                <w:lang w:val="en-CA"/>
-                <w14:ligatures w14:val="standardContextual"/>
-              </w:rPr>
-              <w:t>{{DWOEHOPhoneNumber}}</w:t>
+                <w:bCs/>
+                <w:color w:val="000000"/>
+                <w:sz w:val="22"/>
+              </w:rPr>
+              <w:t>{{</w:t>
+            </w:r>
+            <w:proofErr w:type="spellStart"/>
+            <w:proofErr w:type="gramEnd"/>
+            <w:r>
+              <w:rPr>
+                <w:bCs/>
+                <w:color w:val="000000"/>
+                <w:sz w:val="22"/>
+              </w:rPr>
+              <w:t>DWOEHOPhoneNumber</w:t>
+            </w:r>
+            <w:proofErr w:type="spellEnd"/>
+            <w:r>
+              <w:rPr>
+                <w:bCs/>
+                <w:color w:val="000000"/>
+                <w:sz w:val="22"/>
+              </w:rPr>
+              <w:t>}}</w:t>
             </w:r>
           </w:p>
         </w:tc>
@@ -594,26 +708,59 @@
                 <w:sz w:val="22"/>
                 <w:szCs w:val="20"/>
               </w:rPr>
-              <w:t xml:space="preserve">Phone: </w:t>
-            </w:r>
+              <w:t>Phone</w:t>
+            </w:r>
+            <w:proofErr w:type="gramStart"/>
             <w:r>
               <w:rPr>
                 <w:b/>
                 <w:sz w:val="22"/>
                 <w:szCs w:val="20"/>
               </w:rPr>
+              <w:t xml:space="preserve">: </w:t>
+            </w:r>
+            <w:r>
+              <w:rPr>
+                <w:b/>
+                <w:sz w:val="22"/>
+                <w:szCs w:val="20"/>
+              </w:rPr>
               <w:t xml:space="preserve"> </w:t>
             </w:r>
             <w:r>
               <w:rPr>
-                <w:rFonts w:asciiTheme="minorHAnsi" w:eastAsiaTheme="minorHAnsi" w:hAnsiTheme="minorHAnsi"/>
-                <w:kern w:val="2"/>
-                <w:sz w:val="20"/>
-                <w:szCs w:val="20"/>
-                <w:lang w:val="en-CA"/>
-                <w14:ligatures w14:val="standardContextual"/>
-              </w:rPr>
-              <w:t>{{MHOPhoneNumber}}</w:t>
+                <w:bCs/>
+                <w:color w:val="000000"/>
+                <w:sz w:val="22"/>
+              </w:rPr>
+              <w:t>{</w:t>
+            </w:r>
+            <w:proofErr w:type="gramEnd"/>
+            <w:r>
+              <w:rPr>
+                <w:bCs/>
+                <w:color w:val="000000"/>
+                <w:sz w:val="22"/>
+              </w:rPr>
+              <w:t>{</w:t>
+            </w:r>
+            <w:proofErr w:type="spellStart"/>
+            <w:r>
+              <w:rPr>
+                <w:bCs/>
+                <w:color w:val="000000"/>
+                <w:sz w:val="22"/>
+              </w:rPr>
+              <w:t>MHOPhoneNumber</w:t>
+            </w:r>
+            <w:proofErr w:type="spellEnd"/>
+            <w:r>
+              <w:rPr>
+                <w:bCs/>
+                <w:color w:val="000000"/>
+                <w:sz w:val="22"/>
+              </w:rPr>
+              <w:t>}}</w:t>
             </w:r>
           </w:p>
         </w:tc>
@@ -642,6 +789,7 @@
                 <w:szCs w:val="20"/>
               </w:rPr>
             </w:pPr>
+            <w:proofErr w:type="gramStart"/>
             <w:r>
               <w:rPr>
                 <w:b/>
@@ -652,14 +800,30 @@
             </w:r>
             <w:r>
               <w:rPr>
-                <w:rFonts w:asciiTheme="minorHAnsi" w:eastAsiaTheme="minorHAnsi" w:hAnsiTheme="minorHAnsi"/>
-                <w:kern w:val="2"/>
-                <w:sz w:val="20"/>
-                <w:szCs w:val="20"/>
-                <w:lang w:val="en-CA"/>
-                <w14:ligatures w14:val="standardContextual"/>
-              </w:rPr>
-              <w:t>{{WaterSupplierPhone}}</w:t>
+                <w:bCs/>
+                <w:color w:val="000000"/>
+                <w:sz w:val="22"/>
+              </w:rPr>
+              <w:t>{{</w:t>
+            </w:r>
+            <w:proofErr w:type="spellStart"/>
+            <w:proofErr w:type="gramEnd"/>
+            <w:r>
+              <w:rPr>
+                <w:bCs/>
+                <w:color w:val="000000"/>
+                <w:sz w:val="22"/>
+              </w:rPr>
+              <w:t>WaterSupplierPhone</w:t>
+            </w:r>
+            <w:proofErr w:type="spellEnd"/>
+            <w:r>
+              <w:rPr>
+                <w:bCs/>
+                <w:color w:val="000000"/>
+                <w:sz w:val="22"/>
+              </w:rPr>
+              <w:t>}}</w:t>
             </w:r>
           </w:p>
         </w:tc>
@@ -693,6 +857,7 @@
                 <w14:ligatures w14:val="standardContextual"/>
               </w:rPr>
             </w:pPr>
+            <w:proofErr w:type="gramStart"/>
             <w:r>
               <w:rPr>
                 <w:b/>
@@ -703,14 +868,30 @@
             </w:r>
             <w:r>
               <w:rPr>
-                <w:rFonts w:asciiTheme="minorHAnsi" w:eastAsiaTheme="minorHAnsi" w:hAnsiTheme="minorHAnsi"/>
-                <w:kern w:val="2"/>
-                <w:sz w:val="20"/>
-                <w:szCs w:val="20"/>
-                <w:lang w:val="en-CA"/>
-                <w14:ligatures w14:val="standardContextual"/>
-              </w:rPr>
-              <w:t>{{DWOEHOEmail}}</w:t>
+                <w:bCs/>
+                <w:color w:val="000000"/>
+                <w:sz w:val="22"/>
+              </w:rPr>
+              <w:t>{{</w:t>
+            </w:r>
+            <w:proofErr w:type="spellStart"/>
+            <w:proofErr w:type="gramEnd"/>
+            <w:r>
+              <w:rPr>
+                <w:bCs/>
+                <w:color w:val="000000"/>
+                <w:sz w:val="22"/>
+              </w:rPr>
+              <w:t>DWOEHOEmail</w:t>
+            </w:r>
+            <w:proofErr w:type="spellEnd"/>
+            <w:r>
+              <w:rPr>
+                <w:bCs/>
+                <w:color w:val="000000"/>
+                <w:sz w:val="22"/>
+              </w:rPr>
+              <w:t>}}</w:t>
             </w:r>
           </w:p>
         </w:tc>
@@ -740,6 +921,7 @@
                 <w:szCs w:val="20"/>
               </w:rPr>
             </w:pPr>
+            <w:proofErr w:type="gramStart"/>
             <w:r>
               <w:rPr>
                 <w:b/>
@@ -750,14 +932,30 @@
             </w:r>
             <w:r>
               <w:rPr>
-                <w:rFonts w:asciiTheme="minorHAnsi" w:eastAsiaTheme="minorHAnsi" w:hAnsiTheme="minorHAnsi"/>
-                <w:kern w:val="2"/>
-                <w:sz w:val="20"/>
-                <w:szCs w:val="20"/>
-                <w:lang w:val="en-CA"/>
-                <w14:ligatures w14:val="standardContextual"/>
-              </w:rPr>
-              <w:t>{{MHOEmail}}</w:t>
+                <w:bCs/>
+                <w:color w:val="000000"/>
+                <w:sz w:val="22"/>
+              </w:rPr>
+              <w:t>{{</w:t>
+            </w:r>
+            <w:proofErr w:type="spellStart"/>
+            <w:proofErr w:type="gramEnd"/>
+            <w:r>
+              <w:rPr>
+                <w:bCs/>
+                <w:color w:val="000000"/>
+                <w:sz w:val="22"/>
+              </w:rPr>
+              <w:t>MHOEmail</w:t>
+            </w:r>
+            <w:proofErr w:type="spellEnd"/>
+            <w:r>
+              <w:rPr>
+                <w:bCs/>
+                <w:color w:val="000000"/>
+                <w:sz w:val="22"/>
+              </w:rPr>
+              <w:t>}}</w:t>
             </w:r>
           </w:p>
         </w:tc>
@@ -787,6 +985,7 @@
                 <w:szCs w:val="20"/>
               </w:rPr>
             </w:pPr>
+            <w:proofErr w:type="gramStart"/>
             <w:r>
               <w:rPr>
                 <w:b/>
@@ -797,14 +996,30 @@
             </w:r>
             <w:r>
               <w:rPr>
-                <w:rFonts w:asciiTheme="minorHAnsi" w:eastAsiaTheme="minorHAnsi" w:hAnsiTheme="minorHAnsi"/>
-                <w:kern w:val="2"/>
-                <w:sz w:val="20"/>
-                <w:szCs w:val="20"/>
-                <w:lang w:val="en-CA"/>
-                <w14:ligatures w14:val="standardContextual"/>
-              </w:rPr>
-              <w:t>{{WaterSupplierEmail}}</w:t>
+                <w:bCs/>
+                <w:color w:val="000000"/>
+                <w:sz w:val="22"/>
+              </w:rPr>
+              <w:t>{{</w:t>
+            </w:r>
+            <w:proofErr w:type="spellStart"/>
+            <w:proofErr w:type="gramEnd"/>
+            <w:r>
+              <w:rPr>
+                <w:bCs/>
+                <w:color w:val="000000"/>
+                <w:sz w:val="22"/>
+              </w:rPr>
+              <w:t>WaterSupplierEmail</w:t>
+            </w:r>
+            <w:proofErr w:type="spellEnd"/>
+            <w:r>
+              <w:rPr>
+                <w:bCs/>
+                <w:color w:val="000000"/>
+                <w:sz w:val="22"/>
+              </w:rPr>
+              <w:t>}}</w:t>
             </w:r>
           </w:p>
         </w:tc>
@@ -844,8 +1059,8 @@
               <w:rPr>
                 <w:b/>
                 <w:color w:val="000000"/>
-                <w:sz w:val="28"/>
-                <w:szCs w:val="28"/>
+                <w:sz w:val="26"/>
+                <w:szCs w:val="26"/>
               </w:rPr>
               <w:t>Section 2 - Sample / Site Details</w:t>
             </w:r>
@@ -890,33 +1105,75 @@
                 <w:bCs/>
                 <w:sz w:val="22"/>
               </w:rPr>
-              <w:t xml:space="preserve">Sampler Name: </w:t>
-            </w:r>
+              <w:t>Sampler Name</w:t>
+            </w:r>
+            <w:proofErr w:type="gramStart"/>
             <w:r>
               <w:rPr>
                 <w:b/>
                 <w:bCs/>
                 <w:sz w:val="22"/>
               </w:rPr>
+              <w:t xml:space="preserve">: </w:t>
+            </w:r>
+            <w:r>
+              <w:rPr>
+                <w:b/>
+                <w:bCs/>
+                <w:sz w:val="22"/>
+              </w:rPr>
               <w:t xml:space="preserve"> </w:t>
             </w:r>
             <w:r>
               <w:rPr>
-                <w:rFonts w:asciiTheme="minorHAnsi" w:eastAsiaTheme="minorHAnsi" w:hAnsiTheme="minorHAnsi"/>
-                <w:kern w:val="2"/>
-                <w:sz w:val="20"/>
-                <w:szCs w:val="20"/>
-                <w:lang w:val="en-CA"/>
-                <w14:ligatures w14:val="standardContextual"/>
-              </w:rPr>
-              <w:t>{{SamplerName}}</w:t>
+                <w:bCs/>
+                <w:color w:val="000000"/>
+                <w:sz w:val="22"/>
+              </w:rPr>
+              <w:t>{</w:t>
+            </w:r>
+            <w:proofErr w:type="gramEnd"/>
+            <w:r>
+              <w:rPr>
+                <w:bCs/>
+                <w:color w:val="000000"/>
+                <w:sz w:val="22"/>
+              </w:rPr>
+              <w:t>{</w:t>
+            </w:r>
+            <w:proofErr w:type="spellStart"/>
+            <w:r>
+              <w:rPr>
+                <w:bCs/>
+                <w:color w:val="000000"/>
+                <w:sz w:val="22"/>
+              </w:rPr>
+              <w:t>SamplerName</w:t>
+            </w:r>
+            <w:proofErr w:type="spellEnd"/>
+            <w:proofErr w:type="gramStart"/>
+            <w:r>
+              <w:rPr>
+                <w:bCs/>
+                <w:color w:val="000000"/>
+                <w:sz w:val="22"/>
+              </w:rPr>
+              <w:t>}}</w:t>
             </w:r>
             <w:r>
               <w:rPr>
                 <w:color w:val="FF0000"/>
                 <w:sz w:val="22"/>
               </w:rPr>
-              <w:t xml:space="preserve">               </w:t>
+              <w:t xml:space="preserve">   </w:t>
+            </w:r>
+            <w:proofErr w:type="gramEnd"/>
+            <w:r>
+              <w:rPr>
+                <w:color w:val="FF0000"/>
+                <w:sz w:val="22"/>
+              </w:rPr>
+              <w:t xml:space="preserve">            </w:t>
             </w:r>
             <w:r>
               <w:rPr>
@@ -966,14 +1223,37 @@
             </w:r>
             <w:r>
               <w:rPr>
-                <w:rFonts w:asciiTheme="minorHAnsi" w:eastAsiaTheme="minorHAnsi" w:hAnsiTheme="minorHAnsi"/>
-                <w:kern w:val="2"/>
-                <w:sz w:val="20"/>
-                <w:szCs w:val="20"/>
-                <w:lang w:val="en-CA"/>
-                <w14:ligatures w14:val="standardContextual"/>
-              </w:rPr>
-              <w:t>{{CollectionDateTime}}</w:t>
+                <w:bCs/>
+                <w:color w:val="000000"/>
+                <w:sz w:val="22"/>
+              </w:rPr>
+              <w:t>{</w:t>
+            </w:r>
+            <w:r>
+              <w:rPr>
+                <w:bCs/>
+                <w:color w:val="000000"/>
+                <w:sz w:val="22"/>
+              </w:rPr>
+              <w:t>{</w:t>
+            </w:r>
+            <w:proofErr w:type="spellStart"/>
+            <w:r>
+              <w:rPr>
+                <w:bCs/>
+                <w:color w:val="000000"/>
+                <w:sz w:val="22"/>
+              </w:rPr>
+              <w:t>CollectionDateTime</w:t>
+            </w:r>
+            <w:proofErr w:type="spellEnd"/>
+            <w:r>
+              <w:rPr>
+                <w:bCs/>
+                <w:color w:val="000000"/>
+                <w:sz w:val="22"/>
+              </w:rPr>
+              <w:t>}}</w:t>
             </w:r>
           </w:p>
         </w:tc>
@@ -1016,8 +1296,9 @@
                 <w:sz w:val="22"/>
                 <w:szCs w:val="20"/>
               </w:rPr>
-              <w:t>System Nam</w:t>
-            </w:r>
+              <w:t xml:space="preserve">System </w:t>
+            </w:r>
+            <w:proofErr w:type="gramStart"/>
             <w:r>
               <w:rPr>
                 <w:b/>
@@ -1025,18 +1306,43 @@
                 <w:sz w:val="22"/>
                 <w:szCs w:val="20"/>
               </w:rPr>
+              <w:t>Nam</w:t>
+            </w:r>
+            <w:r>
+              <w:rPr>
+                <w:b/>
+                <w:bCs/>
+                <w:sz w:val="22"/>
+                <w:szCs w:val="20"/>
+              </w:rPr>
               <w:t xml:space="preserve">e: </w:t>
             </w:r>
             <w:r>
               <w:rPr>
-                <w:rFonts w:asciiTheme="minorHAnsi" w:eastAsiaTheme="minorHAnsi" w:hAnsiTheme="minorHAnsi"/>
-                <w:kern w:val="2"/>
-                <w:sz w:val="20"/>
-                <w:szCs w:val="20"/>
-                <w:lang w:val="en-CA"/>
-                <w14:ligatures w14:val="standardContextual"/>
-              </w:rPr>
-              <w:t>{{FacilityName}}</w:t>
+                <w:bCs/>
+                <w:color w:val="000000"/>
+                <w:sz w:val="22"/>
+              </w:rPr>
+              <w:t>{{</w:t>
+            </w:r>
+            <w:proofErr w:type="spellStart"/>
+            <w:proofErr w:type="gramEnd"/>
+            <w:r>
+              <w:rPr>
+                <w:bCs/>
+                <w:color w:val="000000"/>
+                <w:sz w:val="22"/>
+              </w:rPr>
+              <w:t>FacilityName</w:t>
+            </w:r>
+            <w:proofErr w:type="spellEnd"/>
+            <w:r>
+              <w:rPr>
+                <w:bCs/>
+                <w:color w:val="000000"/>
+                <w:sz w:val="22"/>
+              </w:rPr>
+              <w:t>}}</w:t>
             </w:r>
           </w:p>
         </w:tc>
@@ -1074,18 +1380,43 @@
                 <w:sz w:val="22"/>
                 <w:szCs w:val="20"/>
               </w:rPr>
-              <w:t>ystem Type:</w:t>
-            </w:r>
-            <w:r>
-              <w:rPr>
-                <w:rFonts w:asciiTheme="minorHAnsi" w:eastAsiaTheme="minorHAnsi" w:hAnsiTheme="minorHAnsi"/>
-                <w:kern w:val="2"/>
-                <w:sz w:val="20"/>
+              <w:t xml:space="preserve">ystem </w:t>
+            </w:r>
+            <w:proofErr w:type="gramStart"/>
+            <w:r>
+              <w:rPr>
+                <w:b/>
+                <w:sz w:val="22"/>
                 <w:szCs w:val="20"/>
-                <w:lang w:val="en-CA"/>
-                <w14:ligatures w14:val="standardContextual"/>
-              </w:rPr>
-              <w:t xml:space="preserve"> {{SystemType}}</w:t>
+              </w:rPr>
+              <w:t>Type</w:t>
+            </w:r>
+            <w:r>
+              <w:rPr>
+                <w:bCs/>
+                <w:color w:val="000000"/>
+                <w:sz w:val="22"/>
+              </w:rPr>
+              <w:t>: {{</w:t>
+            </w:r>
+            <w:proofErr w:type="spellStart"/>
+            <w:proofErr w:type="gramEnd"/>
+            <w:r>
+              <w:rPr>
+                <w:bCs/>
+                <w:color w:val="000000"/>
+                <w:sz w:val="22"/>
+              </w:rPr>
+              <w:t>SystemType</w:t>
+            </w:r>
+            <w:proofErr w:type="spellEnd"/>
+            <w:r>
+              <w:rPr>
+                <w:bCs/>
+                <w:color w:val="000000"/>
+                <w:sz w:val="22"/>
+              </w:rPr>
+              <w:t>}}</w:t>
             </w:r>
           </w:p>
         </w:tc>
@@ -1103,95 +1434,72 @@
             <w:pPr>
               <w:spacing w:after="0" w:line="240" w:lineRule="auto"/>
               <w:rPr>
+                <w:bCs/>
+                <w:color w:val="000000"/>
+                <w:sz w:val="22"/>
+              </w:rPr>
+            </w:pPr>
+            <w:proofErr w:type="gramStart"/>
+            <w:r>
+              <w:rPr>
                 <w:b/>
                 <w:bCs/>
                 <w:sz w:val="22"/>
               </w:rPr>
-            </w:pPr>
-            <w:r>
-              <w:rPr>
-                <w:b/>
+              <w:t>Population</w:t>
+            </w:r>
+            <w:r>
+              <w:rPr>
                 <w:bCs/>
-                <w:sz w:val="22"/>
-              </w:rPr>
-              <w:t>Population:</w:t>
-            </w:r>
-            <w:r>
-              <w:rPr>
-                <w:rFonts w:asciiTheme="minorHAnsi" w:eastAsiaTheme="minorHAnsi" w:hAnsiTheme="minorHAnsi"/>
-                <w:kern w:val="2"/>
-                <w:sz w:val="20"/>
-                <w:szCs w:val="20"/>
-                <w:lang w:val="en-CA"/>
-                <w14:ligatures w14:val="standardContextual"/>
-              </w:rPr>
-              <w:t>{{</w:t>
-            </w:r>
-            <w:r>
-              <w:rPr>
-                <w:rFonts w:asciiTheme="minorHAnsi" w:eastAsiaTheme="minorHAnsi" w:hAnsiTheme="minorHAnsi"/>
-                <w:kern w:val="2"/>
-                <w:sz w:val="20"/>
-                <w:szCs w:val="20"/>
-                <w:lang w:val="en-CA"/>
-                <w14:ligatures w14:val="standardContextual"/>
-              </w:rPr>
-              <w:t>#IF_IsDrinkingWaterSystem</w:t>
-            </w:r>
-            <w:r>
-              <w:rPr>
-                <w:rFonts w:asciiTheme="minorHAnsi" w:eastAsiaTheme="minorHAnsi" w:hAnsiTheme="minorHAnsi"/>
-                <w:kern w:val="2"/>
-                <w:sz w:val="20"/>
-                <w:szCs w:val="20"/>
-                <w:lang w:val="en-CA"/>
-                <w14:ligatures w14:val="standardContextual"/>
-              </w:rPr>
-              <w:t>}}{{</w:t>
-            </w:r>
-            <w:r>
-              <w:rPr>
-                <w:rFonts w:asciiTheme="minorHAnsi" w:eastAsiaTheme="minorHAnsi" w:hAnsiTheme="minorHAnsi"/>
-                <w:kern w:val="2"/>
-                <w:sz w:val="20"/>
-                <w:szCs w:val="20"/>
-                <w:lang w:val="en-CA"/>
-                <w14:ligatures w14:val="standardContextual"/>
-              </w:rPr>
-              <w:t>FacilityPopulationServedper24hrs</w:t>
-            </w:r>
-            <w:r>
-              <w:rPr>
-                <w:rFonts w:asciiTheme="minorHAnsi" w:eastAsiaTheme="minorHAnsi" w:hAnsiTheme="minorHAnsi"/>
-                <w:kern w:val="2"/>
-                <w:sz w:val="20"/>
-                <w:szCs w:val="20"/>
-                <w:lang w:val="en-CA"/>
-                <w14:ligatures w14:val="standardContextual"/>
-              </w:rPr>
-              <w:t>}}{{</w:t>
-            </w:r>
-            <w:r>
-              <w:rPr>
-                <w:rFonts w:asciiTheme="minorHAnsi" w:eastAsiaTheme="minorHAnsi" w:hAnsiTheme="minorHAnsi"/>
-                <w:kern w:val="2"/>
-                <w:sz w:val="20"/>
-                <w:szCs w:val="20"/>
-                <w:lang w:val="en-CA"/>
-                <w14:ligatures w14:val="standardContextual"/>
-              </w:rPr>
-              <w:t>/IF_IsDrinkingWaterSystem</w:t>
-            </w:r>
-            <w:r>
-              <w:rPr>
-                <w:rFonts w:asciiTheme="minorHAnsi" w:eastAsiaTheme="minorHAnsi" w:hAnsiTheme="minorHAnsi"/>
-                <w:kern w:val="2"/>
-                <w:sz w:val="20"/>
-                <w:szCs w:val="20"/>
-                <w:lang w:val="en-CA"/>
-                <w14:ligatures w14:val="standardContextual"/>
-              </w:rPr>
-              <w:t>}}</w:t>
+                <w:color w:val="000000"/>
+                <w:sz w:val="22"/>
+              </w:rPr>
+              <w:t>:{</w:t>
+            </w:r>
+            <w:proofErr w:type="gramEnd"/>
+            <w:r>
+              <w:rPr>
+                <w:bCs/>
+                <w:color w:val="000000"/>
+                <w:sz w:val="22"/>
+              </w:rPr>
+              <w:t>{#IF_IsDrinkingWaterSystem</w:t>
+            </w:r>
+            <w:proofErr w:type="gramStart"/>
+            <w:r>
+              <w:rPr>
+                <w:bCs/>
+                <w:color w:val="000000"/>
+                <w:sz w:val="22"/>
+              </w:rPr>
+              <w:t>}}{</w:t>
+            </w:r>
+            <w:proofErr w:type="gramEnd"/>
+            <w:r>
+              <w:rPr>
+                <w:bCs/>
+                <w:color w:val="000000"/>
+                <w:sz w:val="22"/>
+              </w:rPr>
+              <w:t>{FacilityPopulationServedper24hrs</w:t>
+            </w:r>
+            <w:proofErr w:type="gramStart"/>
+            <w:r>
+              <w:rPr>
+                <w:bCs/>
+                <w:color w:val="000000"/>
+                <w:sz w:val="22"/>
+              </w:rPr>
+              <w:t>}}{</w:t>
+            </w:r>
+            <w:proofErr w:type="gramEnd"/>
+            <w:r>
+              <w:rPr>
+                <w:bCs/>
+                <w:color w:val="000000"/>
+                <w:sz w:val="22"/>
+              </w:rPr>
+              <w:t>{/IF_IsDrinkingWaterSystem}}</w:t>
             </w:r>
           </w:p>
           <w:p>
@@ -1244,26 +1552,59 @@
                 <w:sz w:val="22"/>
                 <w:szCs w:val="20"/>
               </w:rPr>
-              <w:t xml:space="preserve">Site Name: </w:t>
-            </w:r>
+              <w:t>Site Name</w:t>
+            </w:r>
+            <w:proofErr w:type="gramStart"/>
             <w:r>
               <w:rPr>
                 <w:b/>
                 <w:sz w:val="22"/>
                 <w:szCs w:val="20"/>
               </w:rPr>
+              <w:t xml:space="preserve">: </w:t>
+            </w:r>
+            <w:r>
+              <w:rPr>
+                <w:b/>
+                <w:sz w:val="22"/>
+                <w:szCs w:val="20"/>
+              </w:rPr>
               <w:t xml:space="preserve"> </w:t>
             </w:r>
             <w:r>
               <w:rPr>
-                <w:rFonts w:asciiTheme="minorHAnsi" w:eastAsiaTheme="minorHAnsi" w:hAnsiTheme="minorHAnsi"/>
-                <w:kern w:val="2"/>
-                <w:sz w:val="20"/>
-                <w:szCs w:val="20"/>
-                <w:lang w:val="en-CA"/>
-                <w14:ligatures w14:val="standardContextual"/>
-              </w:rPr>
-              <w:t>{{SiteName}}</w:t>
+                <w:bCs/>
+                <w:color w:val="000000"/>
+                <w:sz w:val="22"/>
+              </w:rPr>
+              <w:t>{</w:t>
+            </w:r>
+            <w:proofErr w:type="gramEnd"/>
+            <w:r>
+              <w:rPr>
+                <w:bCs/>
+                <w:color w:val="000000"/>
+                <w:sz w:val="22"/>
+              </w:rPr>
+              <w:t>{</w:t>
+            </w:r>
+            <w:proofErr w:type="spellStart"/>
+            <w:r>
+              <w:rPr>
+                <w:bCs/>
+                <w:color w:val="000000"/>
+                <w:sz w:val="22"/>
+              </w:rPr>
+              <w:t>SiteName</w:t>
+            </w:r>
+            <w:proofErr w:type="spellEnd"/>
+            <w:r>
+              <w:rPr>
+                <w:bCs/>
+                <w:color w:val="000000"/>
+                <w:sz w:val="22"/>
+              </w:rPr>
+              <w:t>}}</w:t>
             </w:r>
           </w:p>
         </w:tc>
@@ -1293,7 +1634,16 @@
                 <w:sz w:val="22"/>
                 <w:szCs w:val="20"/>
               </w:rPr>
-              <w:t>Site Address:</w:t>
+              <w:t xml:space="preserve">Site </w:t>
+            </w:r>
+            <w:proofErr w:type="gramStart"/>
+            <w:r>
+              <w:rPr>
+                <w:b/>
+                <w:sz w:val="22"/>
+                <w:szCs w:val="20"/>
+              </w:rPr>
+              <w:t>Address:</w:t>
             </w:r>
             <w:r>
               <w:rPr>
@@ -1304,7 +1654,34 @@
                 <w:lang w:val="en-CA"/>
                 <w14:ligatures w14:val="standardContextual"/>
               </w:rPr>
-              <w:t xml:space="preserve"> {{SiteAddress}}</w:t>
+              <w:t xml:space="preserve"> </w:t>
+            </w:r>
+            <w:r>
+              <w:rPr>
+                <w:bCs/>
+                <w:color w:val="000000"/>
+                <w:sz w:val="22"/>
+              </w:rPr>
+              <w:t>{{</w:t>
+            </w:r>
+            <w:proofErr w:type="spellStart"/>
+            <w:proofErr w:type="gramEnd"/>
+            <w:r>
+              <w:rPr>
+                <w:bCs/>
+                <w:color w:val="000000"/>
+                <w:sz w:val="22"/>
+              </w:rPr>
+              <w:t>SiteAddress</w:t>
+            </w:r>
+            <w:proofErr w:type="spellEnd"/>
+            <w:r>
+              <w:rPr>
+                <w:bCs/>
+                <w:color w:val="000000"/>
+                <w:sz w:val="22"/>
+              </w:rPr>
+              <w:t>}}</w:t>
             </w:r>
           </w:p>
         </w:tc>
@@ -1333,26 +1710,51 @@
                 <w:sz w:val="22"/>
                 <w:szCs w:val="20"/>
               </w:rPr>
-              <w:t>Site Type:</w:t>
-            </w:r>
+              <w:t xml:space="preserve">Site </w:t>
+            </w:r>
+            <w:proofErr w:type="gramStart"/>
             <w:r>
               <w:rPr>
                 <w:b/>
                 <w:sz w:val="22"/>
                 <w:szCs w:val="20"/>
               </w:rPr>
+              <w:t>Type:</w:t>
+            </w:r>
+            <w:r>
+              <w:rPr>
+                <w:b/>
+                <w:sz w:val="22"/>
+                <w:szCs w:val="20"/>
+              </w:rPr>
               <w:t xml:space="preserve"> </w:t>
             </w:r>
             <w:r>
               <w:rPr>
-                <w:rFonts w:asciiTheme="minorHAnsi" w:eastAsiaTheme="minorHAnsi" w:hAnsiTheme="minorHAnsi"/>
-                <w:kern w:val="2"/>
-                <w:sz w:val="20"/>
-                <w:szCs w:val="20"/>
-                <w:lang w:val="en-CA"/>
-                <w14:ligatures w14:val="standardContextual"/>
-              </w:rPr>
-              <w:t>{{SiteType}}</w:t>
+                <w:bCs/>
+                <w:color w:val="000000"/>
+                <w:sz w:val="22"/>
+              </w:rPr>
+              <w:t>{{</w:t>
+            </w:r>
+            <w:proofErr w:type="spellStart"/>
+            <w:proofErr w:type="gramEnd"/>
+            <w:r>
+              <w:rPr>
+                <w:bCs/>
+                <w:color w:val="000000"/>
+                <w:sz w:val="22"/>
+              </w:rPr>
+              <w:t>SiteType</w:t>
+            </w:r>
+            <w:proofErr w:type="spellEnd"/>
+            <w:r>
+              <w:rPr>
+                <w:bCs/>
+                <w:color w:val="000000"/>
+                <w:sz w:val="22"/>
+              </w:rPr>
+              <w:t>}}</w:t>
             </w:r>
           </w:p>
         </w:tc>
@@ -1499,7 +1901,25 @@
                 <w:sz w:val="36"/>
                 <w:szCs w:val="36"/>
               </w:rPr>
-              <w:t>{{IMG_BarcodeImage}}</w:t>
+              <w:t>{{</w:t>
+            </w:r>
+            <w:proofErr w:type="spellStart"/>
+            <w:r>
+              <w:rPr>
+                <w:color w:val="000000"/>
+                <w:sz w:val="36"/>
+                <w:szCs w:val="36"/>
+              </w:rPr>
+              <w:t>IMG_BarcodeImage</w:t>
+            </w:r>
+            <w:proofErr w:type="spellEnd"/>
+            <w:r>
+              <w:rPr>
+                <w:color w:val="000000"/>
+                <w:sz w:val="36"/>
+                <w:szCs w:val="36"/>
+              </w:rPr>
+              <w:t>}}</w:t>
             </w:r>
           </w:p>
         </w:tc>
@@ -1541,26 +1961,51 @@
                 <w:bCs/>
                 <w:sz w:val="22"/>
               </w:rPr>
-              <w:t>Sample Submitted for Purpose:</w:t>
-            </w:r>
+              <w:t xml:space="preserve">Sample Submitted for </w:t>
+            </w:r>
+            <w:proofErr w:type="gramStart"/>
             <w:r>
               <w:rPr>
                 <w:b/>
                 <w:bCs/>
                 <w:sz w:val="22"/>
               </w:rPr>
+              <w:t>Purpose:</w:t>
+            </w:r>
+            <w:r>
+              <w:rPr>
+                <w:b/>
+                <w:bCs/>
+                <w:sz w:val="22"/>
+              </w:rPr>
               <w:t xml:space="preserve"> </w:t>
             </w:r>
             <w:r>
               <w:rPr>
-                <w:rFonts w:asciiTheme="minorHAnsi" w:eastAsiaTheme="minorHAnsi" w:hAnsiTheme="minorHAnsi"/>
-                <w:kern w:val="2"/>
-                <w:sz w:val="20"/>
-                <w:szCs w:val="20"/>
-                <w:lang w:val="en-CA"/>
-                <w14:ligatures w14:val="standardContextual"/>
-              </w:rPr>
-              <w:t>{{SampleReason}}</w:t>
+                <w:bCs/>
+                <w:color w:val="000000"/>
+                <w:sz w:val="22"/>
+              </w:rPr>
+              <w:t>{{</w:t>
+            </w:r>
+            <w:proofErr w:type="spellStart"/>
+            <w:proofErr w:type="gramEnd"/>
+            <w:r>
+              <w:rPr>
+                <w:bCs/>
+                <w:color w:val="000000"/>
+                <w:sz w:val="22"/>
+              </w:rPr>
+              <w:t>SampleReason</w:t>
+            </w:r>
+            <w:proofErr w:type="spellEnd"/>
+            <w:r>
+              <w:rPr>
+                <w:bCs/>
+                <w:color w:val="000000"/>
+                <w:sz w:val="22"/>
+              </w:rPr>
+              <w:t>}}</w:t>
             </w:r>
             <w:r>
               <w:rPr>
@@ -1630,41 +2075,65 @@
             </w:r>
             <w:r>
               <w:rPr>
-                <w:rFonts w:asciiTheme="minorHAnsi" w:eastAsiaTheme="minorHAnsi" w:hAnsiTheme="minorHAnsi"/>
-                <w:kern w:val="2"/>
-                <w:sz w:val="20"/>
-                <w:szCs w:val="20"/>
-                <w:lang w:val="en-CA"/>
-                <w14:ligatures w14:val="standardContextual"/>
-              </w:rPr>
-              <w:t>{{#</w:t>
-            </w:r>
-            <w:r>
-              <w:rPr>
-                <w:rFonts w:asciiTheme="minorHAnsi" w:eastAsiaTheme="minorHAnsi" w:hAnsiTheme="minorHAnsi"/>
-                <w:kern w:val="2"/>
-                <w:sz w:val="20"/>
-                <w:szCs w:val="20"/>
-                <w:lang w:val="en-CA"/>
-                <w14:ligatures w14:val="standardContextual"/>
-              </w:rPr>
-              <w:t>IF_IsDrinkingWaterSystem}}{{BoilAdvisory}}{{/IF_IsDrinkingWaterSystem}}</w:t>
-            </w:r>
-            <w:r>
-              <w:rPr>
-                <w:color w:val="C00000"/>
-                <w:sz w:val="22"/>
-                <w:szCs w:val="20"/>
-              </w:rPr>
-              <w:t xml:space="preserve">               </w:t>
-            </w:r>
-            <w:r>
-              <w:rPr>
-                <w:b/>
-                <w:sz w:val="22"/>
-                <w:szCs w:val="20"/>
-              </w:rPr>
-              <w:t xml:space="preserve">       </w:t>
+                <w:bCs/>
+                <w:color w:val="000000"/>
+                <w:sz w:val="22"/>
+              </w:rPr>
+              <w:t>{{#IF_IsDrinkingWaterSystem</w:t>
+            </w:r>
+            <w:proofErr w:type="gramStart"/>
+            <w:r>
+              <w:rPr>
+                <w:bCs/>
+                <w:color w:val="000000"/>
+                <w:sz w:val="22"/>
+              </w:rPr>
+              <w:t>}}{</w:t>
+            </w:r>
+            <w:proofErr w:type="gramEnd"/>
+            <w:r>
+              <w:rPr>
+                <w:bCs/>
+                <w:color w:val="000000"/>
+                <w:sz w:val="22"/>
+              </w:rPr>
+              <w:t>{BoilAdvisory</w:t>
+            </w:r>
+            <w:proofErr w:type="gramStart"/>
+            <w:r>
+              <w:rPr>
+                <w:bCs/>
+                <w:color w:val="000000"/>
+                <w:sz w:val="22"/>
+              </w:rPr>
+              <w:t>}}{</w:t>
+            </w:r>
+            <w:proofErr w:type="gramEnd"/>
+            <w:r>
+              <w:rPr>
+                <w:bCs/>
+                <w:color w:val="000000"/>
+                <w:sz w:val="22"/>
+              </w:rPr>
+              <w:t>{/IF_IsDrinkingWaterSystem</w:t>
+            </w:r>
+            <w:proofErr w:type="gramStart"/>
+            <w:r>
+              <w:rPr>
+                <w:bCs/>
+                <w:color w:val="000000"/>
+                <w:sz w:val="22"/>
+              </w:rPr>
+              <w:t xml:space="preserve">}}   </w:t>
+            </w:r>
+            <w:proofErr w:type="gramEnd"/>
+            <w:r>
+              <w:rPr>
+                <w:bCs/>
+                <w:color w:val="000000"/>
+                <w:sz w:val="22"/>
+              </w:rPr>
+              <w:t xml:space="preserve">                   </w:t>
             </w:r>
           </w:p>
         </w:tc>
@@ -1725,14 +2194,29 @@
             </w:r>
             <w:r>
               <w:rPr>
-                <w:rFonts w:asciiTheme="minorHAnsi" w:eastAsiaTheme="minorHAnsi" w:hAnsiTheme="minorHAnsi"/>
-                <w:kern w:val="2"/>
-                <w:sz w:val="20"/>
-                <w:szCs w:val="20"/>
-                <w:lang w:val="en-CA"/>
-                <w14:ligatures w14:val="standardContextual"/>
-              </w:rPr>
-              <w:t>{{SubmittedforDWPA}}</w:t>
+                <w:bCs/>
+                <w:color w:val="000000"/>
+                <w:sz w:val="22"/>
+              </w:rPr>
+              <w:t>{{</w:t>
+            </w:r>
+            <w:proofErr w:type="spellStart"/>
+            <w:r>
+              <w:rPr>
+                <w:bCs/>
+                <w:color w:val="000000"/>
+                <w:sz w:val="22"/>
+              </w:rPr>
+              <w:t>SubmittedforDWPA</w:t>
+            </w:r>
+            <w:proofErr w:type="spellEnd"/>
+            <w:r>
+              <w:rPr>
+                <w:bCs/>
+                <w:color w:val="000000"/>
+                <w:sz w:val="22"/>
+              </w:rPr>
+              <w:t>}}</w:t>
             </w:r>
             <w:r>
               <w:rPr>
@@ -1790,14 +2274,29 @@
             </w:r>
             <w:r>
               <w:rPr>
-                <w:rFonts w:asciiTheme="minorHAnsi" w:eastAsiaTheme="minorHAnsi" w:hAnsiTheme="minorHAnsi"/>
-                <w:kern w:val="2"/>
-                <w:sz w:val="20"/>
-                <w:szCs w:val="20"/>
-                <w:lang w:val="en-CA"/>
-                <w14:ligatures w14:val="standardContextual"/>
-              </w:rPr>
-              <w:t>{{HealthAuthority}}</w:t>
+                <w:bCs/>
+                <w:color w:val="000000"/>
+                <w:sz w:val="22"/>
+              </w:rPr>
+              <w:t>{{</w:t>
+            </w:r>
+            <w:proofErr w:type="spellStart"/>
+            <w:r>
+              <w:rPr>
+                <w:bCs/>
+                <w:color w:val="000000"/>
+                <w:sz w:val="22"/>
+              </w:rPr>
+              <w:t>HealthAuthority</w:t>
+            </w:r>
+            <w:proofErr w:type="spellEnd"/>
+            <w:r>
+              <w:rPr>
+                <w:bCs/>
+                <w:color w:val="000000"/>
+                <w:sz w:val="22"/>
+              </w:rPr>
+              <w:t>}}</w:t>
             </w:r>
           </w:p>
         </w:tc>
@@ -1828,26 +2327,59 @@
                 <w:sz w:val="22"/>
                 <w:szCs w:val="20"/>
               </w:rPr>
-              <w:t xml:space="preserve">Send Additional Copy To: </w:t>
-            </w:r>
+              <w:t>Send Additional Copy To</w:t>
+            </w:r>
+            <w:proofErr w:type="gramStart"/>
             <w:r>
               <w:rPr>
                 <w:b/>
                 <w:sz w:val="22"/>
                 <w:szCs w:val="20"/>
               </w:rPr>
+              <w:t xml:space="preserve">: </w:t>
+            </w:r>
+            <w:r>
+              <w:rPr>
+                <w:b/>
+                <w:sz w:val="22"/>
+                <w:szCs w:val="20"/>
+              </w:rPr>
               <w:t xml:space="preserve"> </w:t>
             </w:r>
             <w:r>
               <w:rPr>
-                <w:rFonts w:asciiTheme="minorHAnsi" w:eastAsiaTheme="minorHAnsi" w:hAnsiTheme="minorHAnsi"/>
-                <w:kern w:val="2"/>
-                <w:sz w:val="20"/>
-                <w:szCs w:val="20"/>
-                <w:lang w:val="en-CA"/>
-                <w14:ligatures w14:val="standardContextual"/>
-              </w:rPr>
-              <w:t>{{AdditionalReportRecipients}}</w:t>
+                <w:bCs/>
+                <w:color w:val="000000"/>
+                <w:sz w:val="22"/>
+              </w:rPr>
+              <w:t>{</w:t>
+            </w:r>
+            <w:proofErr w:type="gramEnd"/>
+            <w:r>
+              <w:rPr>
+                <w:bCs/>
+                <w:color w:val="000000"/>
+                <w:sz w:val="22"/>
+              </w:rPr>
+              <w:t>{</w:t>
+            </w:r>
+            <w:proofErr w:type="spellStart"/>
+            <w:r>
+              <w:rPr>
+                <w:bCs/>
+                <w:color w:val="000000"/>
+                <w:sz w:val="22"/>
+              </w:rPr>
+              <w:t>AdditionalReportRecipients</w:t>
+            </w:r>
+            <w:proofErr w:type="spellEnd"/>
+            <w:r>
+              <w:rPr>
+                <w:bCs/>
+                <w:color w:val="000000"/>
+                <w:sz w:val="22"/>
+              </w:rPr>
+              <w:t>}}</w:t>
             </w:r>
           </w:p>
         </w:tc>
@@ -1956,8 +2488,8 @@
               <w:rPr>
                 <w:b/>
                 <w:color w:val="000000"/>
-                <w:sz w:val="28"/>
-                <w:szCs w:val="28"/>
+                <w:sz w:val="26"/>
+                <w:szCs w:val="26"/>
               </w:rPr>
               <w:t>Section 3 - Test Information</w:t>
             </w:r>
@@ -2130,14 +2662,45 @@
               <w:rPr>
                 <w:sz w:val="22"/>
               </w:rPr>
-              <w:t xml:space="preserve">Total Chlorine    </w:t>
+              <w:t xml:space="preserve">Total Chlorine </w:t>
+            </w:r>
+            <w:proofErr w:type="gramStart"/>
+            <w:r>
+              <w:rPr>
+                <w:sz w:val="22"/>
+              </w:rPr>
+              <w:t xml:space="preserve">   </w:t>
             </w:r>
             <w:r>
               <w:rPr>
                 <w:rFonts w:ascii="Segoe UI Symbol" w:hAnsi="Segoe UI Symbol"/>
                 <w:sz w:val="22"/>
               </w:rPr>
-              <w:t xml:space="preserve">{{#IF_PreviousSampleOvergrown}}☑ </w:t>
+              <w:t>{</w:t>
+            </w:r>
+            <w:proofErr w:type="gramEnd"/>
+            <w:r>
+              <w:rPr>
+                <w:rFonts w:ascii="Segoe UI Symbol" w:hAnsi="Segoe UI Symbol"/>
+                <w:sz w:val="22"/>
+              </w:rPr>
+              <w:t>{#IF_PreviousSampleOvergrown</w:t>
+            </w:r>
+            <w:proofErr w:type="gramStart"/>
+            <w:r>
+              <w:rPr>
+                <w:rFonts w:ascii="Segoe UI Symbol" w:hAnsi="Segoe UI Symbol"/>
+                <w:sz w:val="22"/>
+              </w:rPr>
+              <w:t>}}☑</w:t>
+            </w:r>
+            <w:proofErr w:type="gramEnd"/>
+            <w:r>
+              <w:rPr>
+                <w:rFonts w:ascii="Segoe UI Symbol" w:hAnsi="Segoe UI Symbol"/>
+                <w:sz w:val="22"/>
+              </w:rPr>
+              <w:t xml:space="preserve"> </w:t>
             </w:r>
             <w:r>
               <w:rPr>
@@ -2150,13 +2713,29 @@
                 <w:rFonts w:ascii="Segoe UI Symbol" w:hAnsi="Segoe UI Symbol"/>
                 <w:sz w:val="22"/>
               </w:rPr>
-              <w:t>{{/IF_PreviousSampleOvergrown}}{{^IF_PreviousSampleOvergrown}}</w:t>
-            </w:r>
+              <w:t>{{/IF_PreviousSampleOvergrown</w:t>
+            </w:r>
+            <w:proofErr w:type="gramStart"/>
             <w:r>
               <w:rPr>
                 <w:rFonts w:ascii="Segoe UI Symbol" w:hAnsi="Segoe UI Symbol"/>
                 <w:sz w:val="22"/>
               </w:rPr>
+              <w:t>}}{</w:t>
+            </w:r>
+            <w:proofErr w:type="gramEnd"/>
+            <w:r>
+              <w:rPr>
+                <w:rFonts w:ascii="Segoe UI Symbol" w:hAnsi="Segoe UI Symbol"/>
+                <w:sz w:val="22"/>
+              </w:rPr>
+              <w:t>{^IF_PreviousSampleOvergrown}}</w:t>
+            </w:r>
+            <w:r>
+              <w:rPr>
+                <w:rFonts w:ascii="Segoe UI Symbol" w:hAnsi="Segoe UI Symbol"/>
+                <w:sz w:val="22"/>
+              </w:rPr>
               <w:t xml:space="preserve"> </w:t>
             </w:r>
             <w:r>
@@ -2177,7 +2756,23 @@
                 <w:rFonts w:ascii="Segoe UI Symbol" w:hAnsi="Segoe UI Symbol"/>
                 <w:sz w:val="22"/>
               </w:rPr>
-              <w:t>{{/IF_PreviousSampleOvergrown}}</w:t>
+              <w:t>{{/</w:t>
+            </w:r>
+            <w:proofErr w:type="spellStart"/>
+            <w:r>
+              <w:rPr>
+                <w:rFonts w:ascii="Segoe UI Symbol" w:hAnsi="Segoe UI Symbol"/>
+                <w:sz w:val="22"/>
+              </w:rPr>
+              <w:t>IF_PreviousSampleOvergrown</w:t>
+            </w:r>
+            <w:proofErr w:type="spellEnd"/>
+            <w:r>
+              <w:rPr>
+                <w:rFonts w:ascii="Segoe UI Symbol" w:hAnsi="Segoe UI Symbol"/>
+                <w:sz w:val="22"/>
+              </w:rPr>
+              <w:t>}}</w:t>
             </w:r>
           </w:p>
         </w:tc>
@@ -3572,6 +4167,7 @@
   <w:style w:type="character" w:default="1" w:styleId="DefaultParagraphFont">
     <w:name w:val="Default Paragraph Font"/>
     <w:uiPriority w:val="1"/>
+    <w:semiHidden/>
     <w:unhideWhenUsed/>
   </w:style>
   <w:style w:type="table" w:default="1" w:styleId="TableNormal">
@@ -14769,7 +15365,12 @@
 </file>
 
 <file path=customXml/item1.xml><?xml version="1.0" encoding="utf-8"?>
-<b:Sources xmlns:b="http://schemas.openxmlformats.org/officeDocument/2006/bibliography" xmlns="http://schemas.openxmlformats.org/officeDocument/2006/bibliography" SelectedStyle="/APA.XSL" StyleName="APA"/>
+<?mso-contentType ?>
+<FormTemplates xmlns="http://schemas.microsoft.com/sharepoint/v3/contenttype/forms">
+  <Display>DocumentLibraryForm</Display>
+  <Edit>DocumentLibraryForm</Edit>
+  <New>DocumentLibraryForm</New>
+</FormTemplates>
 </file>
 
 <file path=customXml/item2.xml><?xml version="1.0" encoding="utf-8"?>
@@ -14784,12 +15385,7 @@
 </file>
 
 <file path=customXml/item3.xml><?xml version="1.0" encoding="utf-8"?>
-<?mso-contentType ?>
-<FormTemplates xmlns="http://schemas.microsoft.com/sharepoint/v3/contenttype/forms">
-  <Display>DocumentLibraryForm</Display>
-  <Edit>DocumentLibraryForm</Edit>
-  <New>DocumentLibraryForm</New>
-</FormTemplates>
+<b:Sources xmlns:b="http://schemas.openxmlformats.org/officeDocument/2006/bibliography" xmlns="http://schemas.openxmlformats.org/officeDocument/2006/bibliography" SelectedStyle="/APA.XSL" StyleName="APA"/>
 </file>
 
 <file path=customXml/item4.xml><?xml version="1.0" encoding="utf-8"?>
@@ -14988,9 +15584,9 @@
 </file>
 
 <file path=customXml/itemProps1.xml><?xml version="1.0" encoding="utf-8"?>
-<ds:datastoreItem xmlns:ds="http://schemas.openxmlformats.org/officeDocument/2006/customXml" ds:itemID="{EF278816-EC6F-A645-907D-7F25AECB1D4A}">
+<ds:datastoreItem xmlns:ds="http://schemas.openxmlformats.org/officeDocument/2006/customXml" ds:itemID="{A716B50A-0009-4E47-B240-259AF18AB47D}">
   <ds:schemaRefs>
-    <ds:schemaRef ds:uri="http://schemas.openxmlformats.org/officeDocument/2006/bibliography"/>
+    <ds:schemaRef ds:uri="http://schemas.microsoft.com/sharepoint/v3/contenttype/forms"/>
   </ds:schemaRefs>
 </ds:datastoreItem>
 </file>
@@ -15007,9 +15603,9 @@
 </file>
 
 <file path=customXml/itemProps3.xml><?xml version="1.0" encoding="utf-8"?>
-<ds:datastoreItem xmlns:ds="http://schemas.openxmlformats.org/officeDocument/2006/customXml" ds:itemID="{A716B50A-0009-4E47-B240-259AF18AB47D}">
+<ds:datastoreItem xmlns:ds="http://schemas.openxmlformats.org/officeDocument/2006/customXml" ds:itemID="{EF278816-EC6F-A645-907D-7F25AECB1D4A}">
   <ds:schemaRefs>
-    <ds:schemaRef ds:uri="http://schemas.microsoft.com/sharepoint/v3/contenttype/forms"/>
+    <ds:schemaRef ds:uri="http://schemas.openxmlformats.org/officeDocument/2006/bibliography"/>
   </ds:schemaRefs>
 </ds:datastoreItem>
 </file>

</xml_diff>

<commit_message>
EHIS-5869 Sprint#27_EHIS-809: Issues with Water lab test Requisition template
</commit_message>
<xml_diff>
--- a/PHOCS-Docgentemplates/PHOCS Water Bacteriology Requisition Template_V0.2.docx
+++ b/PHOCS-Docgentemplates/PHOCS Water Bacteriology Requisition Template_V0.2.docx
@@ -414,16 +414,7 @@
                 <w:sz w:val="22"/>
                 <w:szCs w:val="20"/>
               </w:rPr>
-              <w:t>Name</w:t>
-            </w:r>
-            <w:proofErr w:type="gramStart"/>
-            <w:r>
-              <w:rPr>
-                <w:b/>
-                <w:sz w:val="22"/>
-                <w:szCs w:val="20"/>
-              </w:rPr>
-              <w:t xml:space="preserve">: </w:t>
+              <w:t xml:space="preserve">Name: </w:t>
             </w:r>
             <w:r>
               <w:rPr>
@@ -439,16 +430,7 @@
                 <w:color w:val="000000"/>
                 <w:sz w:val="22"/>
               </w:rPr>
-              <w:t>{</w:t>
-            </w:r>
-            <w:proofErr w:type="gramEnd"/>
-            <w:r>
-              <w:rPr>
-                <w:bCs/>
-                <w:color w:val="000000"/>
-                <w:sz w:val="22"/>
-              </w:rPr>
-              <w:t>{</w:t>
+              <w:t>{{</w:t>
             </w:r>
             <w:proofErr w:type="spellStart"/>
             <w:r>
@@ -571,16 +553,7 @@
                 <w:sz w:val="22"/>
                 <w:szCs w:val="20"/>
               </w:rPr>
-              <w:t>Name</w:t>
-            </w:r>
-            <w:proofErr w:type="gramStart"/>
-            <w:r>
-              <w:rPr>
-                <w:b/>
-                <w:sz w:val="22"/>
-                <w:szCs w:val="20"/>
-              </w:rPr>
-              <w:t xml:space="preserve">: </w:t>
+              <w:t xml:space="preserve">Name: </w:t>
             </w:r>
             <w:r>
               <w:rPr>
@@ -596,16 +569,7 @@
                 <w:color w:val="000000"/>
                 <w:sz w:val="22"/>
               </w:rPr>
-              <w:t>{</w:t>
-            </w:r>
-            <w:proofErr w:type="gramEnd"/>
-            <w:r>
-              <w:rPr>
-                <w:bCs/>
-                <w:color w:val="000000"/>
-                <w:sz w:val="22"/>
-              </w:rPr>
-              <w:t>{WaterSupplierName}}</w:t>
+              <w:t>{{WaterSupplierName}}</w:t>
             </w:r>
           </w:p>
         </w:tc>
@@ -639,7 +603,6 @@
                 <w:szCs w:val="20"/>
               </w:rPr>
             </w:pPr>
-            <w:proofErr w:type="gramStart"/>
             <w:r>
               <w:rPr>
                 <w:b/>
@@ -657,7 +620,6 @@
               <w:t>{{</w:t>
             </w:r>
             <w:proofErr w:type="spellStart"/>
-            <w:proofErr w:type="gramEnd"/>
             <w:r>
               <w:rPr>
                 <w:bCs/>
@@ -708,16 +670,7 @@
                 <w:sz w:val="22"/>
                 <w:szCs w:val="20"/>
               </w:rPr>
-              <w:t>Phone</w:t>
-            </w:r>
-            <w:proofErr w:type="gramStart"/>
-            <w:r>
-              <w:rPr>
-                <w:b/>
-                <w:sz w:val="22"/>
-                <w:szCs w:val="20"/>
-              </w:rPr>
-              <w:t xml:space="preserve">: </w:t>
+              <w:t xml:space="preserve">Phone: </w:t>
             </w:r>
             <w:r>
               <w:rPr>
@@ -733,16 +686,7 @@
                 <w:color w:val="000000"/>
                 <w:sz w:val="22"/>
               </w:rPr>
-              <w:t>{</w:t>
-            </w:r>
-            <w:proofErr w:type="gramEnd"/>
-            <w:r>
-              <w:rPr>
-                <w:bCs/>
-                <w:color w:val="000000"/>
-                <w:sz w:val="22"/>
-              </w:rPr>
-              <w:t>{</w:t>
+              <w:t>{{</w:t>
             </w:r>
             <w:proofErr w:type="spellStart"/>
             <w:r>
@@ -789,7 +733,6 @@
                 <w:szCs w:val="20"/>
               </w:rPr>
             </w:pPr>
-            <w:proofErr w:type="gramStart"/>
             <w:r>
               <w:rPr>
                 <w:b/>
@@ -807,7 +750,6 @@
               <w:t>{{</w:t>
             </w:r>
             <w:proofErr w:type="spellStart"/>
-            <w:proofErr w:type="gramEnd"/>
             <w:r>
               <w:rPr>
                 <w:bCs/>
@@ -857,7 +799,6 @@
                 <w14:ligatures w14:val="standardContextual"/>
               </w:rPr>
             </w:pPr>
-            <w:proofErr w:type="gramStart"/>
             <w:r>
               <w:rPr>
                 <w:b/>
@@ -875,7 +816,6 @@
               <w:t>{{</w:t>
             </w:r>
             <w:proofErr w:type="spellStart"/>
-            <w:proofErr w:type="gramEnd"/>
             <w:r>
               <w:rPr>
                 <w:bCs/>
@@ -921,7 +861,6 @@
                 <w:szCs w:val="20"/>
               </w:rPr>
             </w:pPr>
-            <w:proofErr w:type="gramStart"/>
             <w:r>
               <w:rPr>
                 <w:b/>
@@ -939,7 +878,6 @@
               <w:t>{{</w:t>
             </w:r>
             <w:proofErr w:type="spellStart"/>
-            <w:proofErr w:type="gramEnd"/>
             <w:r>
               <w:rPr>
                 <w:bCs/>
@@ -985,7 +923,6 @@
                 <w:szCs w:val="20"/>
               </w:rPr>
             </w:pPr>
-            <w:proofErr w:type="gramStart"/>
             <w:r>
               <w:rPr>
                 <w:b/>
@@ -1003,7 +940,6 @@
               <w:t>{{</w:t>
             </w:r>
             <w:proofErr w:type="spellStart"/>
-            <w:proofErr w:type="gramEnd"/>
             <w:r>
               <w:rPr>
                 <w:bCs/>
@@ -1105,23 +1041,14 @@
                 <w:bCs/>
                 <w:sz w:val="22"/>
               </w:rPr>
-              <w:t>Sampler Name</w:t>
-            </w:r>
-            <w:proofErr w:type="gramStart"/>
+              <w:t xml:space="preserve">Sampler Name: </w:t>
+            </w:r>
             <w:r>
               <w:rPr>
                 <w:b/>
                 <w:bCs/>
                 <w:sz w:val="22"/>
               </w:rPr>
-              <w:t xml:space="preserve">: </w:t>
-            </w:r>
-            <w:r>
-              <w:rPr>
-                <w:b/>
-                <w:bCs/>
-                <w:sz w:val="22"/>
-              </w:rPr>
               <w:t xml:space="preserve"> </w:t>
             </w:r>
             <w:r>
@@ -1130,34 +1057,24 @@
                 <w:color w:val="000000"/>
                 <w:sz w:val="22"/>
               </w:rPr>
-              <w:t>{</w:t>
-            </w:r>
-            <w:proofErr w:type="gramEnd"/>
+              <w:t>{{</w:t>
+            </w:r>
+            <w:proofErr w:type="spellStart"/>
             <w:r>
               <w:rPr>
                 <w:bCs/>
                 <w:color w:val="000000"/>
                 <w:sz w:val="22"/>
               </w:rPr>
-              <w:t>{</w:t>
-            </w:r>
-            <w:proofErr w:type="spellStart"/>
+              <w:t>SamplerName</w:t>
+            </w:r>
+            <w:proofErr w:type="spellEnd"/>
             <w:r>
               <w:rPr>
                 <w:bCs/>
                 <w:color w:val="000000"/>
                 <w:sz w:val="22"/>
               </w:rPr>
-              <w:t>SamplerName</w:t>
-            </w:r>
-            <w:proofErr w:type="spellEnd"/>
-            <w:proofErr w:type="gramStart"/>
-            <w:r>
-              <w:rPr>
-                <w:bCs/>
-                <w:color w:val="000000"/>
-                <w:sz w:val="22"/>
-              </w:rPr>
               <w:t>}}</w:t>
             </w:r>
             <w:r>
@@ -1165,15 +1082,7 @@
                 <w:color w:val="FF0000"/>
                 <w:sz w:val="22"/>
               </w:rPr>
-              <w:t xml:space="preserve">   </w:t>
-            </w:r>
-            <w:proofErr w:type="gramEnd"/>
-            <w:r>
-              <w:rPr>
-                <w:color w:val="FF0000"/>
-                <w:sz w:val="22"/>
-              </w:rPr>
-              <w:t xml:space="preserve">            </w:t>
+              <w:t xml:space="preserve">               </w:t>
             </w:r>
             <w:r>
               <w:rPr>
@@ -1220,40 +1129,6 @@
                 <w:sz w:val="22"/>
               </w:rPr>
               <w:t xml:space="preserve"> </w:t>
-            </w:r>
-            <w:r>
-              <w:rPr>
-                <w:bCs/>
-                <w:color w:val="000000"/>
-                <w:sz w:val="22"/>
-              </w:rPr>
-              <w:t>{</w:t>
-            </w:r>
-            <w:r>
-              <w:rPr>
-                <w:bCs/>
-                <w:color w:val="000000"/>
-                <w:sz w:val="22"/>
-              </w:rPr>
-              <w:t>{</w:t>
-            </w:r>
-            <w:proofErr w:type="spellStart"/>
-            <w:r>
-              <w:rPr>
-                <w:bCs/>
-                <w:color w:val="000000"/>
-                <w:sz w:val="22"/>
-              </w:rPr>
-              <w:t>CollectionDateTime</w:t>
-            </w:r>
-            <w:proofErr w:type="spellEnd"/>
-            <w:r>
-              <w:rPr>
-                <w:bCs/>
-                <w:color w:val="000000"/>
-                <w:sz w:val="22"/>
-              </w:rPr>
-              <w:t>}}</w:t>
             </w:r>
           </w:p>
         </w:tc>
@@ -1296,9 +1171,8 @@
                 <w:sz w:val="22"/>
                 <w:szCs w:val="20"/>
               </w:rPr>
-              <w:t xml:space="preserve">System </w:t>
-            </w:r>
-            <w:proofErr w:type="gramStart"/>
+              <w:t>System Nam</w:t>
+            </w:r>
             <w:r>
               <w:rPr>
                 <w:b/>
@@ -1306,15 +1180,6 @@
                 <w:sz w:val="22"/>
                 <w:szCs w:val="20"/>
               </w:rPr>
-              <w:t>Nam</w:t>
-            </w:r>
-            <w:r>
-              <w:rPr>
-                <w:b/>
-                <w:bCs/>
-                <w:sz w:val="22"/>
-                <w:szCs w:val="20"/>
-              </w:rPr>
               <w:t xml:space="preserve">e: </w:t>
             </w:r>
             <w:r>
@@ -1326,7 +1191,6 @@
               <w:t>{{</w:t>
             </w:r>
             <w:proofErr w:type="spellStart"/>
-            <w:proofErr w:type="gramEnd"/>
             <w:r>
               <w:rPr>
                 <w:bCs/>
@@ -1380,16 +1244,7 @@
                 <w:sz w:val="22"/>
                 <w:szCs w:val="20"/>
               </w:rPr>
-              <w:t xml:space="preserve">ystem </w:t>
-            </w:r>
-            <w:proofErr w:type="gramStart"/>
-            <w:r>
-              <w:rPr>
-                <w:b/>
-                <w:sz w:val="22"/>
-                <w:szCs w:val="20"/>
-              </w:rPr>
-              <w:t>Type</w:t>
+              <w:t>ystem Type</w:t>
             </w:r>
             <w:r>
               <w:rPr>
@@ -1400,7 +1255,6 @@
               <w:t>: {{</w:t>
             </w:r>
             <w:proofErr w:type="spellStart"/>
-            <w:proofErr w:type="gramEnd"/>
             <w:r>
               <w:rPr>
                 <w:bCs/>
@@ -1439,7 +1293,6 @@
                 <w:sz w:val="22"/>
               </w:rPr>
             </w:pPr>
-            <w:proofErr w:type="gramStart"/>
             <w:r>
               <w:rPr>
                 <w:b/>
@@ -1454,52 +1307,7 @@
                 <w:color w:val="000000"/>
                 <w:sz w:val="22"/>
               </w:rPr>
-              <w:t>:{</w:t>
-            </w:r>
-            <w:proofErr w:type="gramEnd"/>
-            <w:r>
-              <w:rPr>
-                <w:bCs/>
-                <w:color w:val="000000"/>
-                <w:sz w:val="22"/>
-              </w:rPr>
-              <w:t>{#IF_IsDrinkingWaterSystem</w:t>
-            </w:r>
-            <w:proofErr w:type="gramStart"/>
-            <w:r>
-              <w:rPr>
-                <w:bCs/>
-                <w:color w:val="000000"/>
-                <w:sz w:val="22"/>
-              </w:rPr>
-              <w:t>}}{</w:t>
-            </w:r>
-            <w:proofErr w:type="gramEnd"/>
-            <w:r>
-              <w:rPr>
-                <w:bCs/>
-                <w:color w:val="000000"/>
-                <w:sz w:val="22"/>
-              </w:rPr>
-              <w:t>{FacilityPopulationServedper24hrs</w:t>
-            </w:r>
-            <w:proofErr w:type="gramStart"/>
-            <w:r>
-              <w:rPr>
-                <w:bCs/>
-                <w:color w:val="000000"/>
-                <w:sz w:val="22"/>
-              </w:rPr>
-              <w:t>}}{</w:t>
-            </w:r>
-            <w:proofErr w:type="gramEnd"/>
-            <w:r>
-              <w:rPr>
-                <w:bCs/>
-                <w:color w:val="000000"/>
-                <w:sz w:val="22"/>
-              </w:rPr>
-              <w:t>{/IF_IsDrinkingWaterSystem}}</w:t>
+              <w:t>:{{#IF_IsDrinkingWaterSystem}}{{FacilityPopulationServedper24hrs}}{{/IF_IsDrinkingWaterSystem}}</w:t>
             </w:r>
           </w:p>
           <w:p>
@@ -1552,16 +1360,7 @@
                 <w:sz w:val="22"/>
                 <w:szCs w:val="20"/>
               </w:rPr>
-              <w:t>Site Name</w:t>
-            </w:r>
-            <w:proofErr w:type="gramStart"/>
-            <w:r>
-              <w:rPr>
-                <w:b/>
-                <w:sz w:val="22"/>
-                <w:szCs w:val="20"/>
-              </w:rPr>
-              <w:t xml:space="preserve">: </w:t>
+              <w:t xml:space="preserve">Site Name: </w:t>
             </w:r>
             <w:r>
               <w:rPr>
@@ -1577,16 +1376,7 @@
                 <w:color w:val="000000"/>
                 <w:sz w:val="22"/>
               </w:rPr>
-              <w:t>{</w:t>
-            </w:r>
-            <w:proofErr w:type="gramEnd"/>
-            <w:r>
-              <w:rPr>
-                <w:bCs/>
-                <w:color w:val="000000"/>
-                <w:sz w:val="22"/>
-              </w:rPr>
-              <w:t>{</w:t>
+              <w:t>{{</w:t>
             </w:r>
             <w:proofErr w:type="spellStart"/>
             <w:r>
@@ -1634,16 +1424,7 @@
                 <w:sz w:val="22"/>
                 <w:szCs w:val="20"/>
               </w:rPr>
-              <w:t xml:space="preserve">Site </w:t>
-            </w:r>
-            <w:proofErr w:type="gramStart"/>
-            <w:r>
-              <w:rPr>
-                <w:b/>
-                <w:sz w:val="22"/>
-                <w:szCs w:val="20"/>
-              </w:rPr>
-              <w:t>Address:</w:t>
+              <w:t>Site Address:</w:t>
             </w:r>
             <w:r>
               <w:rPr>
@@ -1665,7 +1446,6 @@
               <w:t>{{</w:t>
             </w:r>
             <w:proofErr w:type="spellStart"/>
-            <w:proofErr w:type="gramEnd"/>
             <w:r>
               <w:rPr>
                 <w:bCs/>
@@ -1710,16 +1490,7 @@
                 <w:sz w:val="22"/>
                 <w:szCs w:val="20"/>
               </w:rPr>
-              <w:t xml:space="preserve">Site </w:t>
-            </w:r>
-            <w:proofErr w:type="gramStart"/>
-            <w:r>
-              <w:rPr>
-                <w:b/>
-                <w:sz w:val="22"/>
-                <w:szCs w:val="20"/>
-              </w:rPr>
-              <w:t>Type:</w:t>
+              <w:t>Site Type:</w:t>
             </w:r>
             <w:r>
               <w:rPr>
@@ -1738,7 +1509,6 @@
               <w:t>{{</w:t>
             </w:r>
             <w:proofErr w:type="spellStart"/>
-            <w:proofErr w:type="gramEnd"/>
             <w:r>
               <w:rPr>
                 <w:bCs/>
@@ -1961,23 +1731,14 @@
                 <w:bCs/>
                 <w:sz w:val="22"/>
               </w:rPr>
-              <w:t xml:space="preserve">Sample Submitted for </w:t>
-            </w:r>
-            <w:proofErr w:type="gramStart"/>
+              <w:t>Sample Submitted for Purpose:</w:t>
+            </w:r>
             <w:r>
               <w:rPr>
                 <w:b/>
                 <w:bCs/>
                 <w:sz w:val="22"/>
               </w:rPr>
-              <w:t>Purpose:</w:t>
-            </w:r>
-            <w:r>
-              <w:rPr>
-                <w:b/>
-                <w:bCs/>
-                <w:sz w:val="22"/>
-              </w:rPr>
               <w:t xml:space="preserve"> </w:t>
             </w:r>
             <w:r>
@@ -1989,7 +1750,6 @@
               <w:t>{{</w:t>
             </w:r>
             <w:proofErr w:type="spellStart"/>
-            <w:proofErr w:type="gramEnd"/>
             <w:r>
               <w:rPr>
                 <w:bCs/>
@@ -2079,61 +1839,7 @@
                 <w:color w:val="000000"/>
                 <w:sz w:val="22"/>
               </w:rPr>
-              <w:t>{{#IF_IsDrinkingWaterSystem</w:t>
-            </w:r>
-            <w:proofErr w:type="gramStart"/>
-            <w:r>
-              <w:rPr>
-                <w:bCs/>
-                <w:color w:val="000000"/>
-                <w:sz w:val="22"/>
-              </w:rPr>
-              <w:t>}}{</w:t>
-            </w:r>
-            <w:proofErr w:type="gramEnd"/>
-            <w:r>
-              <w:rPr>
-                <w:bCs/>
-                <w:color w:val="000000"/>
-                <w:sz w:val="22"/>
-              </w:rPr>
-              <w:t>{BoilAdvisory</w:t>
-            </w:r>
-            <w:proofErr w:type="gramStart"/>
-            <w:r>
-              <w:rPr>
-                <w:bCs/>
-                <w:color w:val="000000"/>
-                <w:sz w:val="22"/>
-              </w:rPr>
-              <w:t>}}{</w:t>
-            </w:r>
-            <w:proofErr w:type="gramEnd"/>
-            <w:r>
-              <w:rPr>
-                <w:bCs/>
-                <w:color w:val="000000"/>
-                <w:sz w:val="22"/>
-              </w:rPr>
-              <w:t>{/IF_IsDrinkingWaterSystem</w:t>
-            </w:r>
-            <w:proofErr w:type="gramStart"/>
-            <w:r>
-              <w:rPr>
-                <w:bCs/>
-                <w:color w:val="000000"/>
-                <w:sz w:val="22"/>
-              </w:rPr>
-              <w:t xml:space="preserve">}}   </w:t>
-            </w:r>
-            <w:proofErr w:type="gramEnd"/>
-            <w:r>
-              <w:rPr>
-                <w:bCs/>
-                <w:color w:val="000000"/>
-                <w:sz w:val="22"/>
-              </w:rPr>
-              <w:t xml:space="preserve">                   </w:t>
+              <w:t xml:space="preserve">{{#IF_IsDrinkingWaterSystem}}{{BoilAdvisory}}{{/IF_IsDrinkingWaterSystem}}                      </w:t>
             </w:r>
           </w:p>
         </w:tc>
@@ -2327,16 +2033,7 @@
                 <w:sz w:val="22"/>
                 <w:szCs w:val="20"/>
               </w:rPr>
-              <w:t>Send Additional Copy To</w:t>
-            </w:r>
-            <w:proofErr w:type="gramStart"/>
-            <w:r>
-              <w:rPr>
-                <w:b/>
-                <w:sz w:val="22"/>
-                <w:szCs w:val="20"/>
-              </w:rPr>
-              <w:t xml:space="preserve">: </w:t>
+              <w:t xml:space="preserve">Send Additional Copy To: </w:t>
             </w:r>
             <w:r>
               <w:rPr>
@@ -2352,16 +2049,7 @@
                 <w:color w:val="000000"/>
                 <w:sz w:val="22"/>
               </w:rPr>
-              <w:t>{</w:t>
-            </w:r>
-            <w:proofErr w:type="gramEnd"/>
-            <w:r>
-              <w:rPr>
-                <w:bCs/>
-                <w:color w:val="000000"/>
-                <w:sz w:val="22"/>
-              </w:rPr>
-              <w:t>{</w:t>
+              <w:t>{{</w:t>
             </w:r>
             <w:proofErr w:type="spellStart"/>
             <w:r>
@@ -2662,74 +2350,27 @@
               <w:rPr>
                 <w:sz w:val="22"/>
               </w:rPr>
-              <w:t xml:space="preserve">Total Chlorine </w:t>
-            </w:r>
-            <w:proofErr w:type="gramStart"/>
-            <w:r>
-              <w:rPr>
-                <w:sz w:val="22"/>
-              </w:rPr>
-              <w:t xml:space="preserve">   </w:t>
+              <w:t xml:space="preserve">Total Chlorine    </w:t>
             </w:r>
             <w:r>
               <w:rPr>
                 <w:rFonts w:ascii="Segoe UI Symbol" w:hAnsi="Segoe UI Symbol"/>
                 <w:sz w:val="22"/>
               </w:rPr>
-              <w:t>{</w:t>
-            </w:r>
-            <w:proofErr w:type="gramEnd"/>
+              <w:t xml:space="preserve">{{#IF_PreviousSampleOvergrown}}☑ </w:t>
+            </w:r>
+            <w:r>
+              <w:rPr>
+                <w:sz w:val="22"/>
+              </w:rPr>
+              <w:t>Previous Sample Overgrown</w:t>
+            </w:r>
             <w:r>
               <w:rPr>
                 <w:rFonts w:ascii="Segoe UI Symbol" w:hAnsi="Segoe UI Symbol"/>
                 <w:sz w:val="22"/>
               </w:rPr>
-              <w:t>{#IF_PreviousSampleOvergrown</w:t>
-            </w:r>
-            <w:proofErr w:type="gramStart"/>
-            <w:r>
-              <w:rPr>
-                <w:rFonts w:ascii="Segoe UI Symbol" w:hAnsi="Segoe UI Symbol"/>
-                <w:sz w:val="22"/>
-              </w:rPr>
-              <w:t>}}☑</w:t>
-            </w:r>
-            <w:proofErr w:type="gramEnd"/>
-            <w:r>
-              <w:rPr>
-                <w:rFonts w:ascii="Segoe UI Symbol" w:hAnsi="Segoe UI Symbol"/>
-                <w:sz w:val="22"/>
-              </w:rPr>
-              <w:t xml:space="preserve"> </w:t>
-            </w:r>
-            <w:r>
-              <w:rPr>
-                <w:sz w:val="22"/>
-              </w:rPr>
-              <w:t>Previous Sample Overgrown</w:t>
-            </w:r>
-            <w:r>
-              <w:rPr>
-                <w:rFonts w:ascii="Segoe UI Symbol" w:hAnsi="Segoe UI Symbol"/>
-                <w:sz w:val="22"/>
-              </w:rPr>
-              <w:t>{{/IF_PreviousSampleOvergrown</w:t>
-            </w:r>
-            <w:proofErr w:type="gramStart"/>
-            <w:r>
-              <w:rPr>
-                <w:rFonts w:ascii="Segoe UI Symbol" w:hAnsi="Segoe UI Symbol"/>
-                <w:sz w:val="22"/>
-              </w:rPr>
-              <w:t>}}{</w:t>
-            </w:r>
-            <w:proofErr w:type="gramEnd"/>
-            <w:r>
-              <w:rPr>
-                <w:rFonts w:ascii="Segoe UI Symbol" w:hAnsi="Segoe UI Symbol"/>
-                <w:sz w:val="22"/>
-              </w:rPr>
-              <w:t>{^IF_PreviousSampleOvergrown}}</w:t>
+              <w:t>{{/IF_PreviousSampleOvergrown}}{{^IF_PreviousSampleOvergrown}}</w:t>
             </w:r>
             <w:r>
               <w:rPr>
@@ -15365,12 +15006,7 @@
 </file>
 
 <file path=customXml/item1.xml><?xml version="1.0" encoding="utf-8"?>
-<?mso-contentType ?>
-<FormTemplates xmlns="http://schemas.microsoft.com/sharepoint/v3/contenttype/forms">
-  <Display>DocumentLibraryForm</Display>
-  <Edit>DocumentLibraryForm</Edit>
-  <New>DocumentLibraryForm</New>
-</FormTemplates>
+<b:Sources xmlns:b="http://schemas.openxmlformats.org/officeDocument/2006/bibliography" xmlns="http://schemas.openxmlformats.org/officeDocument/2006/bibliography" SelectedStyle="/APA.XSL" StyleName="APA"/>
 </file>
 
 <file path=customXml/item2.xml><?xml version="1.0" encoding="utf-8"?>
@@ -15385,7 +15021,12 @@
 </file>
 
 <file path=customXml/item3.xml><?xml version="1.0" encoding="utf-8"?>
-<b:Sources xmlns:b="http://schemas.openxmlformats.org/officeDocument/2006/bibliography" xmlns="http://schemas.openxmlformats.org/officeDocument/2006/bibliography" SelectedStyle="/APA.XSL" StyleName="APA"/>
+<?mso-contentType ?>
+<FormTemplates xmlns="http://schemas.microsoft.com/sharepoint/v3/contenttype/forms">
+  <Display>DocumentLibraryForm</Display>
+  <Edit>DocumentLibraryForm</Edit>
+  <New>DocumentLibraryForm</New>
+</FormTemplates>
 </file>
 
 <file path=customXml/item4.xml><?xml version="1.0" encoding="utf-8"?>
@@ -15584,9 +15225,9 @@
 </file>
 
 <file path=customXml/itemProps1.xml><?xml version="1.0" encoding="utf-8"?>
-<ds:datastoreItem xmlns:ds="http://schemas.openxmlformats.org/officeDocument/2006/customXml" ds:itemID="{A716B50A-0009-4E47-B240-259AF18AB47D}">
+<ds:datastoreItem xmlns:ds="http://schemas.openxmlformats.org/officeDocument/2006/customXml" ds:itemID="{EF278816-EC6F-A645-907D-7F25AECB1D4A}">
   <ds:schemaRefs>
-    <ds:schemaRef ds:uri="http://schemas.microsoft.com/sharepoint/v3/contenttype/forms"/>
+    <ds:schemaRef ds:uri="http://schemas.openxmlformats.org/officeDocument/2006/bibliography"/>
   </ds:schemaRefs>
 </ds:datastoreItem>
 </file>
@@ -15603,9 +15244,9 @@
 </file>
 
 <file path=customXml/itemProps3.xml><?xml version="1.0" encoding="utf-8"?>
-<ds:datastoreItem xmlns:ds="http://schemas.openxmlformats.org/officeDocument/2006/customXml" ds:itemID="{EF278816-EC6F-A645-907D-7F25AECB1D4A}">
+<ds:datastoreItem xmlns:ds="http://schemas.openxmlformats.org/officeDocument/2006/customXml" ds:itemID="{A716B50A-0009-4E47-B240-259AF18AB47D}">
   <ds:schemaRefs>
-    <ds:schemaRef ds:uri="http://schemas.openxmlformats.org/officeDocument/2006/bibliography"/>
+    <ds:schemaRef ds:uri="http://schemas.microsoft.com/sharepoint/v3/contenttype/forms"/>
   </ds:schemaRefs>
 </ds:datastoreItem>
 </file>

</xml_diff>

<commit_message>
EHIS-5905 Sprint#27: EHIS-809: Second page is displayed on the requisition document
</commit_message>
<xml_diff>
--- a/PHOCS-Docgentemplates/PHOCS Water Bacteriology Requisition Template_V0.2.docx
+++ b/PHOCS-Docgentemplates/PHOCS Water Bacteriology Requisition Template_V0.2.docx
@@ -198,29 +198,28 @@
     </w:p>
     <w:tbl>
       <w:tblPr>
-        <w:tblW w:w="11880" w:type="dxa"/>
+        <w:tblW w:w="11960" w:type="dxa"/>
         <w:jc w:val="center"/>
         <w:tblLayout w:type="fixed"/>
         <w:tblLook w:val="04A0" w:firstRow="1" w:lastRow="0" w:firstColumn="1" w:lastColumn="0" w:noHBand="0" w:noVBand="1"/>
       </w:tblPr>
       <w:tblGrid>
-        <w:gridCol w:w="3770"/>
-        <w:gridCol w:w="270"/>
+        <w:gridCol w:w="4040"/>
         <w:gridCol w:w="1865"/>
         <w:gridCol w:w="35"/>
-        <w:gridCol w:w="1790"/>
-        <w:gridCol w:w="540"/>
-        <w:gridCol w:w="3610"/>
+        <w:gridCol w:w="2060"/>
+        <w:gridCol w:w="270"/>
+        <w:gridCol w:w="3690"/>
       </w:tblGrid>
       <w:tr>
         <w:trPr>
-          <w:trHeight w:val="438"/>
+          <w:trHeight w:val="348"/>
           <w:jc w:val="center"/>
         </w:trPr>
         <w:tc>
           <w:tcPr>
-            <w:tcW w:w="11880" w:type="dxa"/>
-            <w:gridSpan w:val="7"/>
+            <w:tcW w:w="11960" w:type="dxa"/>
+            <w:gridSpan w:val="6"/>
             <w:tcBorders>
               <w:top w:val="single" w:sz="8" w:space="0" w:color="000000" w:themeColor="text1"/>
               <w:left w:val="single" w:sz="8" w:space="0" w:color="000000" w:themeColor="text1"/>
@@ -283,7 +282,7 @@
         </w:trPr>
         <w:tc>
           <w:tcPr>
-            <w:tcW w:w="3770" w:type="dxa"/>
+            <w:tcW w:w="4040" w:type="dxa"/>
             <w:tcBorders>
               <w:top w:val="single" w:sz="8" w:space="0" w:color="000000" w:themeColor="text1"/>
               <w:left w:val="single" w:sz="8" w:space="0" w:color="000000" w:themeColor="text1"/>
@@ -313,7 +312,7 @@
         <w:tc>
           <w:tcPr>
             <w:tcW w:w="3960" w:type="dxa"/>
-            <w:gridSpan w:val="4"/>
+            <w:gridSpan w:val="3"/>
             <w:tcBorders>
               <w:top w:val="single" w:sz="8" w:space="0" w:color="000000" w:themeColor="text1"/>
               <w:left w:val="single" w:sz="8" w:space="0" w:color="000000" w:themeColor="text1"/>
@@ -350,7 +349,7 @@
         </w:tc>
         <w:tc>
           <w:tcPr>
-            <w:tcW w:w="4150" w:type="dxa"/>
+            <w:tcW w:w="3960" w:type="dxa"/>
             <w:gridSpan w:val="2"/>
             <w:tcBorders>
               <w:top w:val="single" w:sz="8" w:space="0" w:color="000000" w:themeColor="text1"/>
@@ -381,12 +380,12 @@
       </w:tr>
       <w:tr>
         <w:trPr>
-          <w:trHeight w:val="438"/>
+          <w:trHeight w:val="330"/>
           <w:jc w:val="center"/>
         </w:trPr>
         <w:tc>
           <w:tcPr>
-            <w:tcW w:w="3770" w:type="dxa"/>
+            <w:tcW w:w="4040" w:type="dxa"/>
             <w:tcBorders>
               <w:top w:val="single" w:sz="8" w:space="0" w:color="000000" w:themeColor="text1"/>
               <w:left w:val="single" w:sz="8" w:space="0" w:color="000000" w:themeColor="text1"/>
@@ -414,7 +413,16 @@
                 <w:sz w:val="22"/>
                 <w:szCs w:val="20"/>
               </w:rPr>
-              <w:t xml:space="preserve">Name: </w:t>
+              <w:t>Name</w:t>
+            </w:r>
+            <w:proofErr w:type="gramStart"/>
+            <w:r>
+              <w:rPr>
+                <w:b/>
+                <w:sz w:val="22"/>
+                <w:szCs w:val="20"/>
+              </w:rPr>
+              <w:t xml:space="preserve">: </w:t>
             </w:r>
             <w:r>
               <w:rPr>
@@ -430,7 +438,16 @@
                 <w:color w:val="000000"/>
                 <w:sz w:val="22"/>
               </w:rPr>
-              <w:t>{{</w:t>
+              <w:t>{</w:t>
+            </w:r>
+            <w:proofErr w:type="gramEnd"/>
+            <w:r>
+              <w:rPr>
+                <w:bCs/>
+                <w:color w:val="000000"/>
+                <w:sz w:val="22"/>
+              </w:rPr>
+              <w:t>{</w:t>
             </w:r>
             <w:proofErr w:type="spellStart"/>
             <w:r>
@@ -455,7 +472,7 @@
         <w:tc>
           <w:tcPr>
             <w:tcW w:w="3960" w:type="dxa"/>
-            <w:gridSpan w:val="4"/>
+            <w:gridSpan w:val="3"/>
             <w:tcBorders>
               <w:top w:val="single" w:sz="8" w:space="0" w:color="000000" w:themeColor="text1"/>
               <w:left w:val="single" w:sz="8" w:space="0" w:color="000000" w:themeColor="text1"/>
@@ -524,7 +541,7 @@
         </w:tc>
         <w:tc>
           <w:tcPr>
-            <w:tcW w:w="4150" w:type="dxa"/>
+            <w:tcW w:w="3960" w:type="dxa"/>
             <w:gridSpan w:val="2"/>
             <w:tcBorders>
               <w:top w:val="single" w:sz="8" w:space="0" w:color="000000" w:themeColor="text1"/>
@@ -553,7 +570,16 @@
                 <w:sz w:val="22"/>
                 <w:szCs w:val="20"/>
               </w:rPr>
-              <w:t xml:space="preserve">Name: </w:t>
+              <w:t>Name</w:t>
+            </w:r>
+            <w:proofErr w:type="gramStart"/>
+            <w:r>
+              <w:rPr>
+                <w:b/>
+                <w:sz w:val="22"/>
+                <w:szCs w:val="20"/>
+              </w:rPr>
+              <w:t xml:space="preserve">: </w:t>
             </w:r>
             <w:r>
               <w:rPr>
@@ -569,19 +595,28 @@
                 <w:color w:val="000000"/>
                 <w:sz w:val="22"/>
               </w:rPr>
-              <w:t>{{WaterSupplierName}}</w:t>
+              <w:t>{</w:t>
+            </w:r>
+            <w:proofErr w:type="gramEnd"/>
+            <w:r>
+              <w:rPr>
+                <w:bCs/>
+                <w:color w:val="000000"/>
+                <w:sz w:val="22"/>
+              </w:rPr>
+              <w:t>{WaterSupplierName}}</w:t>
             </w:r>
           </w:p>
         </w:tc>
       </w:tr>
       <w:tr>
         <w:trPr>
-          <w:trHeight w:val="402"/>
+          <w:trHeight w:val="330"/>
           <w:jc w:val="center"/>
         </w:trPr>
         <w:tc>
           <w:tcPr>
-            <w:tcW w:w="3770" w:type="dxa"/>
+            <w:tcW w:w="4040" w:type="dxa"/>
             <w:tcBorders>
               <w:top w:val="single" w:sz="8" w:space="0" w:color="000000" w:themeColor="text1"/>
               <w:left w:val="single" w:sz="8" w:space="0" w:color="000000" w:themeColor="text1"/>
@@ -603,6 +638,7 @@
                 <w:szCs w:val="20"/>
               </w:rPr>
             </w:pPr>
+            <w:proofErr w:type="gramStart"/>
             <w:r>
               <w:rPr>
                 <w:b/>
@@ -620,6 +656,7 @@
               <w:t>{{</w:t>
             </w:r>
             <w:proofErr w:type="spellStart"/>
+            <w:proofErr w:type="gramEnd"/>
             <w:r>
               <w:rPr>
                 <w:bCs/>
@@ -642,7 +679,7 @@
         <w:tc>
           <w:tcPr>
             <w:tcW w:w="3960" w:type="dxa"/>
-            <w:gridSpan w:val="4"/>
+            <w:gridSpan w:val="3"/>
             <w:tcBorders>
               <w:top w:val="single" w:sz="8" w:space="0" w:color="000000" w:themeColor="text1"/>
               <w:left w:val="single" w:sz="8" w:space="0" w:color="000000" w:themeColor="text1"/>
@@ -670,7 +707,16 @@
                 <w:sz w:val="22"/>
                 <w:szCs w:val="20"/>
               </w:rPr>
-              <w:t xml:space="preserve">Phone: </w:t>
+              <w:t>Phone</w:t>
+            </w:r>
+            <w:proofErr w:type="gramStart"/>
+            <w:r>
+              <w:rPr>
+                <w:b/>
+                <w:sz w:val="22"/>
+                <w:szCs w:val="20"/>
+              </w:rPr>
+              <w:t xml:space="preserve">: </w:t>
             </w:r>
             <w:r>
               <w:rPr>
@@ -686,7 +732,16 @@
                 <w:color w:val="000000"/>
                 <w:sz w:val="22"/>
               </w:rPr>
-              <w:t>{{</w:t>
+              <w:t>{</w:t>
+            </w:r>
+            <w:proofErr w:type="gramEnd"/>
+            <w:r>
+              <w:rPr>
+                <w:bCs/>
+                <w:color w:val="000000"/>
+                <w:sz w:val="22"/>
+              </w:rPr>
+              <w:t>{</w:t>
             </w:r>
             <w:proofErr w:type="spellStart"/>
             <w:r>
@@ -710,7 +765,7 @@
         </w:tc>
         <w:tc>
           <w:tcPr>
-            <w:tcW w:w="4150" w:type="dxa"/>
+            <w:tcW w:w="3960" w:type="dxa"/>
             <w:gridSpan w:val="2"/>
             <w:tcBorders>
               <w:top w:val="single" w:sz="8" w:space="0" w:color="000000" w:themeColor="text1"/>
@@ -733,6 +788,7 @@
                 <w:szCs w:val="20"/>
               </w:rPr>
             </w:pPr>
+            <w:proofErr w:type="gramStart"/>
             <w:r>
               <w:rPr>
                 <w:b/>
@@ -750,6 +806,7 @@
               <w:t>{{</w:t>
             </w:r>
             <w:proofErr w:type="spellStart"/>
+            <w:proofErr w:type="gramEnd"/>
             <w:r>
               <w:rPr>
                 <w:bCs/>
@@ -772,12 +829,12 @@
       </w:tr>
       <w:tr>
         <w:trPr>
-          <w:trHeight w:val="300"/>
+          <w:trHeight w:val="402"/>
           <w:jc w:val="center"/>
         </w:trPr>
         <w:tc>
           <w:tcPr>
-            <w:tcW w:w="3770" w:type="dxa"/>
+            <w:tcW w:w="4040" w:type="dxa"/>
             <w:tcBorders>
               <w:top w:val="single" w:sz="8" w:space="0" w:color="000000" w:themeColor="text1"/>
               <w:left w:val="single" w:sz="8" w:space="0" w:color="000000" w:themeColor="text1"/>
@@ -799,6 +856,7 @@
                 <w14:ligatures w14:val="standardContextual"/>
               </w:rPr>
             </w:pPr>
+            <w:proofErr w:type="gramStart"/>
             <w:r>
               <w:rPr>
                 <w:b/>
@@ -816,6 +874,7 @@
               <w:t>{{</w:t>
             </w:r>
             <w:proofErr w:type="spellStart"/>
+            <w:proofErr w:type="gramEnd"/>
             <w:r>
               <w:rPr>
                 <w:bCs/>
@@ -838,7 +897,7 @@
         <w:tc>
           <w:tcPr>
             <w:tcW w:w="3960" w:type="dxa"/>
-            <w:gridSpan w:val="4"/>
+            <w:gridSpan w:val="3"/>
             <w:tcBorders>
               <w:top w:val="single" w:sz="8" w:space="0" w:color="000000" w:themeColor="text1"/>
               <w:left w:val="single" w:sz="8" w:space="0" w:color="000000" w:themeColor="text1"/>
@@ -861,6 +920,7 @@
                 <w:szCs w:val="20"/>
               </w:rPr>
             </w:pPr>
+            <w:proofErr w:type="gramStart"/>
             <w:r>
               <w:rPr>
                 <w:b/>
@@ -878,6 +938,7 @@
               <w:t>{{</w:t>
             </w:r>
             <w:proofErr w:type="spellStart"/>
+            <w:proofErr w:type="gramEnd"/>
             <w:r>
               <w:rPr>
                 <w:bCs/>
@@ -899,7 +960,7 @@
         </w:tc>
         <w:tc>
           <w:tcPr>
-            <w:tcW w:w="4150" w:type="dxa"/>
+            <w:tcW w:w="3960" w:type="dxa"/>
             <w:gridSpan w:val="2"/>
             <w:tcBorders>
               <w:top w:val="single" w:sz="8" w:space="0" w:color="000000" w:themeColor="text1"/>
@@ -923,6 +984,7 @@
                 <w:szCs w:val="20"/>
               </w:rPr>
             </w:pPr>
+            <w:proofErr w:type="gramStart"/>
             <w:r>
               <w:rPr>
                 <w:b/>
@@ -940,6 +1002,7 @@
               <w:t>{{</w:t>
             </w:r>
             <w:proofErr w:type="spellStart"/>
+            <w:proofErr w:type="gramEnd"/>
             <w:r>
               <w:rPr>
                 <w:bCs/>
@@ -962,13 +1025,13 @@
       </w:tr>
       <w:tr>
         <w:trPr>
-          <w:trHeight w:val="420"/>
+          <w:trHeight w:val="132"/>
           <w:jc w:val="center"/>
         </w:trPr>
         <w:tc>
           <w:tcPr>
-            <w:tcW w:w="11880" w:type="dxa"/>
-            <w:gridSpan w:val="7"/>
+            <w:tcW w:w="11960" w:type="dxa"/>
+            <w:gridSpan w:val="6"/>
             <w:tcBorders>
               <w:top w:val="single" w:sz="8" w:space="0" w:color="000000" w:themeColor="text1"/>
               <w:left w:val="single" w:sz="8" w:space="0" w:color="000000" w:themeColor="text1"/>
@@ -1005,142 +1068,12 @@
       </w:tr>
       <w:tr>
         <w:trPr>
-          <w:trHeight w:val="420"/>
+          <w:trHeight w:val="330"/>
           <w:jc w:val="center"/>
         </w:trPr>
         <w:tc>
           <w:tcPr>
             <w:tcW w:w="5905" w:type="dxa"/>
-            <w:gridSpan w:val="3"/>
-            <w:tcBorders>
-              <w:top w:val="single" w:sz="8" w:space="0" w:color="000000" w:themeColor="text1"/>
-              <w:left w:val="single" w:sz="8" w:space="0" w:color="000000" w:themeColor="text1"/>
-              <w:bottom w:val="single" w:sz="8" w:space="0" w:color="000000" w:themeColor="text1"/>
-              <w:right w:val="single" w:sz="8" w:space="0" w:color="000000" w:themeColor="text1"/>
-            </w:tcBorders>
-            <w:tcMar>
-              <w:top w:w="55" w:type="dxa"/>
-              <w:left w:w="70" w:type="dxa"/>
-              <w:bottom w:w="55" w:type="dxa"/>
-              <w:right w:w="70" w:type="dxa"/>
-            </w:tcMar>
-          </w:tcPr>
-          <w:p>
-            <w:pPr>
-              <w:spacing w:after="0" w:line="240" w:lineRule="auto"/>
-              <w:rPr>
-                <w:b/>
-                <w:color w:val="000000"/>
-                <w:sz w:val="26"/>
-                <w:szCs w:val="24"/>
-              </w:rPr>
-            </w:pPr>
-            <w:r>
-              <w:rPr>
-                <w:b/>
-                <w:bCs/>
-                <w:sz w:val="22"/>
-              </w:rPr>
-              <w:t xml:space="preserve">Sampler Name: </w:t>
-            </w:r>
-            <w:r>
-              <w:rPr>
-                <w:b/>
-                <w:bCs/>
-                <w:sz w:val="22"/>
-              </w:rPr>
-              <w:t xml:space="preserve"> </w:t>
-            </w:r>
-            <w:r>
-              <w:rPr>
-                <w:bCs/>
-                <w:color w:val="000000"/>
-                <w:sz w:val="22"/>
-              </w:rPr>
-              <w:t>{{</w:t>
-            </w:r>
-            <w:proofErr w:type="spellStart"/>
-            <w:r>
-              <w:rPr>
-                <w:bCs/>
-                <w:color w:val="000000"/>
-                <w:sz w:val="22"/>
-              </w:rPr>
-              <w:t>SamplerName</w:t>
-            </w:r>
-            <w:proofErr w:type="spellEnd"/>
-            <w:r>
-              <w:rPr>
-                <w:bCs/>
-                <w:color w:val="000000"/>
-                <w:sz w:val="22"/>
-              </w:rPr>
-              <w:t>}}</w:t>
-            </w:r>
-            <w:r>
-              <w:rPr>
-                <w:color w:val="FF0000"/>
-                <w:sz w:val="22"/>
-              </w:rPr>
-              <w:t xml:space="preserve">               </w:t>
-            </w:r>
-            <w:r>
-              <w:rPr>
-                <w:color w:val="9BBB59" w:themeColor="accent3"/>
-                <w:sz w:val="22"/>
-              </w:rPr>
-              <w:t xml:space="preserve">               </w:t>
-            </w:r>
-          </w:p>
-        </w:tc>
-        <w:tc>
-          <w:tcPr>
-            <w:tcW w:w="5975" w:type="dxa"/>
-            <w:gridSpan w:val="4"/>
-            <w:tcBorders>
-              <w:top w:val="single" w:sz="8" w:space="0" w:color="000000" w:themeColor="text1"/>
-              <w:left w:val="single" w:sz="8" w:space="0" w:color="000000" w:themeColor="text1"/>
-              <w:bottom w:val="single" w:sz="8" w:space="0" w:color="000000" w:themeColor="text1"/>
-              <w:right w:val="single" w:sz="8" w:space="0" w:color="000000" w:themeColor="text1"/>
-            </w:tcBorders>
-          </w:tcPr>
-          <w:p>
-            <w:pPr>
-              <w:spacing w:after="0" w:line="240" w:lineRule="auto"/>
-              <w:rPr>
-                <w:b/>
-                <w:color w:val="000000"/>
-                <w:sz w:val="26"/>
-                <w:szCs w:val="24"/>
-              </w:rPr>
-            </w:pPr>
-            <w:r>
-              <w:rPr>
-                <w:b/>
-                <w:bCs/>
-                <w:sz w:val="22"/>
-              </w:rPr>
-              <w:t>Collection Date Time:</w:t>
-            </w:r>
-            <w:r>
-              <w:rPr>
-                <w:b/>
-                <w:bCs/>
-                <w:sz w:val="22"/>
-              </w:rPr>
-              <w:t xml:space="preserve"> </w:t>
-            </w:r>
-          </w:p>
-        </w:tc>
-      </w:tr>
-      <w:tr>
-        <w:trPr>
-          <w:trHeight w:val="300"/>
-          <w:jc w:val="center"/>
-        </w:trPr>
-        <w:tc>
-          <w:tcPr>
-            <w:tcW w:w="4040" w:type="dxa"/>
             <w:gridSpan w:val="2"/>
             <w:tcBorders>
               <w:top w:val="single" w:sz="8" w:space="0" w:color="000000" w:themeColor="text1"/>
@@ -1160,8 +1093,9 @@
               <w:spacing w:after="0" w:line="240" w:lineRule="auto"/>
               <w:rPr>
                 <w:b/>
-                <w:bCs/>
-                <w:sz w:val="22"/>
+                <w:color w:val="000000"/>
+                <w:sz w:val="26"/>
+                <w:szCs w:val="24"/>
               </w:rPr>
             </w:pPr>
             <w:r>
@@ -1169,18 +1103,25 @@
                 <w:b/>
                 <w:bCs/>
                 <w:sz w:val="22"/>
-                <w:szCs w:val="20"/>
-              </w:rPr>
-              <w:t>System Nam</w:t>
-            </w:r>
+              </w:rPr>
+              <w:t>Sampler Name</w:t>
+            </w:r>
+            <w:proofErr w:type="gramStart"/>
             <w:r>
               <w:rPr>
                 <w:b/>
                 <w:bCs/>
                 <w:sz w:val="22"/>
-                <w:szCs w:val="20"/>
-              </w:rPr>
-              <w:t xml:space="preserve">e: </w:t>
+              </w:rPr>
+              <w:t xml:space="preserve">: </w:t>
+            </w:r>
+            <w:r>
+              <w:rPr>
+                <w:b/>
+                <w:bCs/>
+                <w:sz w:val="22"/>
+              </w:rPr>
+              <w:t xml:space="preserve"> </w:t>
             </w:r>
             <w:r>
               <w:rPr>
@@ -1188,9 +1129,168 @@
                 <w:color w:val="000000"/>
                 <w:sz w:val="22"/>
               </w:rPr>
+              <w:t>{</w:t>
+            </w:r>
+            <w:proofErr w:type="gramEnd"/>
+            <w:r>
+              <w:rPr>
+                <w:bCs/>
+                <w:color w:val="000000"/>
+                <w:sz w:val="22"/>
+              </w:rPr>
+              <w:t>{</w:t>
+            </w:r>
+            <w:proofErr w:type="spellStart"/>
+            <w:r>
+              <w:rPr>
+                <w:bCs/>
+                <w:color w:val="000000"/>
+                <w:sz w:val="22"/>
+              </w:rPr>
+              <w:t>SamplerName</w:t>
+            </w:r>
+            <w:proofErr w:type="spellEnd"/>
+            <w:proofErr w:type="gramStart"/>
+            <w:r>
+              <w:rPr>
+                <w:bCs/>
+                <w:color w:val="000000"/>
+                <w:sz w:val="22"/>
+              </w:rPr>
+              <w:t>}}</w:t>
+            </w:r>
+            <w:r>
+              <w:rPr>
+                <w:color w:val="FF0000"/>
+                <w:sz w:val="22"/>
+              </w:rPr>
+              <w:t xml:space="preserve">   </w:t>
+            </w:r>
+            <w:proofErr w:type="gramEnd"/>
+            <w:r>
+              <w:rPr>
+                <w:color w:val="FF0000"/>
+                <w:sz w:val="22"/>
+              </w:rPr>
+              <w:t xml:space="preserve">            </w:t>
+            </w:r>
+            <w:r>
+              <w:rPr>
+                <w:color w:val="9BBB59" w:themeColor="accent3"/>
+                <w:sz w:val="22"/>
+              </w:rPr>
+              <w:t xml:space="preserve">               </w:t>
+            </w:r>
+          </w:p>
+        </w:tc>
+        <w:tc>
+          <w:tcPr>
+            <w:tcW w:w="6055" w:type="dxa"/>
+            <w:gridSpan w:val="4"/>
+            <w:tcBorders>
+              <w:top w:val="single" w:sz="8" w:space="0" w:color="000000" w:themeColor="text1"/>
+              <w:left w:val="single" w:sz="8" w:space="0" w:color="000000" w:themeColor="text1"/>
+              <w:bottom w:val="single" w:sz="8" w:space="0" w:color="000000" w:themeColor="text1"/>
+              <w:right w:val="single" w:sz="8" w:space="0" w:color="000000" w:themeColor="text1"/>
+            </w:tcBorders>
+          </w:tcPr>
+          <w:p>
+            <w:pPr>
+              <w:spacing w:after="0" w:line="240" w:lineRule="auto"/>
+              <w:rPr>
+                <w:b/>
+                <w:color w:val="000000"/>
+                <w:sz w:val="26"/>
+                <w:szCs w:val="24"/>
+              </w:rPr>
+            </w:pPr>
+            <w:r>
+              <w:rPr>
+                <w:b/>
+                <w:bCs/>
+                <w:sz w:val="22"/>
+              </w:rPr>
+              <w:t>Collection Date Time:</w:t>
+            </w:r>
+            <w:r>
+              <w:rPr>
+                <w:b/>
+                <w:bCs/>
+                <w:sz w:val="22"/>
+              </w:rPr>
+              <w:t xml:space="preserve"> </w:t>
+            </w:r>
+          </w:p>
+        </w:tc>
+      </w:tr>
+      <w:tr>
+        <w:trPr>
+          <w:trHeight w:val="1050"/>
+          <w:jc w:val="center"/>
+        </w:trPr>
+        <w:tc>
+          <w:tcPr>
+            <w:tcW w:w="4040" w:type="dxa"/>
+            <w:tcBorders>
+              <w:top w:val="single" w:sz="8" w:space="0" w:color="000000" w:themeColor="text1"/>
+              <w:left w:val="single" w:sz="8" w:space="0" w:color="000000" w:themeColor="text1"/>
+              <w:bottom w:val="single" w:sz="8" w:space="0" w:color="000000" w:themeColor="text1"/>
+              <w:right w:val="single" w:sz="8" w:space="0" w:color="000000" w:themeColor="text1"/>
+            </w:tcBorders>
+            <w:tcMar>
+              <w:top w:w="55" w:type="dxa"/>
+              <w:left w:w="70" w:type="dxa"/>
+              <w:bottom w:w="55" w:type="dxa"/>
+              <w:right w:w="70" w:type="dxa"/>
+            </w:tcMar>
+          </w:tcPr>
+          <w:p>
+            <w:pPr>
+              <w:spacing w:after="0" w:line="240" w:lineRule="auto"/>
+              <w:rPr>
+                <w:b/>
+                <w:bCs/>
+                <w:sz w:val="22"/>
+              </w:rPr>
+            </w:pPr>
+            <w:r>
+              <w:rPr>
+                <w:b/>
+                <w:bCs/>
+                <w:sz w:val="22"/>
+                <w:szCs w:val="20"/>
+              </w:rPr>
+              <w:t xml:space="preserve">System </w:t>
+            </w:r>
+            <w:proofErr w:type="gramStart"/>
+            <w:r>
+              <w:rPr>
+                <w:b/>
+                <w:bCs/>
+                <w:sz w:val="22"/>
+                <w:szCs w:val="20"/>
+              </w:rPr>
+              <w:t>Nam</w:t>
+            </w:r>
+            <w:r>
+              <w:rPr>
+                <w:b/>
+                <w:bCs/>
+                <w:sz w:val="22"/>
+                <w:szCs w:val="20"/>
+              </w:rPr>
+              <w:t xml:space="preserve">e: </w:t>
+            </w:r>
+            <w:r>
+              <w:rPr>
+                <w:bCs/>
+                <w:color w:val="000000"/>
+                <w:sz w:val="22"/>
+              </w:rPr>
               <w:t>{{</w:t>
             </w:r>
             <w:proofErr w:type="spellStart"/>
+            <w:proofErr w:type="gramEnd"/>
             <w:r>
               <w:rPr>
                 <w:bCs/>
@@ -1244,7 +1344,16 @@
                 <w:sz w:val="22"/>
                 <w:szCs w:val="20"/>
               </w:rPr>
-              <w:t>ystem Type</w:t>
+              <w:t xml:space="preserve">ystem </w:t>
+            </w:r>
+            <w:proofErr w:type="gramStart"/>
+            <w:r>
+              <w:rPr>
+                <w:b/>
+                <w:sz w:val="22"/>
+                <w:szCs w:val="20"/>
+              </w:rPr>
+              <w:t>Type</w:t>
             </w:r>
             <w:r>
               <w:rPr>
@@ -1255,6 +1364,7 @@
               <w:t>: {{</w:t>
             </w:r>
             <w:proofErr w:type="spellStart"/>
+            <w:proofErr w:type="gramEnd"/>
             <w:r>
               <w:rPr>
                 <w:bCs/>
@@ -1276,7 +1386,7 @@
         </w:tc>
         <w:tc>
           <w:tcPr>
-            <w:tcW w:w="3610" w:type="dxa"/>
+            <w:tcW w:w="3690" w:type="dxa"/>
             <w:tcBorders>
               <w:top w:val="single" w:sz="8" w:space="0" w:color="000000" w:themeColor="text1"/>
               <w:left w:val="single" w:sz="8" w:space="0" w:color="000000" w:themeColor="text1"/>
@@ -1293,6 +1403,7 @@
                 <w:sz w:val="22"/>
               </w:rPr>
             </w:pPr>
+            <w:proofErr w:type="gramStart"/>
             <w:r>
               <w:rPr>
                 <w:b/>
@@ -1307,30 +1418,64 @@
                 <w:color w:val="000000"/>
                 <w:sz w:val="22"/>
               </w:rPr>
-              <w:t>:{{#IF_IsDrinkingWaterSystem}}{{FacilityPopulationServedper24hrs}}{{/IF_IsDrinkingWaterSystem}}</w:t>
-            </w:r>
-          </w:p>
-          <w:p>
-            <w:pPr>
-              <w:spacing w:after="0" w:line="240" w:lineRule="auto"/>
-              <w:rPr>
-                <w:b/>
+              <w:t>:{</w:t>
+            </w:r>
+            <w:proofErr w:type="gramEnd"/>
+            <w:r>
+              <w:rPr>
                 <w:bCs/>
-                <w:sz w:val="22"/>
-              </w:rPr>
-            </w:pPr>
+                <w:color w:val="000000"/>
+                <w:sz w:val="22"/>
+              </w:rPr>
+              <w:t>{#IF_IsDrinkingWaterSystem</w:t>
+            </w:r>
+            <w:proofErr w:type="gramStart"/>
+            <w:r>
+              <w:rPr>
+                <w:bCs/>
+                <w:color w:val="000000"/>
+                <w:sz w:val="22"/>
+              </w:rPr>
+              <w:t>}}{</w:t>
+            </w:r>
+            <w:proofErr w:type="gramEnd"/>
+            <w:r>
+              <w:rPr>
+                <w:bCs/>
+                <w:color w:val="000000"/>
+                <w:sz w:val="22"/>
+              </w:rPr>
+              <w:t>{FacilityPopulationServedper24hrs</w:t>
+            </w:r>
+            <w:proofErr w:type="gramStart"/>
+            <w:r>
+              <w:rPr>
+                <w:bCs/>
+                <w:color w:val="000000"/>
+                <w:sz w:val="22"/>
+              </w:rPr>
+              <w:t>}}{</w:t>
+            </w:r>
+            <w:proofErr w:type="gramEnd"/>
+            <w:r>
+              <w:rPr>
+                <w:bCs/>
+                <w:color w:val="000000"/>
+                <w:sz w:val="22"/>
+              </w:rPr>
+              <w:t>{/IF_IsDrinkingWaterSystem}}</w:t>
+            </w:r>
           </w:p>
         </w:tc>
       </w:tr>
       <w:tr>
         <w:trPr>
-          <w:trHeight w:val="411"/>
+          <w:trHeight w:val="258"/>
           <w:jc w:val="center"/>
         </w:trPr>
         <w:tc>
           <w:tcPr>
             <w:tcW w:w="4040" w:type="dxa"/>
-            <w:gridSpan w:val="2"/>
             <w:tcBorders>
               <w:top w:val="single" w:sz="8" w:space="0" w:color="000000" w:themeColor="text1"/>
               <w:left w:val="single" w:sz="8" w:space="0" w:color="000000" w:themeColor="text1"/>
@@ -1360,7 +1505,16 @@
                 <w:sz w:val="22"/>
                 <w:szCs w:val="20"/>
               </w:rPr>
-              <w:t xml:space="preserve">Site Name: </w:t>
+              <w:t>Site Name</w:t>
+            </w:r>
+            <w:proofErr w:type="gramStart"/>
+            <w:r>
+              <w:rPr>
+                <w:b/>
+                <w:sz w:val="22"/>
+                <w:szCs w:val="20"/>
+              </w:rPr>
+              <w:t xml:space="preserve">: </w:t>
             </w:r>
             <w:r>
               <w:rPr>
@@ -1376,7 +1530,16 @@
                 <w:color w:val="000000"/>
                 <w:sz w:val="22"/>
               </w:rPr>
-              <w:t>{{</w:t>
+              <w:t>{</w:t>
+            </w:r>
+            <w:proofErr w:type="gramEnd"/>
+            <w:r>
+              <w:rPr>
+                <w:bCs/>
+                <w:color w:val="000000"/>
+                <w:sz w:val="22"/>
+              </w:rPr>
+              <w:t>{</w:t>
             </w:r>
             <w:proofErr w:type="spellStart"/>
             <w:r>
@@ -1424,7 +1587,16 @@
                 <w:sz w:val="22"/>
                 <w:szCs w:val="20"/>
               </w:rPr>
-              <w:t>Site Address:</w:t>
+              <w:t xml:space="preserve">Site </w:t>
+            </w:r>
+            <w:proofErr w:type="gramStart"/>
+            <w:r>
+              <w:rPr>
+                <w:b/>
+                <w:sz w:val="22"/>
+                <w:szCs w:val="20"/>
+              </w:rPr>
+              <w:t>Address:</w:t>
             </w:r>
             <w:r>
               <w:rPr>
@@ -1446,6 +1618,7 @@
               <w:t>{{</w:t>
             </w:r>
             <w:proofErr w:type="spellStart"/>
+            <w:proofErr w:type="gramEnd"/>
             <w:r>
               <w:rPr>
                 <w:bCs/>
@@ -1467,7 +1640,7 @@
         </w:tc>
         <w:tc>
           <w:tcPr>
-            <w:tcW w:w="3610" w:type="dxa"/>
+            <w:tcW w:w="3690" w:type="dxa"/>
             <w:tcBorders>
               <w:top w:val="single" w:sz="8" w:space="0" w:color="000000" w:themeColor="text1"/>
               <w:left w:val="single" w:sz="8" w:space="0" w:color="000000" w:themeColor="text1"/>
@@ -1490,7 +1663,16 @@
                 <w:sz w:val="22"/>
                 <w:szCs w:val="20"/>
               </w:rPr>
-              <w:t>Site Type:</w:t>
+              <w:t xml:space="preserve">Site </w:t>
+            </w:r>
+            <w:proofErr w:type="gramStart"/>
+            <w:r>
+              <w:rPr>
+                <w:b/>
+                <w:sz w:val="22"/>
+                <w:szCs w:val="20"/>
+              </w:rPr>
+              <w:t>Type:</w:t>
             </w:r>
             <w:r>
               <w:rPr>
@@ -1509,6 +1691,7 @@
               <w:t>{{</w:t>
             </w:r>
             <w:proofErr w:type="spellStart"/>
+            <w:proofErr w:type="gramEnd"/>
             <w:r>
               <w:rPr>
                 <w:bCs/>
@@ -1531,13 +1714,12 @@
       </w:tr>
       <w:tr>
         <w:trPr>
-          <w:trHeight w:val="300"/>
+          <w:trHeight w:val="222"/>
           <w:jc w:val="center"/>
         </w:trPr>
         <w:tc>
           <w:tcPr>
             <w:tcW w:w="4040" w:type="dxa"/>
-            <w:gridSpan w:val="2"/>
             <w:tcBorders>
               <w:top w:val="single" w:sz="8" w:space="0" w:color="000000" w:themeColor="text1"/>
               <w:left w:val="single" w:sz="8" w:space="0" w:color="000000" w:themeColor="text1"/>
@@ -1602,7 +1784,7 @@
         </w:tc>
         <w:tc>
           <w:tcPr>
-            <w:tcW w:w="3610" w:type="dxa"/>
+            <w:tcW w:w="3690" w:type="dxa"/>
             <w:tcBorders>
               <w:top w:val="single" w:sz="8" w:space="0" w:color="000000" w:themeColor="text1"/>
               <w:left w:val="single" w:sz="8" w:space="0" w:color="000000" w:themeColor="text1"/>
@@ -1638,8 +1820,8 @@
         </w:trPr>
         <w:tc>
           <w:tcPr>
-            <w:tcW w:w="11880" w:type="dxa"/>
-            <w:gridSpan w:val="7"/>
+            <w:tcW w:w="11960" w:type="dxa"/>
+            <w:gridSpan w:val="6"/>
             <w:tcBorders>
               <w:top w:val="single" w:sz="8" w:space="0" w:color="000000" w:themeColor="text1"/>
               <w:left w:val="single" w:sz="8" w:space="0" w:color="000000" w:themeColor="text1"/>
@@ -1696,13 +1878,13 @@
       </w:tr>
       <w:tr>
         <w:trPr>
-          <w:trHeight w:val="384"/>
+          <w:trHeight w:val="213"/>
           <w:jc w:val="center"/>
         </w:trPr>
         <w:tc>
           <w:tcPr>
-            <w:tcW w:w="11880" w:type="dxa"/>
-            <w:gridSpan w:val="7"/>
+            <w:tcW w:w="11960" w:type="dxa"/>
+            <w:gridSpan w:val="6"/>
             <w:tcBorders>
               <w:top w:val="single" w:sz="8" w:space="0" w:color="000000" w:themeColor="text1"/>
               <w:left w:val="single" w:sz="8" w:space="0" w:color="000000" w:themeColor="text1"/>
@@ -1731,14 +1913,23 @@
                 <w:bCs/>
                 <w:sz w:val="22"/>
               </w:rPr>
-              <w:t>Sample Submitted for Purpose:</w:t>
-            </w:r>
+              <w:t xml:space="preserve">Sample Submitted for </w:t>
+            </w:r>
+            <w:proofErr w:type="gramStart"/>
             <w:r>
               <w:rPr>
                 <w:b/>
                 <w:bCs/>
                 <w:sz w:val="22"/>
               </w:rPr>
+              <w:t>Purpose:</w:t>
+            </w:r>
+            <w:r>
+              <w:rPr>
+                <w:b/>
+                <w:bCs/>
+                <w:sz w:val="22"/>
+              </w:rPr>
               <w:t xml:space="preserve"> </w:t>
             </w:r>
             <w:r>
@@ -1750,6 +1941,7 @@
               <w:t>{{</w:t>
             </w:r>
             <w:proofErr w:type="spellStart"/>
+            <w:proofErr w:type="gramEnd"/>
             <w:r>
               <w:rPr>
                 <w:bCs/>
@@ -1780,13 +1972,13 @@
       </w:tr>
       <w:tr>
         <w:trPr>
-          <w:trHeight w:val="402"/>
+          <w:trHeight w:val="267"/>
           <w:jc w:val="center"/>
         </w:trPr>
         <w:tc>
           <w:tcPr>
-            <w:tcW w:w="11880" w:type="dxa"/>
-            <w:gridSpan w:val="7"/>
+            <w:tcW w:w="11960" w:type="dxa"/>
+            <w:gridSpan w:val="6"/>
             <w:tcBorders>
               <w:top w:val="single" w:sz="8" w:space="0" w:color="000000" w:themeColor="text1"/>
               <w:left w:val="single" w:sz="8" w:space="0" w:color="000000" w:themeColor="text1"/>
@@ -1839,20 +2031,74 @@
                 <w:color w:val="000000"/>
                 <w:sz w:val="22"/>
               </w:rPr>
-              <w:t xml:space="preserve">{{#IF_IsDrinkingWaterSystem}}{{BoilAdvisory}}{{/IF_IsDrinkingWaterSystem}}                      </w:t>
+              <w:t>{{#IF_IsDrinkingWaterSystem</w:t>
+            </w:r>
+            <w:proofErr w:type="gramStart"/>
+            <w:r>
+              <w:rPr>
+                <w:bCs/>
+                <w:color w:val="000000"/>
+                <w:sz w:val="22"/>
+              </w:rPr>
+              <w:t>}}{</w:t>
+            </w:r>
+            <w:proofErr w:type="gramEnd"/>
+            <w:r>
+              <w:rPr>
+                <w:bCs/>
+                <w:color w:val="000000"/>
+                <w:sz w:val="22"/>
+              </w:rPr>
+              <w:t>{BoilAdvisory</w:t>
+            </w:r>
+            <w:proofErr w:type="gramStart"/>
+            <w:r>
+              <w:rPr>
+                <w:bCs/>
+                <w:color w:val="000000"/>
+                <w:sz w:val="22"/>
+              </w:rPr>
+              <w:t>}}{</w:t>
+            </w:r>
+            <w:proofErr w:type="gramEnd"/>
+            <w:r>
+              <w:rPr>
+                <w:bCs/>
+                <w:color w:val="000000"/>
+                <w:sz w:val="22"/>
+              </w:rPr>
+              <w:t>{/IF_IsDrinkingWaterSystem</w:t>
+            </w:r>
+            <w:proofErr w:type="gramStart"/>
+            <w:r>
+              <w:rPr>
+                <w:bCs/>
+                <w:color w:val="000000"/>
+                <w:sz w:val="22"/>
+              </w:rPr>
+              <w:t xml:space="preserve">}}   </w:t>
+            </w:r>
+            <w:proofErr w:type="gramEnd"/>
+            <w:r>
+              <w:rPr>
+                <w:bCs/>
+                <w:color w:val="000000"/>
+                <w:sz w:val="22"/>
+              </w:rPr>
+              <w:t xml:space="preserve">                   </w:t>
             </w:r>
           </w:p>
         </w:tc>
       </w:tr>
       <w:tr>
         <w:trPr>
-          <w:trHeight w:val="402"/>
+          <w:trHeight w:val="240"/>
           <w:jc w:val="center"/>
         </w:trPr>
         <w:tc>
           <w:tcPr>
-            <w:tcW w:w="11880" w:type="dxa"/>
-            <w:gridSpan w:val="7"/>
+            <w:tcW w:w="11960" w:type="dxa"/>
+            <w:gridSpan w:val="6"/>
             <w:tcBorders>
               <w:top w:val="single" w:sz="8" w:space="0" w:color="000000" w:themeColor="text1"/>
               <w:left w:val="single" w:sz="8" w:space="0" w:color="000000" w:themeColor="text1"/>
@@ -1940,13 +2186,13 @@
       </w:tr>
       <w:tr>
         <w:trPr>
-          <w:trHeight w:val="402"/>
+          <w:trHeight w:val="213"/>
           <w:jc w:val="center"/>
         </w:trPr>
         <w:tc>
           <w:tcPr>
             <w:tcW w:w="5940" w:type="dxa"/>
-            <w:gridSpan w:val="4"/>
+            <w:gridSpan w:val="3"/>
             <w:tcBorders>
               <w:top w:val="single" w:sz="8" w:space="0" w:color="000000" w:themeColor="text1"/>
               <w:left w:val="single" w:sz="8" w:space="0" w:color="000000" w:themeColor="text1"/>
@@ -2008,7 +2254,7 @@
         </w:tc>
         <w:tc>
           <w:tcPr>
-            <w:tcW w:w="5940" w:type="dxa"/>
+            <w:tcW w:w="6020" w:type="dxa"/>
             <w:gridSpan w:val="3"/>
             <w:tcBorders>
               <w:top w:val="single" w:sz="8" w:space="0" w:color="000000" w:themeColor="text1"/>
@@ -2033,7 +2279,16 @@
                 <w:sz w:val="22"/>
                 <w:szCs w:val="20"/>
               </w:rPr>
-              <w:t xml:space="preserve">Send Additional Copy To: </w:t>
+              <w:t>Send Additional Copy To</w:t>
+            </w:r>
+            <w:proofErr w:type="gramStart"/>
+            <w:r>
+              <w:rPr>
+                <w:b/>
+                <w:sz w:val="22"/>
+                <w:szCs w:val="20"/>
+              </w:rPr>
+              <w:t xml:space="preserve">: </w:t>
             </w:r>
             <w:r>
               <w:rPr>
@@ -2049,7 +2304,16 @@
                 <w:color w:val="000000"/>
                 <w:sz w:val="22"/>
               </w:rPr>
-              <w:t>{{</w:t>
+              <w:t>{</w:t>
+            </w:r>
+            <w:proofErr w:type="gramEnd"/>
+            <w:r>
+              <w:rPr>
+                <w:bCs/>
+                <w:color w:val="000000"/>
+                <w:sz w:val="22"/>
+              </w:rPr>
+              <w:t>{</w:t>
             </w:r>
             <w:proofErr w:type="spellStart"/>
             <w:r>
@@ -2074,13 +2338,13 @@
       </w:tr>
       <w:tr>
         <w:trPr>
-          <w:trHeight w:val="321"/>
+          <w:trHeight w:val="267"/>
           <w:jc w:val="center"/>
         </w:trPr>
         <w:tc>
           <w:tcPr>
-            <w:tcW w:w="11880" w:type="dxa"/>
-            <w:gridSpan w:val="7"/>
+            <w:tcW w:w="11960" w:type="dxa"/>
+            <w:gridSpan w:val="6"/>
             <w:tcBorders>
               <w:top w:val="single" w:sz="8" w:space="0" w:color="000000" w:themeColor="text1"/>
               <w:left w:val="single" w:sz="8" w:space="0" w:color="000000" w:themeColor="text1"/>
@@ -2143,13 +2407,13 @@
       </w:tr>
       <w:tr>
         <w:trPr>
-          <w:trHeight w:val="438"/>
+          <w:trHeight w:val="330"/>
           <w:jc w:val="center"/>
         </w:trPr>
         <w:tc>
           <w:tcPr>
-            <w:tcW w:w="11880" w:type="dxa"/>
-            <w:gridSpan w:val="7"/>
+            <w:tcW w:w="11960" w:type="dxa"/>
+            <w:gridSpan w:val="6"/>
             <w:tcBorders>
               <w:top w:val="single" w:sz="8" w:space="0" w:color="000000" w:themeColor="text1"/>
               <w:left w:val="single" w:sz="8" w:space="0" w:color="000000" w:themeColor="text1"/>
@@ -2191,8 +2455,8 @@
         </w:trPr>
         <w:tc>
           <w:tcPr>
-            <w:tcW w:w="11880" w:type="dxa"/>
-            <w:gridSpan w:val="7"/>
+            <w:tcW w:w="11960" w:type="dxa"/>
+            <w:gridSpan w:val="6"/>
             <w:tcBorders>
               <w:top w:val="single" w:sz="8" w:space="0" w:color="000000" w:themeColor="text1"/>
               <w:left w:val="single" w:sz="8" w:space="0" w:color="000000" w:themeColor="text1"/>
@@ -2293,8 +2557,8 @@
         </w:trPr>
         <w:tc>
           <w:tcPr>
-            <w:tcW w:w="11880" w:type="dxa"/>
-            <w:gridSpan w:val="7"/>
+            <w:tcW w:w="11960" w:type="dxa"/>
+            <w:gridSpan w:val="6"/>
             <w:tcBorders>
               <w:top w:val="single" w:sz="8" w:space="0" w:color="000000" w:themeColor="text1"/>
               <w:left w:val="single" w:sz="8" w:space="0" w:color="000000" w:themeColor="text1"/>
@@ -2350,14 +2614,45 @@
               <w:rPr>
                 <w:sz w:val="22"/>
               </w:rPr>
-              <w:t xml:space="preserve">Total Chlorine    </w:t>
+              <w:t xml:space="preserve">Total Chlorine </w:t>
+            </w:r>
+            <w:proofErr w:type="gramStart"/>
+            <w:r>
+              <w:rPr>
+                <w:sz w:val="22"/>
+              </w:rPr>
+              <w:t xml:space="preserve">   </w:t>
             </w:r>
             <w:r>
               <w:rPr>
                 <w:rFonts w:ascii="Segoe UI Symbol" w:hAnsi="Segoe UI Symbol"/>
                 <w:sz w:val="22"/>
               </w:rPr>
-              <w:t xml:space="preserve">{{#IF_PreviousSampleOvergrown}}☑ </w:t>
+              <w:t>{</w:t>
+            </w:r>
+            <w:proofErr w:type="gramEnd"/>
+            <w:r>
+              <w:rPr>
+                <w:rFonts w:ascii="Segoe UI Symbol" w:hAnsi="Segoe UI Symbol"/>
+                <w:sz w:val="22"/>
+              </w:rPr>
+              <w:t>{#IF_PreviousSampleOvergrown</w:t>
+            </w:r>
+            <w:proofErr w:type="gramStart"/>
+            <w:r>
+              <w:rPr>
+                <w:rFonts w:ascii="Segoe UI Symbol" w:hAnsi="Segoe UI Symbol"/>
+                <w:sz w:val="22"/>
+              </w:rPr>
+              <w:t>}}☑</w:t>
+            </w:r>
+            <w:proofErr w:type="gramEnd"/>
+            <w:r>
+              <w:rPr>
+                <w:rFonts w:ascii="Segoe UI Symbol" w:hAnsi="Segoe UI Symbol"/>
+                <w:sz w:val="22"/>
+              </w:rPr>
+              <w:t xml:space="preserve"> </w:t>
             </w:r>
             <w:r>
               <w:rPr>
@@ -2370,7 +2665,23 @@
                 <w:rFonts w:ascii="Segoe UI Symbol" w:hAnsi="Segoe UI Symbol"/>
                 <w:sz w:val="22"/>
               </w:rPr>
-              <w:t>{{/IF_PreviousSampleOvergrown}}{{^IF_PreviousSampleOvergrown}}</w:t>
+              <w:t>{{/IF_PreviousSampleOvergrown</w:t>
+            </w:r>
+            <w:proofErr w:type="gramStart"/>
+            <w:r>
+              <w:rPr>
+                <w:rFonts w:ascii="Segoe UI Symbol" w:hAnsi="Segoe UI Symbol"/>
+                <w:sz w:val="22"/>
+              </w:rPr>
+              <w:t>}}{</w:t>
+            </w:r>
+            <w:proofErr w:type="gramEnd"/>
+            <w:r>
+              <w:rPr>
+                <w:rFonts w:ascii="Segoe UI Symbol" w:hAnsi="Segoe UI Symbol"/>
+                <w:sz w:val="22"/>
+              </w:rPr>
+              <w:t>{^IF_PreviousSampleOvergrown}}</w:t>
             </w:r>
             <w:r>
               <w:rPr>
@@ -2425,8 +2736,8 @@
         </w:trPr>
         <w:tc>
           <w:tcPr>
-            <w:tcW w:w="11880" w:type="dxa"/>
-            <w:gridSpan w:val="7"/>
+            <w:tcW w:w="11960" w:type="dxa"/>
+            <w:gridSpan w:val="6"/>
             <w:tcBorders>
               <w:top w:val="single" w:sz="8" w:space="0" w:color="000000" w:themeColor="text1"/>
               <w:left w:val="single" w:sz="8" w:space="0" w:color="000000" w:themeColor="text1"/>

</xml_diff>